<commit_message>
docs: add ICTU university logo to cover page and convert all text to pure black
</commit_message>
<xml_diff>
--- a/BAO_CAO_DO_AN_HE_THONG_QUAN_LY_SINH_VIEN.docx
+++ b/BAO_CAO_DO_AN_HE_THONG_QUAN_LY_SINH_VIEN.docx
@@ -10,7 +10,7 @@
       <w:r>
         <w:rPr>
           <w:b/>
-          <w:color w:val="1F4E79"/>
+          <w:color w:val="000000"/>
           <w:sz w:val="25"/>
         </w:rPr>
         <w:t>BỘ GIÁO DỤC VÀ ĐÀO TẠO</w:t>
@@ -22,8 +22,46 @@
         <w:t>KHOA CÔNG NGHỆ THÔNG TIN</w:t>
       </w:r>
     </w:p>
-    <w:p/>
-    <w:p/>
+    <w:p>
+      <w:pPr>
+        <w:spacing w:before="280" w:after="280"/>
+        <w:jc w:val="center"/>
+      </w:pPr>
+      <w:r>
+        <w:drawing>
+          <wp:inline xmlns:a="http://schemas.openxmlformats.org/drawingml/2006/main" xmlns:pic="http://schemas.openxmlformats.org/drawingml/2006/picture">
+            <wp:extent cx="1691640" cy="1691640"/>
+            <wp:docPr id="1" name="Picture 1"/>
+            <wp:cNvGraphicFramePr>
+              <a:graphicFrameLocks noChangeAspect="1"/>
+            </wp:cNvGraphicFramePr>
+            <a:graphic>
+              <a:graphicData uri="http://schemas.openxmlformats.org/drawingml/2006/picture">
+                <pic:pic>
+                  <pic:nvPicPr>
+                    <pic:cNvPr id="0" name="logo_ictu.png"/>
+                    <pic:cNvPicPr/>
+                  </pic:nvPicPr>
+                  <pic:blipFill>
+                    <a:blip r:embed="rId9"/>
+                    <a:stretch>
+                      <a:fillRect/>
+                    </a:stretch>
+                  </pic:blipFill>
+                  <pic:spPr>
+                    <a:xfrm>
+                      <a:off x="0" y="0"/>
+                      <a:ext cx="1691640" cy="1691640"/>
+                    </a:xfrm>
+                    <a:prstGeom prst="rect"/>
+                  </pic:spPr>
+                </pic:pic>
+              </a:graphicData>
+            </a:graphic>
+          </wp:inline>
+        </w:drawing>
+      </w:r>
+    </w:p>
     <w:p>
       <w:pPr>
         <w:spacing w:after="120"/>
@@ -32,7 +70,7 @@
       <w:r>
         <w:rPr>
           <w:b/>
-          <w:color w:val="2F5597"/>
+          <w:color w:val="000000"/>
           <w:sz w:val="32"/>
         </w:rPr>
         <w:t>BÁO CÁO ĐỒ ÁN MÔN HỌC</w:t>
@@ -40,13 +78,13 @@
     </w:p>
     <w:p>
       <w:pPr>
-        <w:spacing w:after="480"/>
+        <w:spacing w:after="400"/>
         <w:jc w:val="center"/>
       </w:pPr>
       <w:r>
         <w:rPr>
           <w:b/>
-          <w:color w:val="1F4E79"/>
+          <w:color w:val="000000"/>
           <w:sz w:val="28"/>
         </w:rPr>
         <w:t>MÔN: TRIỂN KHAI VÀ QUẢN TRỊ HỆ THỐNG PHẦN MỀM</w:t>
@@ -54,26 +92,33 @@
     </w:p>
     <w:p>
       <w:pPr>
-        <w:spacing w:after="720"/>
+        <w:spacing w:after="600"/>
         <w:jc w:val="center"/>
       </w:pPr>
       <w:r>
         <w:rPr>
           <w:b/>
-          <w:color w:val="1F4E79"/>
-          <w:sz w:val="40"/>
+          <w:color w:val="000000"/>
+          <w:sz w:val="42"/>
         </w:rPr>
         <w:t>ĐỀ TÀI:</w:t>
         <w:br/>
         <w:t>HỆ THỐNG QUẢN LÝ SINH VIÊN</w:t>
       </w:r>
     </w:p>
-    <w:p/>
     <w:tbl>
       <w:tblPr>
         <w:tblW w:type="auto" w:w="0"/>
         <w:jc w:val="center"/>
         <w:tblLook w:firstColumn="1" w:firstRow="1" w:lastColumn="0" w:lastRow="0" w:noHBand="0" w:noVBand="1" w:val="04A0"/>
+        <w:tblBorders>
+          <w:top w:val="single" w:sz="6" w:space="0" w:color="A0A0A0"/>
+          <w:bottom w:val="single" w:sz="6" w:space="0" w:color="A0A0A0"/>
+          <w:insideH w:val="single" w:sz="4" w:space="0" w:color="A0A0A0"/>
+          <w:insideV w:val="single" w:sz="4" w:space="0" w:color="A0A0A0"/>
+          <w:left w:val="single" w:sz="6" w:space="0" w:color="A0A0A0"/>
+          <w:right w:val="single" w:sz="6" w:space="0" w:color="A0A0A0"/>
+        </w:tblBorders>
       </w:tblPr>
       <w:tblGrid>
         <w:gridCol w:w="4680"/>
@@ -89,13 +134,13 @@
               <w:left w:w="100" w:type="dxa"/>
               <w:right w:w="100" w:type="dxa"/>
             </w:tcMar>
-            <w:shd w:fill="F2F4F7"/>
+            <w:shd w:fill="F5F5F5"/>
           </w:tcPr>
           <w:p>
             <w:r>
               <w:rPr>
                 <w:b/>
-                <w:color w:val="1F4E79"/>
+                <w:color w:val="000000"/>
               </w:rPr>
               <w:t>Giảng viên hướng dẫn:</w:t>
             </w:r>
@@ -114,6 +159,9 @@
           </w:tcPr>
           <w:p>
             <w:r>
+              <w:rPr>
+                <w:color w:val="000000"/>
+              </w:rPr>
               <w:t>ThS. Vũ Văn Diện</w:t>
             </w:r>
           </w:p>
@@ -129,13 +177,13 @@
               <w:left w:w="100" w:type="dxa"/>
               <w:right w:w="100" w:type="dxa"/>
             </w:tcMar>
-            <w:shd w:fill="F2F4F7"/>
+            <w:shd w:fill="F5F5F5"/>
           </w:tcPr>
           <w:p>
             <w:r>
               <w:rPr>
                 <w:b/>
-                <w:color w:val="1F4E79"/>
+                <w:color w:val="000000"/>
               </w:rPr>
               <w:t>Sinh viên thực hiện:</w:t>
             </w:r>
@@ -154,6 +202,9 @@
           </w:tcPr>
           <w:p>
             <w:r>
+              <w:rPr>
+                <w:color w:val="000000"/>
+              </w:rPr>
               <w:t>Trần Quốc Huy</w:t>
             </w:r>
           </w:p>
@@ -169,13 +220,13 @@
               <w:left w:w="100" w:type="dxa"/>
               <w:right w:w="100" w:type="dxa"/>
             </w:tcMar>
-            <w:shd w:fill="F2F4F7"/>
+            <w:shd w:fill="F5F5F5"/>
           </w:tcPr>
           <w:p>
             <w:r>
               <w:rPr>
                 <w:b/>
-                <w:color w:val="1F4E79"/>
+                <w:color w:val="000000"/>
               </w:rPr>
               <w:t>Mã số sinh viên:</w:t>
             </w:r>
@@ -194,6 +245,9 @@
           </w:tcPr>
           <w:p>
             <w:r>
+              <w:rPr>
+                <w:color w:val="000000"/>
+              </w:rPr>
               <w:t>DTC245090151</w:t>
             </w:r>
           </w:p>
@@ -209,13 +263,13 @@
               <w:left w:w="100" w:type="dxa"/>
               <w:right w:w="100" w:type="dxa"/>
             </w:tcMar>
-            <w:shd w:fill="F2F4F7"/>
+            <w:shd w:fill="F5F5F5"/>
           </w:tcPr>
           <w:p>
             <w:r>
               <w:rPr>
                 <w:b/>
-                <w:color w:val="1F4E79"/>
+                <w:color w:val="000000"/>
               </w:rPr>
               <w:t>Lớp sinh hoạt:</w:t>
             </w:r>
@@ -234,6 +288,9 @@
           </w:tcPr>
           <w:p>
             <w:r>
+              <w:rPr>
+                <w:color w:val="000000"/>
+              </w:rPr>
               <w:t>KTPMK23B</w:t>
             </w:r>
           </w:p>
@@ -249,13 +306,13 @@
               <w:left w:w="100" w:type="dxa"/>
               <w:right w:w="100" w:type="dxa"/>
             </w:tcMar>
-            <w:shd w:fill="F2F4F7"/>
+            <w:shd w:fill="F5F5F5"/>
           </w:tcPr>
           <w:p>
             <w:r>
               <w:rPr>
                 <w:b/>
-                <w:color w:val="1F4E79"/>
+                <w:color w:val="000000"/>
               </w:rPr>
               <w:t>Chuyên ngành:</w:t>
             </w:r>
@@ -274,6 +331,9 @@
           </w:tcPr>
           <w:p>
             <w:r>
+              <w:rPr>
+                <w:color w:val="000000"/>
+              </w:rPr>
               <w:t>Kỹ thuật Phần mềm</w:t>
             </w:r>
           </w:p>
@@ -289,13 +349,13 @@
               <w:left w:w="100" w:type="dxa"/>
               <w:right w:w="100" w:type="dxa"/>
             </w:tcMar>
-            <w:shd w:fill="F2F4F7"/>
+            <w:shd w:fill="F5F5F5"/>
           </w:tcPr>
           <w:p>
             <w:r>
               <w:rPr>
                 <w:b/>
-                <w:color w:val="1F4E79"/>
+                <w:color w:val="000000"/>
               </w:rPr>
               <w:t>Khoa / Trường:</w:t>
             </w:r>
@@ -314,6 +374,9 @@
           </w:tcPr>
           <w:p>
             <w:r>
+              <w:rPr>
+                <w:color w:val="000000"/>
+              </w:rPr>
               <w:t>Khoa CNTT - Trường ĐH CNTT &amp; Truyền thông (ICTU)</w:t>
             </w:r>
           </w:p>
@@ -329,7 +392,7 @@
       <w:r>
         <w:rPr>
           <w:i/>
-          <w:color w:val="595959"/>
+          <w:color w:val="000000"/>
         </w:rPr>
         <w:t>Thái Nguyên, Tháng 10 Năm 2026</w:t>
       </w:r>
@@ -347,7 +410,7 @@
       <w:r>
         <w:rPr>
           <w:b/>
-          <w:color w:val="1F4E79"/>
+          <w:color w:val="000000"/>
           <w:sz w:val="30"/>
         </w:rPr>
         <w:t>LỜI CẢM ƠN</w:t>
@@ -375,7 +438,7 @@
       <w:r>
         <w:rPr>
           <w:b/>
-          <w:color w:val="1F4E79"/>
+          <w:color w:val="000000"/>
         </w:rPr>
         <w:t>Sinh viên thực hiện:</w:t>
         <w:br/>
@@ -395,7 +458,7 @@
       <w:r>
         <w:rPr>
           <w:b/>
-          <w:color w:val="1F4E79"/>
+          <w:color w:val="000000"/>
           <w:sz w:val="30"/>
         </w:rPr>
         <w:t>CHƯƠNG 1: TỔNG QUAN DỰ ÁN VÀ PHÂN TÍCH YÊU CẦU TRIỂN KHAI</w:t>
@@ -409,7 +472,7 @@
       <w:r>
         <w:rPr>
           <w:b/>
-          <w:color w:val="2F5597"/>
+          <w:color w:val="000000"/>
           <w:sz w:val="26"/>
         </w:rPr>
         <w:t>1.1. Bối cảnh và mục tiêu của đề tài</w:t>
@@ -433,10 +496,14 @@
       <w:r>
         <w:rPr>
           <w:b/>
+          <w:color w:val="000000"/>
         </w:rPr>
         <w:t>1.</w:t>
       </w:r>
       <w:r>
+        <w:rPr>
+          <w:color w:val="000000"/>
+        </w:rPr>
         <w:t xml:space="preserve"> Đóng gói toàn bộ ứng dụng Quản lý Sinh viên thành các container Docker độc lập, loại bỏ triệt để hiện tượng 'chạy được trên máy dev nhưng lỗi trên máy server'.</w:t>
       </w:r>
     </w:p>
@@ -448,10 +515,14 @@
       <w:r>
         <w:rPr>
           <w:b/>
+          <w:color w:val="000000"/>
         </w:rPr>
         <w:t>2.</w:t>
       </w:r>
       <w:r>
+        <w:rPr>
+          <w:color w:val="000000"/>
+        </w:rPr>
         <w:t xml:space="preserve"> Xây dựng kiến trúc điều phối cụm dịch vụ phân tầng thông qua Docker Compose.</w:t>
       </w:r>
     </w:p>
@@ -463,10 +534,14 @@
       <w:r>
         <w:rPr>
           <w:b/>
+          <w:color w:val="000000"/>
         </w:rPr>
         <w:t>3.</w:t>
       </w:r>
       <w:r>
+        <w:rPr>
+          <w:color w:val="000000"/>
+        </w:rPr>
         <w:t xml:space="preserve"> Thiết lập Nginx Reverse Proxy làm cổng vào duy nhất (Web Gateway), cân bằng tải và bảo vệ backend nội bộ.</w:t>
       </w:r>
     </w:p>
@@ -478,10 +553,14 @@
       <w:r>
         <w:rPr>
           <w:b/>
+          <w:color w:val="000000"/>
         </w:rPr>
         <w:t>4.</w:t>
       </w:r>
       <w:r>
+        <w:rPr>
+          <w:color w:val="000000"/>
+        </w:rPr>
         <w:t xml:space="preserve"> Thiết lập hệ quản trị CSDL MySQL 8.0 với Named Volume bền vững và công cụ phpMyAdmin quản trị trực quan.</w:t>
       </w:r>
     </w:p>
@@ -493,10 +572,14 @@
       <w:r>
         <w:rPr>
           <w:b/>
+          <w:color w:val="000000"/>
         </w:rPr>
         <w:t>5.</w:t>
       </w:r>
       <w:r>
+        <w:rPr>
+          <w:color w:val="000000"/>
+        </w:rPr>
         <w:t xml:space="preserve"> Xây dựng kịch bản tự động hóa sao lưu (Backup) và phục hồi thảm họa (Disaster Recovery) cho cả Windows và Linux.</w:t>
       </w:r>
     </w:p>
@@ -508,10 +591,14 @@
       <w:r>
         <w:rPr>
           <w:b/>
+          <w:color w:val="000000"/>
         </w:rPr>
         <w:t>6.</w:t>
       </w:r>
       <w:r>
+        <w:rPr>
+          <w:color w:val="000000"/>
+        </w:rPr>
         <w:t xml:space="preserve"> Tích hợp hệ thống giám sát toàn diện (Observability) bằng Prometheus, Grafana, kết hợp hệ thống tập trung nhật ký Loki và Promtail.</w:t>
       </w:r>
     </w:p>
@@ -523,7 +610,7 @@
       <w:r>
         <w:rPr>
           <w:b/>
-          <w:color w:val="2F5597"/>
+          <w:color w:val="000000"/>
           <w:sz w:val="26"/>
         </w:rPr>
         <w:t>1.2. Giới thiệu tổng quan hệ thống Quản lý Sinh viên (QLSV)</w:t>
@@ -542,10 +629,14 @@
       <w:r>
         <w:rPr>
           <w:b/>
+          <w:color w:val="000000"/>
         </w:rPr>
         <w:t>1. Phân hệ Quản trị (Admin Portal):</w:t>
       </w:r>
       <w:r>
+        <w:rPr>
+          <w:color w:val="000000"/>
+        </w:rPr>
         <w:t xml:space="preserve"> Dành cho phòng đào tạo/giáo vụ khoa để quản trị hồ sơ sinh viên, giảng viên, đồ án, công ty thực tập, hội đồng bảo vệ, danh mục khoa/bộ môn/chuyên ngành/niên khóa/lớp học, tài khoản người dùng và sao lưu CSDL.</w:t>
       </w:r>
     </w:p>
@@ -557,10 +648,14 @@
       <w:r>
         <w:rPr>
           <w:b/>
+          <w:color w:val="000000"/>
         </w:rPr>
         <w:t>2. Phân hệ Giảng viên (Lecturer Portal):</w:t>
       </w:r>
       <w:r>
+        <w:rPr>
+          <w:color w:val="000000"/>
+        </w:rPr>
         <w:t xml:space="preserve"> Dành cho giảng viên theo dõi sinh viên hướng dẫn, cập nhật tiến độ đồ án, chấm điểm hướng dẫn, chấm phản biện và tham gia các hội đồng bảo vệ.</w:t>
       </w:r>
     </w:p>
@@ -572,10 +667,14 @@
       <w:r>
         <w:rPr>
           <w:b/>
+          <w:color w:val="000000"/>
         </w:rPr>
         <w:t>3. Phân hệ Sinh viên (Student Portal):</w:t>
       </w:r>
       <w:r>
+        <w:rPr>
+          <w:color w:val="000000"/>
+        </w:rPr>
         <w:t xml:space="preserve"> Dành cho sinh viên đăng ký đề tài, theo dõi kết quả phê duyệt, tra cứu thông tin hội đồng, xem bảng điểm minh bạch và thông tin thực tập.</w:t>
       </w:r>
     </w:p>
@@ -587,7 +686,7 @@
       <w:r>
         <w:rPr>
           <w:b/>
-          <w:color w:val="2F5597"/>
+          <w:color w:val="000000"/>
           <w:sz w:val="26"/>
         </w:rPr>
         <w:t>1.3. Phân tích các thành phần kiến trúc phần mềm</w:t>
@@ -606,10 +705,14 @@
       <w:r>
         <w:rPr>
           <w:b/>
+          <w:color w:val="000000"/>
         </w:rPr>
         <w:t>- Backend:</w:t>
       </w:r>
       <w:r>
+        <w:rPr>
+          <w:color w:val="000000"/>
+        </w:rPr>
         <w:t xml:space="preserve"> Python 3.10 / 3.11 với Flask Framework cung cấp RESTful API và giao diện web tương tác.</w:t>
       </w:r>
     </w:p>
@@ -621,10 +724,14 @@
       <w:r>
         <w:rPr>
           <w:b/>
+          <w:color w:val="000000"/>
         </w:rPr>
         <w:t>- Application Server:</w:t>
       </w:r>
       <w:r>
+        <w:rPr>
+          <w:color w:val="000000"/>
+        </w:rPr>
         <w:t xml:space="preserve"> Gunicorn 21.2.0 (Green Unicorn) WSGI server chuẩn công nghiệp với kiến trúc Multi-Workers.</w:t>
       </w:r>
     </w:p>
@@ -636,10 +743,14 @@
       <w:r>
         <w:rPr>
           <w:b/>
+          <w:color w:val="000000"/>
         </w:rPr>
         <w:t>- Web Gateway:</w:t>
       </w:r>
       <w:r>
+        <w:rPr>
+          <w:color w:val="000000"/>
+        </w:rPr>
         <w:t xml:space="preserve"> Nginx Alpine Reverse Proxy tiếp nhận các kết nối mạng, xử lý file tĩnh và chuyển tiếp yêu cầu đến backend.</w:t>
       </w:r>
     </w:p>
@@ -651,10 +762,14 @@
       <w:r>
         <w:rPr>
           <w:b/>
+          <w:color w:val="000000"/>
         </w:rPr>
         <w:t>- Database:</w:t>
       </w:r>
       <w:r>
+        <w:rPr>
+          <w:color w:val="000000"/>
+        </w:rPr>
         <w:t xml:space="preserve"> MySQL 8.0 Community Server sử dụng Storage Engine InnoDB đảm bảo các giao dịch ACID và toàn vẹn dữ liệu.</w:t>
       </w:r>
     </w:p>
@@ -666,10 +781,14 @@
       <w:r>
         <w:rPr>
           <w:b/>
+          <w:color w:val="000000"/>
         </w:rPr>
         <w:t>- Frontend:</w:t>
       </w:r>
       <w:r>
+        <w:rPr>
+          <w:color w:val="000000"/>
+        </w:rPr>
         <w:t xml:space="preserve"> HTML5, Vanilla Modern CSS (Glassmorphism, Card thống kê), Vanilla JavaScript ES6+ tải nhanh, nhẹ và mượt mà.</w:t>
       </w:r>
     </w:p>
@@ -681,7 +800,7 @@
       <w:r>
         <w:rPr>
           <w:b/>
-          <w:color w:val="2F5597"/>
+          <w:color w:val="000000"/>
           <w:sz w:val="26"/>
         </w:rPr>
         <w:t>1.4. Yêu cầu triển khai và vận hành hệ thống</w:t>
@@ -695,10 +814,14 @@
       <w:r>
         <w:rPr>
           <w:b/>
+          <w:color w:val="000000"/>
         </w:rPr>
         <w:t>1. Tính độc lập (Portability):</w:t>
       </w:r>
       <w:r>
+        <w:rPr>
+          <w:color w:val="000000"/>
+        </w:rPr>
         <w:t xml:space="preserve"> Khả năng triển khai độc lập, nhất quán trên mọi nền tảng (Windows, Linux, Cloud) thông qua container.</w:t>
       </w:r>
     </w:p>
@@ -710,10 +833,14 @@
       <w:r>
         <w:rPr>
           <w:b/>
+          <w:color w:val="000000"/>
         </w:rPr>
         <w:t>2. Tính cô lập (Isolation):</w:t>
       </w:r>
       <w:r>
+        <w:rPr>
+          <w:color w:val="000000"/>
+        </w:rPr>
         <w:t xml:space="preserve"> Cô lập dịch vụ backend và cơ sở dữ liệu trong mạng nội bộ, chỉ expose cổng Nginx Gateway (8083), phpMyAdmin (8084), Prometheus (9092) và Grafana (3002).</w:t>
       </w:r>
     </w:p>
@@ -725,10 +852,14 @@
       <w:r>
         <w:rPr>
           <w:b/>
+          <w:color w:val="000000"/>
         </w:rPr>
         <w:t>3. Tính sẵn sàng cao (High Availability):</w:t>
       </w:r>
       <w:r>
+        <w:rPr>
+          <w:color w:val="000000"/>
+        </w:rPr>
         <w:t xml:space="preserve"> Toàn bộ dịch vụ tự phục hồi khi có lỗi nhờ chính sách `restart: always`.</w:t>
       </w:r>
     </w:p>
@@ -740,10 +871,14 @@
       <w:r>
         <w:rPr>
           <w:b/>
+          <w:color w:val="000000"/>
         </w:rPr>
         <w:t>4. An toàn dữ liệu (Data Persistence):</w:t>
       </w:r>
       <w:r>
+        <w:rPr>
+          <w:color w:val="000000"/>
+        </w:rPr>
         <w:t xml:space="preserve"> Dữ liệu CSDL được lưu trữ bền vững trên Named Volume, không bị mất khi hủy container; có kịch bản sao lưu định kỳ.</w:t>
       </w:r>
     </w:p>
@@ -755,7 +890,7 @@
       <w:r>
         <w:rPr>
           <w:b/>
-          <w:color w:val="1F4E79"/>
+          <w:color w:val="000000"/>
           <w:sz w:val="30"/>
         </w:rPr>
         <w:t>CHƯƠNG 2: THIẾT KẾ KIẾN TRÚC HẠ TẦNG VÀ CONTAINER HÓA VỚI DOCKER</w:t>
@@ -769,7 +904,7 @@
       <w:r>
         <w:rPr>
           <w:b/>
-          <w:color w:val="2F5597"/>
+          <w:color w:val="000000"/>
           <w:sz w:val="26"/>
         </w:rPr>
         <w:t>2.1. Kiến trúc phân tầng Containerized Multi-Tier Architecture</w:t>
@@ -786,12 +921,12 @@
         <w:jc w:val="center"/>
         <w:tblLook w:firstColumn="1" w:firstRow="1" w:lastColumn="0" w:lastRow="0" w:noHBand="0" w:noVBand="1" w:val="04A0"/>
         <w:tblBorders>
-          <w:top w:val="single" w:sz="4" w:space="0" w:color="D0D7DE"/>
-          <w:bottom w:val="single" w:sz="4" w:space="0" w:color="D0D7DE"/>
-          <w:insideH w:val="single" w:sz="4" w:space="0" w:color="D0D7DE"/>
-          <w:insideV w:val="none"/>
-          <w:left w:val="none"/>
-          <w:right w:val="none"/>
+          <w:top w:val="single" w:sz="6" w:space="0" w:color="A0A0A0"/>
+          <w:bottom w:val="single" w:sz="6" w:space="0" w:color="A0A0A0"/>
+          <w:insideH w:val="single" w:sz="4" w:space="0" w:color="A0A0A0"/>
+          <w:insideV w:val="single" w:sz="4" w:space="0" w:color="A0A0A0"/>
+          <w:left w:val="single" w:sz="6" w:space="0" w:color="A0A0A0"/>
+          <w:right w:val="single" w:sz="6" w:space="0" w:color="A0A0A0"/>
         </w:tblBorders>
       </w:tblPr>
       <w:tblGrid>
@@ -807,12 +942,12 @@
         <w:tc>
           <w:tcPr>
             <w:tcW w:type="dxa" w:w="720"/>
-            <w:shd w:fill="1F4E79"/>
+            <w:shd w:fill="E8E8E8"/>
             <w:tcMar>
-              <w:top w:w="100" w:type="dxa"/>
-              <w:bottom w:w="100" w:type="dxa"/>
-              <w:left w:w="100" w:type="dxa"/>
-              <w:right w:w="100" w:type="dxa"/>
+              <w:top w:w="90" w:type="dxa"/>
+              <w:bottom w:w="90" w:type="dxa"/>
+              <w:left w:w="90" w:type="dxa"/>
+              <w:right w:w="90" w:type="dxa"/>
             </w:tcMar>
           </w:tcPr>
           <w:p>
@@ -822,7 +957,7 @@
             <w:r>
               <w:rPr>
                 <w:b/>
-                <w:color w:val="FFFFFF"/>
+                <w:color w:val="000000"/>
               </w:rPr>
               <w:t>STT</w:t>
             </w:r>
@@ -831,12 +966,12 @@
         <w:tc>
           <w:tcPr>
             <w:tcW w:type="dxa" w:w="2016"/>
-            <w:shd w:fill="1F4E79"/>
+            <w:shd w:fill="E8E8E8"/>
             <w:tcMar>
-              <w:top w:w="100" w:type="dxa"/>
-              <w:bottom w:w="100" w:type="dxa"/>
-              <w:left w:w="100" w:type="dxa"/>
-              <w:right w:w="100" w:type="dxa"/>
+              <w:top w:w="90" w:type="dxa"/>
+              <w:bottom w:w="90" w:type="dxa"/>
+              <w:left w:w="90" w:type="dxa"/>
+              <w:right w:w="90" w:type="dxa"/>
             </w:tcMar>
           </w:tcPr>
           <w:p>
@@ -846,7 +981,7 @@
             <w:r>
               <w:rPr>
                 <w:b/>
-                <w:color w:val="FFFFFF"/>
+                <w:color w:val="000000"/>
               </w:rPr>
               <w:t>Tên Container</w:t>
             </w:r>
@@ -855,12 +990,12 @@
         <w:tc>
           <w:tcPr>
             <w:tcW w:type="dxa" w:w="2016"/>
-            <w:shd w:fill="1F4E79"/>
+            <w:shd w:fill="E8E8E8"/>
             <w:tcMar>
-              <w:top w:w="100" w:type="dxa"/>
-              <w:bottom w:w="100" w:type="dxa"/>
-              <w:left w:w="100" w:type="dxa"/>
-              <w:right w:w="100" w:type="dxa"/>
+              <w:top w:w="90" w:type="dxa"/>
+              <w:bottom w:w="90" w:type="dxa"/>
+              <w:left w:w="90" w:type="dxa"/>
+              <w:right w:w="90" w:type="dxa"/>
             </w:tcMar>
           </w:tcPr>
           <w:p>
@@ -870,7 +1005,7 @@
             <w:r>
               <w:rPr>
                 <w:b/>
-                <w:color w:val="FFFFFF"/>
+                <w:color w:val="000000"/>
               </w:rPr>
               <w:t>Dịch vụ đảm nhiệm</w:t>
             </w:r>
@@ -879,12 +1014,12 @@
         <w:tc>
           <w:tcPr>
             <w:tcW w:type="dxa" w:w="1584"/>
-            <w:shd w:fill="1F4E79"/>
+            <w:shd w:fill="E8E8E8"/>
             <w:tcMar>
-              <w:top w:w="100" w:type="dxa"/>
-              <w:bottom w:w="100" w:type="dxa"/>
-              <w:left w:w="100" w:type="dxa"/>
-              <w:right w:w="100" w:type="dxa"/>
+              <w:top w:w="90" w:type="dxa"/>
+              <w:bottom w:w="90" w:type="dxa"/>
+              <w:left w:w="90" w:type="dxa"/>
+              <w:right w:w="90" w:type="dxa"/>
             </w:tcMar>
           </w:tcPr>
           <w:p>
@@ -894,7 +1029,7 @@
             <w:r>
               <w:rPr>
                 <w:b/>
-                <w:color w:val="FFFFFF"/>
+                <w:color w:val="000000"/>
               </w:rPr>
               <w:t>Base Image</w:t>
             </w:r>
@@ -903,12 +1038,12 @@
         <w:tc>
           <w:tcPr>
             <w:tcW w:type="dxa" w:w="864"/>
-            <w:shd w:fill="1F4E79"/>
+            <w:shd w:fill="E8E8E8"/>
             <w:tcMar>
-              <w:top w:w="100" w:type="dxa"/>
-              <w:bottom w:w="100" w:type="dxa"/>
-              <w:left w:w="100" w:type="dxa"/>
-              <w:right w:w="100" w:type="dxa"/>
+              <w:top w:w="90" w:type="dxa"/>
+              <w:bottom w:w="90" w:type="dxa"/>
+              <w:left w:w="90" w:type="dxa"/>
+              <w:right w:w="90" w:type="dxa"/>
             </w:tcMar>
           </w:tcPr>
           <w:p>
@@ -918,7 +1053,7 @@
             <w:r>
               <w:rPr>
                 <w:b/>
-                <w:color w:val="FFFFFF"/>
+                <w:color w:val="000000"/>
               </w:rPr>
               <w:t>Cổng Host</w:t>
             </w:r>
@@ -927,12 +1062,12 @@
         <w:tc>
           <w:tcPr>
             <w:tcW w:type="dxa" w:w="864"/>
-            <w:shd w:fill="1F4E79"/>
+            <w:shd w:fill="E8E8E8"/>
             <w:tcMar>
-              <w:top w:w="100" w:type="dxa"/>
-              <w:bottom w:w="100" w:type="dxa"/>
-              <w:left w:w="100" w:type="dxa"/>
-              <w:right w:w="100" w:type="dxa"/>
+              <w:top w:w="90" w:type="dxa"/>
+              <w:bottom w:w="90" w:type="dxa"/>
+              <w:left w:w="90" w:type="dxa"/>
+              <w:right w:w="90" w:type="dxa"/>
             </w:tcMar>
           </w:tcPr>
           <w:p>
@@ -942,7 +1077,7 @@
             <w:r>
               <w:rPr>
                 <w:b/>
-                <w:color w:val="FFFFFF"/>
+                <w:color w:val="000000"/>
               </w:rPr>
               <w:t>Cổng Nội bộ</w:t>
             </w:r>
@@ -951,12 +1086,12 @@
         <w:tc>
           <w:tcPr>
             <w:tcW w:type="dxa" w:w="1296"/>
-            <w:shd w:fill="1F4E79"/>
+            <w:shd w:fill="E8E8E8"/>
             <w:tcMar>
-              <w:top w:w="100" w:type="dxa"/>
-              <w:bottom w:w="100" w:type="dxa"/>
-              <w:left w:w="100" w:type="dxa"/>
-              <w:right w:w="100" w:type="dxa"/>
+              <w:top w:w="90" w:type="dxa"/>
+              <w:bottom w:w="90" w:type="dxa"/>
+              <w:left w:w="90" w:type="dxa"/>
+              <w:right w:w="90" w:type="dxa"/>
             </w:tcMar>
           </w:tcPr>
           <w:p>
@@ -966,7 +1101,7 @@
             <w:r>
               <w:rPr>
                 <w:b/>
-                <w:color w:val="FFFFFF"/>
+                <w:color w:val="000000"/>
               </w:rPr>
               <w:t>Cơ chế Lưu trữ</w:t>
             </w:r>
@@ -987,6 +1122,9 @@
           </w:tcPr>
           <w:p>
             <w:r>
+              <w:rPr>
+                <w:color w:val="000000"/>
+              </w:rPr>
               <w:t>1</w:t>
             </w:r>
           </w:p>
@@ -1004,6 +1142,9 @@
           </w:tcPr>
           <w:p>
             <w:r>
+              <w:rPr>
+                <w:color w:val="000000"/>
+              </w:rPr>
               <w:t>hethongqlsv_nginx</w:t>
             </w:r>
           </w:p>
@@ -1021,6 +1162,9 @@
           </w:tcPr>
           <w:p>
             <w:r>
+              <w:rPr>
+                <w:color w:val="000000"/>
+              </w:rPr>
               <w:t>Web Gateway &amp; Reverse Proxy</w:t>
             </w:r>
           </w:p>
@@ -1038,6 +1182,9 @@
           </w:tcPr>
           <w:p>
             <w:r>
+              <w:rPr>
+                <w:color w:val="000000"/>
+              </w:rPr>
               <w:t>nginx:alpine</w:t>
             </w:r>
           </w:p>
@@ -1055,6 +1202,9 @@
           </w:tcPr>
           <w:p>
             <w:r>
+              <w:rPr>
+                <w:color w:val="000000"/>
+              </w:rPr>
               <w:t>8083</w:t>
             </w:r>
           </w:p>
@@ -1072,6 +1222,9 @@
           </w:tcPr>
           <w:p>
             <w:r>
+              <w:rPr>
+                <w:color w:val="000000"/>
+              </w:rPr>
               <w:t>80</w:t>
             </w:r>
           </w:p>
@@ -1089,6 +1242,9 @@
           </w:tcPr>
           <w:p>
             <w:r>
+              <w:rPr>
+                <w:color w:val="000000"/>
+              </w:rPr>
               <w:t>Mount nginx.conf:ro</w:t>
             </w:r>
           </w:p>
@@ -1098,7 +1254,7 @@
         <w:tc>
           <w:tcPr>
             <w:tcW w:type="dxa" w:w="720"/>
-            <w:shd w:fill="F9FAFB"/>
+            <w:shd w:fill="F9F9F9"/>
             <w:tcMar>
               <w:top w:w="70" w:type="dxa"/>
               <w:bottom w:w="70" w:type="dxa"/>
@@ -1108,6 +1264,9 @@
           </w:tcPr>
           <w:p>
             <w:r>
+              <w:rPr>
+                <w:color w:val="000000"/>
+              </w:rPr>
               <w:t>2</w:t>
             </w:r>
           </w:p>
@@ -1115,7 +1274,7 @@
         <w:tc>
           <w:tcPr>
             <w:tcW w:type="dxa" w:w="2016"/>
-            <w:shd w:fill="F9FAFB"/>
+            <w:shd w:fill="F9F9F9"/>
             <w:tcMar>
               <w:top w:w="70" w:type="dxa"/>
               <w:bottom w:w="70" w:type="dxa"/>
@@ -1125,6 +1284,9 @@
           </w:tcPr>
           <w:p>
             <w:r>
+              <w:rPr>
+                <w:color w:val="000000"/>
+              </w:rPr>
               <w:t>hethongqlsv_web</w:t>
             </w:r>
           </w:p>
@@ -1132,7 +1294,7 @@
         <w:tc>
           <w:tcPr>
             <w:tcW w:type="dxa" w:w="2016"/>
-            <w:shd w:fill="F9FAFB"/>
+            <w:shd w:fill="F9F9F9"/>
             <w:tcMar>
               <w:top w:w="70" w:type="dxa"/>
               <w:bottom w:w="70" w:type="dxa"/>
@@ -1142,6 +1304,9 @@
           </w:tcPr>
           <w:p>
             <w:r>
+              <w:rPr>
+                <w:color w:val="000000"/>
+              </w:rPr>
               <w:t>Backend Ứng dụng Flask</w:t>
             </w:r>
           </w:p>
@@ -1149,7 +1314,7 @@
         <w:tc>
           <w:tcPr>
             <w:tcW w:type="dxa" w:w="1584"/>
-            <w:shd w:fill="F9FAFB"/>
+            <w:shd w:fill="F9F9F9"/>
             <w:tcMar>
               <w:top w:w="70" w:type="dxa"/>
               <w:bottom w:w="70" w:type="dxa"/>
@@ -1159,6 +1324,9 @@
           </w:tcPr>
           <w:p>
             <w:r>
+              <w:rPr>
+                <w:color w:val="000000"/>
+              </w:rPr>
               <w:t>Custom python:3.11-slim</w:t>
             </w:r>
           </w:p>
@@ -1166,7 +1334,7 @@
         <w:tc>
           <w:tcPr>
             <w:tcW w:type="dxa" w:w="864"/>
-            <w:shd w:fill="F9FAFB"/>
+            <w:shd w:fill="F9F9F9"/>
             <w:tcMar>
               <w:top w:w="70" w:type="dxa"/>
               <w:bottom w:w="70" w:type="dxa"/>
@@ -1176,6 +1344,9 @@
           </w:tcPr>
           <w:p>
             <w:r>
+              <w:rPr>
+                <w:color w:val="000000"/>
+              </w:rPr>
               <w:t>Nội bộ</w:t>
             </w:r>
           </w:p>
@@ -1183,7 +1354,7 @@
         <w:tc>
           <w:tcPr>
             <w:tcW w:type="dxa" w:w="864"/>
-            <w:shd w:fill="F9FAFB"/>
+            <w:shd w:fill="F9F9F9"/>
             <w:tcMar>
               <w:top w:w="70" w:type="dxa"/>
               <w:bottom w:w="70" w:type="dxa"/>
@@ -1193,6 +1364,9 @@
           </w:tcPr>
           <w:p>
             <w:r>
+              <w:rPr>
+                <w:color w:val="000000"/>
+              </w:rPr>
               <w:t>5000</w:t>
             </w:r>
           </w:p>
@@ -1200,7 +1374,7 @@
         <w:tc>
           <w:tcPr>
             <w:tcW w:type="dxa" w:w="1296"/>
-            <w:shd w:fill="F9FAFB"/>
+            <w:shd w:fill="F9F9F9"/>
             <w:tcMar>
               <w:top w:w="70" w:type="dxa"/>
               <w:bottom w:w="70" w:type="dxa"/>
@@ -1210,6 +1384,9 @@
           </w:tcPr>
           <w:p>
             <w:r>
+              <w:rPr>
+                <w:color w:val="000000"/>
+              </w:rPr>
               <w:t>Mount backend, frontend</w:t>
             </w:r>
           </w:p>
@@ -1229,6 +1406,9 @@
           </w:tcPr>
           <w:p>
             <w:r>
+              <w:rPr>
+                <w:color w:val="000000"/>
+              </w:rPr>
               <w:t>3</w:t>
             </w:r>
           </w:p>
@@ -1246,6 +1426,9 @@
           </w:tcPr>
           <w:p>
             <w:r>
+              <w:rPr>
+                <w:color w:val="000000"/>
+              </w:rPr>
               <w:t>hethongqlsv_db</w:t>
             </w:r>
           </w:p>
@@ -1263,6 +1446,9 @@
           </w:tcPr>
           <w:p>
             <w:r>
+              <w:rPr>
+                <w:color w:val="000000"/>
+              </w:rPr>
               <w:t>Hệ quản trị CSDL MySQL 8.0</w:t>
             </w:r>
           </w:p>
@@ -1280,6 +1466,9 @@
           </w:tcPr>
           <w:p>
             <w:r>
+              <w:rPr>
+                <w:color w:val="000000"/>
+              </w:rPr>
               <w:t>mysql:8.0</w:t>
             </w:r>
           </w:p>
@@ -1297,6 +1486,9 @@
           </w:tcPr>
           <w:p>
             <w:r>
+              <w:rPr>
+                <w:color w:val="000000"/>
+              </w:rPr>
               <w:t>3309</w:t>
             </w:r>
           </w:p>
@@ -1314,6 +1506,9 @@
           </w:tcPr>
           <w:p>
             <w:r>
+              <w:rPr>
+                <w:color w:val="000000"/>
+              </w:rPr>
               <w:t>3306</w:t>
             </w:r>
           </w:p>
@@ -1331,6 +1526,9 @@
           </w:tcPr>
           <w:p>
             <w:r>
+              <w:rPr>
+                <w:color w:val="000000"/>
+              </w:rPr>
               <w:t>Volume hethongqlsv_db_data</w:t>
             </w:r>
           </w:p>
@@ -1340,7 +1538,7 @@
         <w:tc>
           <w:tcPr>
             <w:tcW w:type="dxa" w:w="720"/>
-            <w:shd w:fill="F9FAFB"/>
+            <w:shd w:fill="F9F9F9"/>
             <w:tcMar>
               <w:top w:w="70" w:type="dxa"/>
               <w:bottom w:w="70" w:type="dxa"/>
@@ -1350,6 +1548,9 @@
           </w:tcPr>
           <w:p>
             <w:r>
+              <w:rPr>
+                <w:color w:val="000000"/>
+              </w:rPr>
               <w:t>4</w:t>
             </w:r>
           </w:p>
@@ -1357,7 +1558,7 @@
         <w:tc>
           <w:tcPr>
             <w:tcW w:type="dxa" w:w="2016"/>
-            <w:shd w:fill="F9FAFB"/>
+            <w:shd w:fill="F9F9F9"/>
             <w:tcMar>
               <w:top w:w="70" w:type="dxa"/>
               <w:bottom w:w="70" w:type="dxa"/>
@@ -1367,6 +1568,9 @@
           </w:tcPr>
           <w:p>
             <w:r>
+              <w:rPr>
+                <w:color w:val="000000"/>
+              </w:rPr>
               <w:t>hethongqlsv_phpmyadmin</w:t>
             </w:r>
           </w:p>
@@ -1374,7 +1578,7 @@
         <w:tc>
           <w:tcPr>
             <w:tcW w:type="dxa" w:w="2016"/>
-            <w:shd w:fill="F9FAFB"/>
+            <w:shd w:fill="F9F9F9"/>
             <w:tcMar>
               <w:top w:w="70" w:type="dxa"/>
               <w:bottom w:w="70" w:type="dxa"/>
@@ -1384,6 +1588,9 @@
           </w:tcPr>
           <w:p>
             <w:r>
+              <w:rPr>
+                <w:color w:val="000000"/>
+              </w:rPr>
               <w:t>Giao diện quản trị CSDL</w:t>
             </w:r>
           </w:p>
@@ -1391,7 +1598,7 @@
         <w:tc>
           <w:tcPr>
             <w:tcW w:type="dxa" w:w="1584"/>
-            <w:shd w:fill="F9FAFB"/>
+            <w:shd w:fill="F9F9F9"/>
             <w:tcMar>
               <w:top w:w="70" w:type="dxa"/>
               <w:bottom w:w="70" w:type="dxa"/>
@@ -1401,6 +1608,9 @@
           </w:tcPr>
           <w:p>
             <w:r>
+              <w:rPr>
+                <w:color w:val="000000"/>
+              </w:rPr>
               <w:t>phpmyadmin/phpmyadmin</w:t>
             </w:r>
           </w:p>
@@ -1408,7 +1618,7 @@
         <w:tc>
           <w:tcPr>
             <w:tcW w:type="dxa" w:w="864"/>
-            <w:shd w:fill="F9FAFB"/>
+            <w:shd w:fill="F9F9F9"/>
             <w:tcMar>
               <w:top w:w="70" w:type="dxa"/>
               <w:bottom w:w="70" w:type="dxa"/>
@@ -1418,6 +1628,9 @@
           </w:tcPr>
           <w:p>
             <w:r>
+              <w:rPr>
+                <w:color w:val="000000"/>
+              </w:rPr>
               <w:t>8084</w:t>
             </w:r>
           </w:p>
@@ -1425,7 +1638,7 @@
         <w:tc>
           <w:tcPr>
             <w:tcW w:type="dxa" w:w="864"/>
-            <w:shd w:fill="F9FAFB"/>
+            <w:shd w:fill="F9F9F9"/>
             <w:tcMar>
               <w:top w:w="70" w:type="dxa"/>
               <w:bottom w:w="70" w:type="dxa"/>
@@ -1435,6 +1648,9 @@
           </w:tcPr>
           <w:p>
             <w:r>
+              <w:rPr>
+                <w:color w:val="000000"/>
+              </w:rPr>
               <w:t>80</w:t>
             </w:r>
           </w:p>
@@ -1442,7 +1658,7 @@
         <w:tc>
           <w:tcPr>
             <w:tcW w:type="dxa" w:w="1296"/>
-            <w:shd w:fill="F9FAFB"/>
+            <w:shd w:fill="F9F9F9"/>
             <w:tcMar>
               <w:top w:w="70" w:type="dxa"/>
               <w:bottom w:w="70" w:type="dxa"/>
@@ -1452,6 +1668,9 @@
           </w:tcPr>
           <w:p>
             <w:r>
+              <w:rPr>
+                <w:color w:val="000000"/>
+              </w:rPr>
               <w:t>Ephemeral</w:t>
             </w:r>
           </w:p>
@@ -1471,6 +1690,9 @@
           </w:tcPr>
           <w:p>
             <w:r>
+              <w:rPr>
+                <w:color w:val="000000"/>
+              </w:rPr>
               <w:t>5</w:t>
             </w:r>
           </w:p>
@@ -1488,6 +1710,9 @@
           </w:tcPr>
           <w:p>
             <w:r>
+              <w:rPr>
+                <w:color w:val="000000"/>
+              </w:rPr>
               <w:t>hethongqlsv_prometheus</w:t>
             </w:r>
           </w:p>
@@ -1505,6 +1730,9 @@
           </w:tcPr>
           <w:p>
             <w:r>
+              <w:rPr>
+                <w:color w:val="000000"/>
+              </w:rPr>
               <w:t>Thu thập chỉ số Metrics</w:t>
             </w:r>
           </w:p>
@@ -1522,6 +1750,9 @@
           </w:tcPr>
           <w:p>
             <w:r>
+              <w:rPr>
+                <w:color w:val="000000"/>
+              </w:rPr>
               <w:t>prom/prometheus</w:t>
             </w:r>
           </w:p>
@@ -1539,6 +1770,9 @@
           </w:tcPr>
           <w:p>
             <w:r>
+              <w:rPr>
+                <w:color w:val="000000"/>
+              </w:rPr>
               <w:t>9092</w:t>
             </w:r>
           </w:p>
@@ -1556,6 +1790,9 @@
           </w:tcPr>
           <w:p>
             <w:r>
+              <w:rPr>
+                <w:color w:val="000000"/>
+              </w:rPr>
               <w:t>9090</w:t>
             </w:r>
           </w:p>
@@ -1573,6 +1810,9 @@
           </w:tcPr>
           <w:p>
             <w:r>
+              <w:rPr>
+                <w:color w:val="000000"/>
+              </w:rPr>
               <w:t>Mount prometheus.yml:ro</w:t>
             </w:r>
           </w:p>
@@ -1582,7 +1822,7 @@
         <w:tc>
           <w:tcPr>
             <w:tcW w:type="dxa" w:w="720"/>
-            <w:shd w:fill="F9FAFB"/>
+            <w:shd w:fill="F9F9F9"/>
             <w:tcMar>
               <w:top w:w="70" w:type="dxa"/>
               <w:bottom w:w="70" w:type="dxa"/>
@@ -1592,6 +1832,9 @@
           </w:tcPr>
           <w:p>
             <w:r>
+              <w:rPr>
+                <w:color w:val="000000"/>
+              </w:rPr>
               <w:t>6</w:t>
             </w:r>
           </w:p>
@@ -1599,7 +1842,7 @@
         <w:tc>
           <w:tcPr>
             <w:tcW w:type="dxa" w:w="2016"/>
-            <w:shd w:fill="F9FAFB"/>
+            <w:shd w:fill="F9F9F9"/>
             <w:tcMar>
               <w:top w:w="70" w:type="dxa"/>
               <w:bottom w:w="70" w:type="dxa"/>
@@ -1609,6 +1852,9 @@
           </w:tcPr>
           <w:p>
             <w:r>
+              <w:rPr>
+                <w:color w:val="000000"/>
+              </w:rPr>
               <w:t>hethongqlsv_grafana</w:t>
             </w:r>
           </w:p>
@@ -1616,7 +1862,7 @@
         <w:tc>
           <w:tcPr>
             <w:tcW w:type="dxa" w:w="2016"/>
-            <w:shd w:fill="F9FAFB"/>
+            <w:shd w:fill="F9F9F9"/>
             <w:tcMar>
               <w:top w:w="70" w:type="dxa"/>
               <w:bottom w:w="70" w:type="dxa"/>
@@ -1626,6 +1872,9 @@
           </w:tcPr>
           <w:p>
             <w:r>
+              <w:rPr>
+                <w:color w:val="000000"/>
+              </w:rPr>
               <w:t>Dashboard trực quan hóa</w:t>
             </w:r>
           </w:p>
@@ -1633,7 +1882,7 @@
         <w:tc>
           <w:tcPr>
             <w:tcW w:type="dxa" w:w="1584"/>
-            <w:shd w:fill="F9FAFB"/>
+            <w:shd w:fill="F9F9F9"/>
             <w:tcMar>
               <w:top w:w="70" w:type="dxa"/>
               <w:bottom w:w="70" w:type="dxa"/>
@@ -1643,6 +1892,9 @@
           </w:tcPr>
           <w:p>
             <w:r>
+              <w:rPr>
+                <w:color w:val="000000"/>
+              </w:rPr>
               <w:t>grafana/grafana</w:t>
             </w:r>
           </w:p>
@@ -1650,7 +1902,7 @@
         <w:tc>
           <w:tcPr>
             <w:tcW w:type="dxa" w:w="864"/>
-            <w:shd w:fill="F9FAFB"/>
+            <w:shd w:fill="F9F9F9"/>
             <w:tcMar>
               <w:top w:w="70" w:type="dxa"/>
               <w:bottom w:w="70" w:type="dxa"/>
@@ -1660,6 +1912,9 @@
           </w:tcPr>
           <w:p>
             <w:r>
+              <w:rPr>
+                <w:color w:val="000000"/>
+              </w:rPr>
               <w:t>3002</w:t>
             </w:r>
           </w:p>
@@ -1667,7 +1922,7 @@
         <w:tc>
           <w:tcPr>
             <w:tcW w:type="dxa" w:w="864"/>
-            <w:shd w:fill="F9FAFB"/>
+            <w:shd w:fill="F9F9F9"/>
             <w:tcMar>
               <w:top w:w="70" w:type="dxa"/>
               <w:bottom w:w="70" w:type="dxa"/>
@@ -1677,6 +1932,9 @@
           </w:tcPr>
           <w:p>
             <w:r>
+              <w:rPr>
+                <w:color w:val="000000"/>
+              </w:rPr>
               <w:t>3000</w:t>
             </w:r>
           </w:p>
@@ -1684,7 +1942,7 @@
         <w:tc>
           <w:tcPr>
             <w:tcW w:type="dxa" w:w="1296"/>
-            <w:shd w:fill="F9FAFB"/>
+            <w:shd w:fill="F9F9F9"/>
             <w:tcMar>
               <w:top w:w="70" w:type="dxa"/>
               <w:bottom w:w="70" w:type="dxa"/>
@@ -1694,6 +1952,9 @@
           </w:tcPr>
           <w:p>
             <w:r>
+              <w:rPr>
+                <w:color w:val="000000"/>
+              </w:rPr>
               <w:t>Mount dashboards &amp; prov.</w:t>
             </w:r>
           </w:p>
@@ -1713,6 +1974,9 @@
           </w:tcPr>
           <w:p>
             <w:r>
+              <w:rPr>
+                <w:color w:val="000000"/>
+              </w:rPr>
               <w:t>7</w:t>
             </w:r>
           </w:p>
@@ -1730,6 +1994,9 @@
           </w:tcPr>
           <w:p>
             <w:r>
+              <w:rPr>
+                <w:color w:val="000000"/>
+              </w:rPr>
               <w:t>hethongqlsv_loki</w:t>
             </w:r>
           </w:p>
@@ -1747,6 +2014,9 @@
           </w:tcPr>
           <w:p>
             <w:r>
+              <w:rPr>
+                <w:color w:val="000000"/>
+              </w:rPr>
               <w:t>Quản lý &amp; lưu trữ Log</w:t>
             </w:r>
           </w:p>
@@ -1764,6 +2034,9 @@
           </w:tcPr>
           <w:p>
             <w:r>
+              <w:rPr>
+                <w:color w:val="000000"/>
+              </w:rPr>
               <w:t>grafana/loki:2.9.0</w:t>
             </w:r>
           </w:p>
@@ -1781,6 +2054,9 @@
           </w:tcPr>
           <w:p>
             <w:r>
+              <w:rPr>
+                <w:color w:val="000000"/>
+              </w:rPr>
               <w:t>3102</w:t>
             </w:r>
           </w:p>
@@ -1798,6 +2074,9 @@
           </w:tcPr>
           <w:p>
             <w:r>
+              <w:rPr>
+                <w:color w:val="000000"/>
+              </w:rPr>
               <w:t>3100</w:t>
             </w:r>
           </w:p>
@@ -1815,6 +2094,9 @@
           </w:tcPr>
           <w:p>
             <w:r>
+              <w:rPr>
+                <w:color w:val="000000"/>
+              </w:rPr>
               <w:t>Built-in container storage</w:t>
             </w:r>
           </w:p>
@@ -1824,7 +2106,7 @@
         <w:tc>
           <w:tcPr>
             <w:tcW w:type="dxa" w:w="720"/>
-            <w:shd w:fill="F9FAFB"/>
+            <w:shd w:fill="F9F9F9"/>
             <w:tcMar>
               <w:top w:w="70" w:type="dxa"/>
               <w:bottom w:w="70" w:type="dxa"/>
@@ -1834,6 +2116,9 @@
           </w:tcPr>
           <w:p>
             <w:r>
+              <w:rPr>
+                <w:color w:val="000000"/>
+              </w:rPr>
               <w:t>8</w:t>
             </w:r>
           </w:p>
@@ -1841,7 +2126,7 @@
         <w:tc>
           <w:tcPr>
             <w:tcW w:type="dxa" w:w="2016"/>
-            <w:shd w:fill="F9FAFB"/>
+            <w:shd w:fill="F9F9F9"/>
             <w:tcMar>
               <w:top w:w="70" w:type="dxa"/>
               <w:bottom w:w="70" w:type="dxa"/>
@@ -1851,6 +2136,9 @@
           </w:tcPr>
           <w:p>
             <w:r>
+              <w:rPr>
+                <w:color w:val="000000"/>
+              </w:rPr>
               <w:t>hethongqlsv_promtail</w:t>
             </w:r>
           </w:p>
@@ -1858,7 +2146,7 @@
         <w:tc>
           <w:tcPr>
             <w:tcW w:type="dxa" w:w="2016"/>
-            <w:shd w:fill="F9FAFB"/>
+            <w:shd w:fill="F9F9F9"/>
             <w:tcMar>
               <w:top w:w="70" w:type="dxa"/>
               <w:bottom w:w="70" w:type="dxa"/>
@@ -1868,6 +2156,9 @@
           </w:tcPr>
           <w:p>
             <w:r>
+              <w:rPr>
+                <w:color w:val="000000"/>
+              </w:rPr>
               <w:t>Thu thập Log từ Docker Daemon</w:t>
             </w:r>
           </w:p>
@@ -1875,7 +2166,7 @@
         <w:tc>
           <w:tcPr>
             <w:tcW w:type="dxa" w:w="1584"/>
-            <w:shd w:fill="F9FAFB"/>
+            <w:shd w:fill="F9F9F9"/>
             <w:tcMar>
               <w:top w:w="70" w:type="dxa"/>
               <w:bottom w:w="70" w:type="dxa"/>
@@ -1885,6 +2176,9 @@
           </w:tcPr>
           <w:p>
             <w:r>
+              <w:rPr>
+                <w:color w:val="000000"/>
+              </w:rPr>
               <w:t>grafana/promtail:2.9.0</w:t>
             </w:r>
           </w:p>
@@ -1892,7 +2186,7 @@
         <w:tc>
           <w:tcPr>
             <w:tcW w:type="dxa" w:w="864"/>
-            <w:shd w:fill="F9FAFB"/>
+            <w:shd w:fill="F9F9F9"/>
             <w:tcMar>
               <w:top w:w="70" w:type="dxa"/>
               <w:bottom w:w="70" w:type="dxa"/>
@@ -1902,6 +2196,9 @@
           </w:tcPr>
           <w:p>
             <w:r>
+              <w:rPr>
+                <w:color w:val="000000"/>
+              </w:rPr>
               <w:t>Nội bộ</w:t>
             </w:r>
           </w:p>
@@ -1909,7 +2206,7 @@
         <w:tc>
           <w:tcPr>
             <w:tcW w:type="dxa" w:w="864"/>
-            <w:shd w:fill="F9FAFB"/>
+            <w:shd w:fill="F9F9F9"/>
             <w:tcMar>
               <w:top w:w="70" w:type="dxa"/>
               <w:bottom w:w="70" w:type="dxa"/>
@@ -1919,6 +2216,9 @@
           </w:tcPr>
           <w:p>
             <w:r>
+              <w:rPr>
+                <w:color w:val="000000"/>
+              </w:rPr>
               <w:t>N/A</w:t>
             </w:r>
           </w:p>
@@ -1926,7 +2226,7 @@
         <w:tc>
           <w:tcPr>
             <w:tcW w:type="dxa" w:w="1296"/>
-            <w:shd w:fill="F9FAFB"/>
+            <w:shd w:fill="F9F9F9"/>
             <w:tcMar>
               <w:top w:w="70" w:type="dxa"/>
               <w:bottom w:w="70" w:type="dxa"/>
@@ -1936,6 +2236,9 @@
           </w:tcPr>
           <w:p>
             <w:r>
+              <w:rPr>
+                <w:color w:val="000000"/>
+              </w:rPr>
               <w:t>Mount docker.sock:ro</w:t>
             </w:r>
           </w:p>
@@ -1955,7 +2258,7 @@
       <w:r>
         <w:rPr>
           <w:b/>
-          <w:color w:val="2F5597"/>
+          <w:color w:val="000000"/>
           <w:sz w:val="26"/>
         </w:rPr>
         <w:t>2.2. Đóng gói ứng dụng Backend với Dockerfile</w:t>
@@ -1974,10 +2277,14 @@
       <w:r>
         <w:rPr>
           <w:b/>
+          <w:color w:val="000000"/>
         </w:rPr>
         <w:t>- Base Image:</w:t>
       </w:r>
       <w:r>
+        <w:rPr>
+          <w:color w:val="000000"/>
+        </w:rPr>
         <w:t xml:space="preserve"> Sử dụng base image `python:3.11-slim` để giảm dung lượng image xuống dưới 180MB.</w:t>
       </w:r>
     </w:p>
@@ -1989,10 +2296,14 @@
       <w:r>
         <w:rPr>
           <w:b/>
+          <w:color w:val="000000"/>
         </w:rPr>
         <w:t>- Nguyên tắc Non-root:</w:t>
       </w:r>
       <w:r>
+        <w:rPr>
+          <w:color w:val="000000"/>
+        </w:rPr>
         <w:t xml:space="preserve"> Tạo người dùng hệ thống không đặc quyền `appuser` thuộc nhóm `appgroup` để chạy ứng dụng, tuyệt đối không chạy dưới quyền `root`.</w:t>
       </w:r>
     </w:p>
@@ -2004,10 +2315,14 @@
       <w:r>
         <w:rPr>
           <w:b/>
+          <w:color w:val="000000"/>
         </w:rPr>
         <w:t>- Lệnh khởi chạy:</w:t>
       </w:r>
       <w:r>
+        <w:rPr>
+          <w:color w:val="000000"/>
+        </w:rPr>
         <w:t xml:space="preserve"> Khởi chạy thông qua Gunicorn WSGI Server đa luồng:</w:t>
       </w:r>
     </w:p>
@@ -2024,7 +2339,7 @@
         <w:tc>
           <w:tcPr>
             <w:tcW w:type="dxa" w:w="9360"/>
-            <w:shd w:fill="F6F8FA"/>
+            <w:shd w:fill="F8F9FA"/>
             <w:tcMar>
               <w:top w:w="100" w:type="dxa"/>
               <w:bottom w:w="100" w:type="dxa"/>
@@ -2032,10 +2347,10 @@
               <w:right w:w="150" w:type="dxa"/>
             </w:tcMar>
             <w:tcBorders>
-              <w:top w:val="single" w:sz="4" w:space="0" w:color="D0D7DE"/>
-              <w:left w:val="single" w:sz="18" w:space="0" w:color="1F4E79"/>
-              <w:bottom w:val="single" w:sz="4" w:space="0" w:color="D0D7DE"/>
-              <w:right w:val="single" w:sz="4" w:space="0" w:color="D0D7DE"/>
+              <w:top w:val="single" w:sz="4" w:space="0" w:color="000000"/>
+              <w:left w:val="single" w:sz="18" w:space="0" w:color="000000"/>
+              <w:bottom w:val="single" w:sz="4" w:space="0" w:color="000000"/>
+              <w:right w:val="single" w:sz="4" w:space="0" w:color="000000"/>
             </w:tcBorders>
           </w:tcPr>
           <w:p>
@@ -2045,7 +2360,7 @@
             <w:r>
               <w:rPr>
                 <w:rFonts w:ascii="Consolas" w:hAnsi="Consolas"/>
-                <w:color w:val="24292F"/>
+                <w:color w:val="000000"/>
                 <w:sz w:val="19"/>
               </w:rPr>
               <w:t>FROM python:3.11-slim</w:t>
@@ -2089,7 +2404,7 @@
       <w:r>
         <w:rPr>
           <w:b/>
-          <w:color w:val="2F5597"/>
+          <w:color w:val="000000"/>
           <w:sz w:val="26"/>
         </w:rPr>
         <w:t>2.3. Điều phối cụm dịch vụ với Docker Compose (`docker-compose.yml`)</w:t>
@@ -2108,10 +2423,14 @@
       <w:r>
         <w:rPr>
           <w:b/>
+          <w:color w:val="000000"/>
         </w:rPr>
         <w:t>1. Phụ thuộc dịch vụ (Service Dependencies):</w:t>
       </w:r>
       <w:r>
+        <w:rPr>
+          <w:color w:val="000000"/>
+        </w:rPr>
         <w:t xml:space="preserve"> Cấu hình `healthcheck` trên container CSDL và khai báo `depends_on: { db: { condition: service_healthy } }` trên container web. Ứng dụng Flask chỉ được khởi động khi MySQL đã kiểm tra `mysqladmin ping` thành công, ngăn ngừa hoàn toàn lỗi crash khi kết nối CSDL lúc khởi động.</w:t>
       </w:r>
     </w:p>
@@ -2123,10 +2442,14 @@
       <w:r>
         <w:rPr>
           <w:b/>
+          <w:color w:val="000000"/>
         </w:rPr>
         <w:t>2. Tự phục hồi thảm họa (Auto Restart):</w:t>
       </w:r>
       <w:r>
+        <w:rPr>
+          <w:color w:val="000000"/>
+        </w:rPr>
         <w:t xml:space="preserve"> Toàn bộ 8 container đều được cấu hình `restart: always`, tự động phục hồi nếu gặp sự cố hoặc khi máy chủ vật lý khởi động lại.</w:t>
       </w:r>
     </w:p>
@@ -2138,7 +2461,7 @@
       <w:r>
         <w:rPr>
           <w:b/>
-          <w:color w:val="2F5597"/>
+          <w:color w:val="000000"/>
           <w:sz w:val="26"/>
         </w:rPr>
         <w:t>2.4. Quản trị mạng ảo nội bộ và lưu trữ bền vững (Volumes)</w:t>
@@ -2152,10 +2475,14 @@
       <w:r>
         <w:rPr>
           <w:b/>
+          <w:color w:val="000000"/>
         </w:rPr>
         <w:t>- Docker Network:</w:t>
       </w:r>
       <w:r>
+        <w:rPr>
+          <w:color w:val="000000"/>
+        </w:rPr>
         <w:t xml:space="preserve"> Thiết lập mạng ảo bridge `hethongqlsv-network`. Các container liên lạc thông qua tên DNS nội bộ (ví dụ backend kết nối tới `db:3306`, prometheus cào `web:5000/metrics`). Mạng hoàn toàn cách ly với bên ngoài.</w:t>
       </w:r>
     </w:p>
@@ -2167,10 +2494,14 @@
       <w:r>
         <w:rPr>
           <w:b/>
+          <w:color w:val="000000"/>
         </w:rPr>
         <w:t>- Docker Named Volume:</w:t>
       </w:r>
       <w:r>
+        <w:rPr>
+          <w:color w:val="000000"/>
+        </w:rPr>
         <w:t xml:space="preserve"> Khởi tạo Named Volume `hethongqlsv_db_data` ánh xạ tới `/var/lib/mysql`. Dữ liệu CSDL tách biệt hoàn toàn với vòng đời của container; lệnh `docker compose down` không làm mất dữ liệu.</w:t>
       </w:r>
     </w:p>
@@ -2182,7 +2513,7 @@
       <w:r>
         <w:rPr>
           <w:b/>
-          <w:color w:val="1F4E79"/>
+          <w:color w:val="000000"/>
           <w:sz w:val="30"/>
         </w:rPr>
         <w:t>CHƯƠNG 3: CẤU HÌNH WEB GATEWAY VÀ REVERSE PROXY VỚI NGINX</w:t>
@@ -2196,7 +2527,7 @@
       <w:r>
         <w:rPr>
           <w:b/>
-          <w:color w:val="2F5597"/>
+          <w:color w:val="000000"/>
           <w:sz w:val="26"/>
         </w:rPr>
         <w:t>3.1. Vai trò của Reverse Proxy trong kiến trúc triển khai</w:t>
@@ -2215,10 +2546,14 @@
       <w:r>
         <w:rPr>
           <w:b/>
+          <w:color w:val="000000"/>
         </w:rPr>
         <w:t>- Ẩn giấu kiến trúc backend:</w:t>
       </w:r>
       <w:r>
+        <w:rPr>
+          <w:color w:val="000000"/>
+        </w:rPr>
         <w:t xml:space="preserve"> Che giấu hoàn toàn địa chỉ IP và cổng dịch vụ nội bộ của Flask/Gunicorn.</w:t>
       </w:r>
     </w:p>
@@ -2230,10 +2565,14 @@
       <w:r>
         <w:rPr>
           <w:b/>
+          <w:color w:val="000000"/>
         </w:rPr>
         <w:t>- Phân phối tài nguyên tĩnh:</w:t>
       </w:r>
       <w:r>
+        <w:rPr>
+          <w:color w:val="000000"/>
+        </w:rPr>
         <w:t xml:space="preserve"> Xử lý phân phối file tĩnh (CSS, JS, hình ảnh) trực tiếp với hiệu năng vượt trội, không chiếm dụng tài nguyên xử lý của tiến trình Python.</w:t>
       </w:r>
     </w:p>
@@ -2245,10 +2584,14 @@
       <w:r>
         <w:rPr>
           <w:b/>
+          <w:color w:val="000000"/>
         </w:rPr>
         <w:t>- Bảo vệ an toàn:</w:t>
       </w:r>
       <w:r>
+        <w:rPr>
+          <w:color w:val="000000"/>
+        </w:rPr>
         <w:t xml:space="preserve"> Kiểm soát kích thước tải lên, ngăn chặn tấn công từ chối dịch vụ (DoS) và quản lý tập trung các Header an toàn.</w:t>
       </w:r>
     </w:p>
@@ -2260,7 +2603,7 @@
       <w:r>
         <w:rPr>
           <w:b/>
-          <w:color w:val="2F5597"/>
+          <w:color w:val="000000"/>
           <w:sz w:val="26"/>
         </w:rPr>
         <w:t>3.2. Cấu hình chi tiết Nginx Gateway (`nginx.conf`)</w:t>
@@ -2279,7 +2622,7 @@
         <w:tc>
           <w:tcPr>
             <w:tcW w:type="dxa" w:w="9360"/>
-            <w:shd w:fill="F6F8FA"/>
+            <w:shd w:fill="F8F9FA"/>
             <w:tcMar>
               <w:top w:w="100" w:type="dxa"/>
               <w:bottom w:w="100" w:type="dxa"/>
@@ -2287,10 +2630,10 @@
               <w:right w:w="150" w:type="dxa"/>
             </w:tcMar>
             <w:tcBorders>
-              <w:top w:val="single" w:sz="4" w:space="0" w:color="D0D7DE"/>
-              <w:left w:val="single" w:sz="18" w:space="0" w:color="1F4E79"/>
-              <w:bottom w:val="single" w:sz="4" w:space="0" w:color="D0D7DE"/>
-              <w:right w:val="single" w:sz="4" w:space="0" w:color="D0D7DE"/>
+              <w:top w:val="single" w:sz="4" w:space="0" w:color="000000"/>
+              <w:left w:val="single" w:sz="18" w:space="0" w:color="000000"/>
+              <w:bottom w:val="single" w:sz="4" w:space="0" w:color="000000"/>
+              <w:right w:val="single" w:sz="4" w:space="0" w:color="000000"/>
             </w:tcBorders>
           </w:tcPr>
           <w:p>
@@ -2300,7 +2643,7 @@
             <w:r>
               <w:rPr>
                 <w:rFonts w:ascii="Consolas" w:hAnsi="Consolas"/>
-                <w:color w:val="24292F"/>
+                <w:color w:val="000000"/>
                 <w:sz w:val="19"/>
               </w:rPr>
               <w:t>events { worker_connections 1024; }</w:t>
@@ -2383,7 +2726,7 @@
       <w:r>
         <w:rPr>
           <w:b/>
-          <w:color w:val="2F5597"/>
+          <w:color w:val="000000"/>
           <w:sz w:val="26"/>
         </w:rPr>
         <w:t>3.3. Phân phối tài nguyên tĩnh và cơ chế Reverse Proxy Pass</w:t>
@@ -2402,7 +2745,7 @@
       <w:r>
         <w:rPr>
           <w:b/>
-          <w:color w:val="1F4E79"/>
+          <w:color w:val="000000"/>
           <w:sz w:val="30"/>
         </w:rPr>
         <w:t>CHƯƠNG 4: QUẢN TRỊ CƠ SỞ DỮ LIỆU VÀ CHIẾN LƯỢC SAO LƯU / PHỤC HỒI</w:t>
@@ -2416,7 +2759,7 @@
       <w:r>
         <w:rPr>
           <w:b/>
-          <w:color w:val="2F5597"/>
+          <w:color w:val="000000"/>
           <w:sz w:val="26"/>
         </w:rPr>
         <w:t>4.1. Cấu hình và quản trị cơ sở dữ liệu MySQL 8.0</w:t>
@@ -2435,7 +2778,7 @@
       <w:r>
         <w:rPr>
           <w:b/>
-          <w:color w:val="2F5597"/>
+          <w:color w:val="000000"/>
           <w:sz w:val="26"/>
         </w:rPr>
         <w:t>4.2. Quản trị CSDL qua giao diện đồ họa phpMyAdmin</w:t>
@@ -2454,7 +2797,7 @@
       <w:r>
         <w:rPr>
           <w:b/>
-          <w:color w:val="2F5597"/>
+          <w:color w:val="000000"/>
           <w:sz w:val="26"/>
         </w:rPr>
         <w:t>4.3. Xây dựng kịch bản sao lưu dữ liệu tự động (Backup Automation)</w:t>
@@ -2473,10 +2816,14 @@
       <w:r>
         <w:rPr>
           <w:b/>
+          <w:color w:val="000000"/>
         </w:rPr>
         <w:t>-</w:t>
       </w:r>
       <w:r>
+        <w:rPr>
+          <w:color w:val="000000"/>
+        </w:rPr>
         <w:t xml:space="preserve"> Kịch bản PowerShell: `scripts/backup.ps1` (chạy trên Windows Host hoặc Windows Task Scheduler).</w:t>
       </w:r>
     </w:p>
@@ -2488,10 +2835,14 @@
       <w:r>
         <w:rPr>
           <w:b/>
+          <w:color w:val="000000"/>
         </w:rPr>
         <w:t>-</w:t>
       </w:r>
       <w:r>
+        <w:rPr>
+          <w:color w:val="000000"/>
+        </w:rPr>
         <w:t xml:space="preserve"> Kịch bản Bash Shell: `scripts/backup.sh` (chạy trên Linux Host hoặc Linux Cronjob).</w:t>
       </w:r>
     </w:p>
@@ -2508,10 +2859,14 @@
       <w:r>
         <w:rPr>
           <w:b/>
+          <w:color w:val="000000"/>
         </w:rPr>
         <w:t>1.</w:t>
       </w:r>
       <w:r>
+        <w:rPr>
+          <w:color w:val="000000"/>
+        </w:rPr>
         <w:t xml:space="preserve"> Thực thi `mysqldump` trực tiếp bên trong container MySQL với cờ `--single-transaction --quick --routines --triggers` đảm bảo không khóa bảng khi hệ thống đang vận hành.</w:t>
       </w:r>
     </w:p>
@@ -2523,10 +2878,14 @@
       <w:r>
         <w:rPr>
           <w:b/>
+          <w:color w:val="000000"/>
         </w:rPr>
         <w:t>2.</w:t>
       </w:r>
       <w:r>
+        <w:rPr>
+          <w:color w:val="000000"/>
+        </w:rPr>
         <w:t xml:space="preserve"> Tạo tệp sao lưu có định dạng gắn nhãn thời gian: `backup_YYYYMMDD_HHMMSS.sql` lưu trữ trong thư mục `backups/`.</w:t>
       </w:r>
     </w:p>
@@ -2538,10 +2897,14 @@
       <w:r>
         <w:rPr>
           <w:b/>
+          <w:color w:val="000000"/>
         </w:rPr>
         <w:t>3.</w:t>
       </w:r>
       <w:r>
+        <w:rPr>
+          <w:color w:val="000000"/>
+        </w:rPr>
         <w:t xml:space="preserve"> Chính sách lưu trữ (Retention Policy): Tự động quét và xóa bỏ các bản sao lưu cũ quá 30 ngày để chống đầy đĩa cứng.</w:t>
       </w:r>
     </w:p>
@@ -2553,7 +2916,7 @@
       <w:r>
         <w:rPr>
           <w:b/>
-          <w:color w:val="2F5597"/>
+          <w:color w:val="000000"/>
           <w:sz w:val="26"/>
         </w:rPr>
         <w:t>4.4. Xây dựng kịch bản phục hồi thảm họa (Disaster Recovery)</w:t>
@@ -2572,7 +2935,7 @@
       <w:r>
         <w:rPr>
           <w:b/>
-          <w:color w:val="2F5597"/>
+          <w:color w:val="000000"/>
           <w:sz w:val="26"/>
         </w:rPr>
         <w:t>4.5. Cơ chế quản lý sao lưu và phục hồi qua Web API</w:t>
@@ -2591,10 +2954,14 @@
       <w:r>
         <w:rPr>
           <w:b/>
+          <w:color w:val="000000"/>
         </w:rPr>
         <w:t>-</w:t>
       </w:r>
       <w:r>
+        <w:rPr>
+          <w:color w:val="000000"/>
+        </w:rPr>
         <w:t xml:space="preserve"> `GET /api/admin/backups`: Liệt kê các bản sao lưu hiện có và kích thước tệp.</w:t>
       </w:r>
     </w:p>
@@ -2606,10 +2973,14 @@
       <w:r>
         <w:rPr>
           <w:b/>
+          <w:color w:val="000000"/>
         </w:rPr>
         <w:t>-</w:t>
       </w:r>
       <w:r>
+        <w:rPr>
+          <w:color w:val="000000"/>
+        </w:rPr>
         <w:t xml:space="preserve"> `POST /api/admin/backups`: Nhấp chuột để kích hoạt tạo bản sao lưu mới ngay lập tức.</w:t>
       </w:r>
     </w:p>
@@ -2621,10 +2992,14 @@
       <w:r>
         <w:rPr>
           <w:b/>
+          <w:color w:val="000000"/>
         </w:rPr>
         <w:t>-</w:t>
       </w:r>
       <w:r>
+        <w:rPr>
+          <w:color w:val="000000"/>
+        </w:rPr>
         <w:t xml:space="preserve"> `POST /api/admin/backups/restore`: Hoàn tác CSDL về bản sao lưu được chọn.</w:t>
       </w:r>
     </w:p>
@@ -2636,7 +3011,7 @@
       <w:r>
         <w:rPr>
           <w:b/>
-          <w:color w:val="1F4E79"/>
+          <w:color w:val="000000"/>
           <w:sz w:val="30"/>
         </w:rPr>
         <w:t>CHƯƠNG 5: GIÁM SÁT HỆ THỐNG, THU THẬP LOG VÀ CẢNH BÁO</w:t>
@@ -2650,7 +3025,7 @@
       <w:r>
         <w:rPr>
           <w:b/>
-          <w:color w:val="2F5597"/>
+          <w:color w:val="000000"/>
           <w:sz w:val="26"/>
         </w:rPr>
         <w:t>5.1. Mô hình giám sát tập trung (Observability: Metrics &amp; Logs)</w:t>
@@ -2669,10 +3044,14 @@
       <w:r>
         <w:rPr>
           <w:b/>
+          <w:color w:val="000000"/>
         </w:rPr>
         <w:t>1. Prometheus Server (Port 9092):</w:t>
       </w:r>
       <w:r>
+        <w:rPr>
+          <w:color w:val="000000"/>
+        </w:rPr>
         <w:t xml:space="preserve"> Cào và lưu trữ các chỉ số số lượng (CPU, RAM, HTTP Requests, Latency).</w:t>
       </w:r>
     </w:p>
@@ -2684,10 +3063,14 @@
       <w:r>
         <w:rPr>
           <w:b/>
+          <w:color w:val="000000"/>
         </w:rPr>
         <w:t>2. Grafana Dashboard (Port 3002):</w:t>
       </w:r>
       <w:r>
+        <w:rPr>
+          <w:color w:val="000000"/>
+        </w:rPr>
         <w:t xml:space="preserve"> Trực quan hóa dữ liệu chỉ số và nhật ký trên các biểu đồ bảng điều khiển trực quan.</w:t>
       </w:r>
     </w:p>
@@ -2699,10 +3082,14 @@
       <w:r>
         <w:rPr>
           <w:b/>
+          <w:color w:val="000000"/>
         </w:rPr>
         <w:t>3. Promtail Log Shipper:</w:t>
       </w:r>
       <w:r>
+        <w:rPr>
+          <w:color w:val="000000"/>
+        </w:rPr>
         <w:t xml:space="preserve"> Lắng nghe và đọc log trực tiếp từ Docker socket (`docker.sock`).</w:t>
       </w:r>
     </w:p>
@@ -2714,10 +3101,14 @@
       <w:r>
         <w:rPr>
           <w:b/>
+          <w:color w:val="000000"/>
         </w:rPr>
         <w:t>4. Grafana Loki (Port 3102):</w:t>
       </w:r>
       <w:r>
+        <w:rPr>
+          <w:color w:val="000000"/>
+        </w:rPr>
         <w:t xml:space="preserve"> Công cụ lưu trữ và lập chỉ mục nhật ký tối ưu cao, cho phép truy vấn bằng LogQL.</w:t>
       </w:r>
     </w:p>
@@ -2729,7 +3120,7 @@
       <w:r>
         <w:rPr>
           <w:b/>
-          <w:color w:val="2F5597"/>
+          <w:color w:val="000000"/>
           <w:sz w:val="26"/>
         </w:rPr>
         <w:t>5.2. Thu thập chỉ số tài nguyên và hiệu năng ứng dụng với Prometheus</w:t>
@@ -2748,7 +3139,7 @@
       <w:r>
         <w:rPr>
           <w:b/>
-          <w:color w:val="2F5597"/>
+          <w:color w:val="000000"/>
           <w:sz w:val="26"/>
         </w:rPr>
         <w:t>5.3. Xây dựng Dashboard trực quan hóa với Grafana</w:t>
@@ -2767,10 +3158,14 @@
       <w:r>
         <w:rPr>
           <w:b/>
+          <w:color w:val="000000"/>
         </w:rPr>
         <w:t>-</w:t>
       </w:r>
       <w:r>
+        <w:rPr>
+          <w:color w:val="000000"/>
+        </w:rPr>
         <w:t xml:space="preserve"> Tần suất yêu cầu HTTP (Request Rate).</w:t>
       </w:r>
     </w:p>
@@ -2782,10 +3177,14 @@
       <w:r>
         <w:rPr>
           <w:b/>
+          <w:color w:val="000000"/>
         </w:rPr>
         <w:t>-</w:t>
       </w:r>
       <w:r>
+        <w:rPr>
+          <w:color w:val="000000"/>
+        </w:rPr>
         <w:t xml:space="preserve"> Tỷ lệ mã trạng thái HTTP (2xx, 3xx, 4xx, 5xx).</w:t>
       </w:r>
     </w:p>
@@ -2797,10 +3196,14 @@
       <w:r>
         <w:rPr>
           <w:b/>
+          <w:color w:val="000000"/>
         </w:rPr>
         <w:t>-</w:t>
       </w:r>
       <w:r>
+        <w:rPr>
+          <w:color w:val="000000"/>
+        </w:rPr>
         <w:t xml:space="preserve"> Thời gian trễ xử lý trung bình của API (Response Time).</w:t>
       </w:r>
     </w:p>
@@ -2812,10 +3215,14 @@
       <w:r>
         <w:rPr>
           <w:b/>
+          <w:color w:val="000000"/>
         </w:rPr>
         <w:t>-</w:t>
       </w:r>
       <w:r>
+        <w:rPr>
+          <w:color w:val="000000"/>
+        </w:rPr>
         <w:t xml:space="preserve"> Mức tiêu thụ bộ nhớ RAM và CPU của cụm dịch vụ.</w:t>
       </w:r>
     </w:p>
@@ -2827,7 +3234,7 @@
       <w:r>
         <w:rPr>
           <w:b/>
-          <w:color w:val="2F5597"/>
+          <w:color w:val="000000"/>
           <w:sz w:val="26"/>
         </w:rPr>
         <w:t>5.4. Thu thập và tập trung nhật ký hệ thống với Promtail &amp; Loki</w:t>
@@ -2846,7 +3253,7 @@
       <w:r>
         <w:rPr>
           <w:b/>
-          <w:color w:val="1F4E79"/>
+          <w:color w:val="000000"/>
           <w:sz w:val="30"/>
         </w:rPr>
         <w:t>CHƯƠNG 6: BẢO MẬT HỆ THỐNG, KIỂM THỬ VÀ ĐÁNH GIÁ KẾT QUẢ</w:t>
@@ -2860,7 +3267,7 @@
       <w:r>
         <w:rPr>
           <w:b/>
-          <w:color w:val="2F5597"/>
+          <w:color w:val="000000"/>
           <w:sz w:val="26"/>
         </w:rPr>
         <w:t>6.1. Các giải pháp an toàn và bảo mật hệ thống</w:t>
@@ -2874,10 +3281,14 @@
       <w:r>
         <w:rPr>
           <w:b/>
+          <w:color w:val="000000"/>
         </w:rPr>
         <w:t>1. Quản lý biến môi trường:</w:t>
       </w:r>
       <w:r>
+        <w:rPr>
+          <w:color w:val="000000"/>
+        </w:rPr>
         <w:t xml:space="preserve"> Quản lý thông tin nhạy cảm qua file `.env`, loại bỏ triệt để việc lộ mật khẩu trên GitHub bằng `.gitignore`.</w:t>
       </w:r>
     </w:p>
@@ -2889,10 +3300,14 @@
       <w:r>
         <w:rPr>
           <w:b/>
+          <w:color w:val="000000"/>
         </w:rPr>
         <w:t>2. Nguyên tắc Non-root:</w:t>
       </w:r>
       <w:r>
+        <w:rPr>
+          <w:color w:val="000000"/>
+        </w:rPr>
         <w:t xml:space="preserve"> Ứng dụng chạy bằng người dùng `appuser`, hạn chế tối đa nguy cơ leo thang đặc quyền.</w:t>
       </w:r>
     </w:p>
@@ -2904,10 +3319,14 @@
       <w:r>
         <w:rPr>
           <w:b/>
+          <w:color w:val="000000"/>
         </w:rPr>
         <w:t>3. Phân quyền RBAC:</w:t>
       </w:r>
       <w:r>
+        <w:rPr>
+          <w:color w:val="000000"/>
+        </w:rPr>
         <w:t xml:space="preserve"> Kiểm soát quyền 3 cấp độ (Role 2: Admin, Role 1: Giảng viên, Role 0: Sinh viên). Các yêu cầu trái quyền bị chặn bằng mã HTTP 403.</w:t>
       </w:r>
     </w:p>
@@ -2919,10 +3338,14 @@
       <w:r>
         <w:rPr>
           <w:b/>
+          <w:color w:val="000000"/>
         </w:rPr>
         <w:t>4. Chống lỗ hổng OWASP:</w:t>
       </w:r>
       <w:r>
+        <w:rPr>
+          <w:color w:val="000000"/>
+        </w:rPr>
         <w:t xml:space="preserve"> Chống SQL Injection bằng Parameterized Query, chống XSS bằng Cookie HttpOnly và SameSite.</w:t>
       </w:r>
     </w:p>
@@ -2934,7 +3357,7 @@
       <w:r>
         <w:rPr>
           <w:b/>
-          <w:color w:val="2F5597"/>
+          <w:color w:val="000000"/>
           <w:sz w:val="26"/>
         </w:rPr>
         <w:t>6.2. Kiểm thử tải và kiểm thử chức năng toàn diện</w:t>
@@ -2951,12 +3374,12 @@
         <w:jc w:val="center"/>
         <w:tblLook w:firstColumn="1" w:firstRow="1" w:lastColumn="0" w:lastRow="0" w:noHBand="0" w:noVBand="1" w:val="04A0"/>
         <w:tblBorders>
-          <w:top w:val="single" w:sz="4" w:space="0" w:color="D0D7DE"/>
-          <w:bottom w:val="single" w:sz="4" w:space="0" w:color="D0D7DE"/>
-          <w:insideH w:val="single" w:sz="4" w:space="0" w:color="D0D7DE"/>
-          <w:insideV w:val="none"/>
-          <w:left w:val="none"/>
-          <w:right w:val="none"/>
+          <w:top w:val="single" w:sz="6" w:space="0" w:color="A0A0A0"/>
+          <w:bottom w:val="single" w:sz="6" w:space="0" w:color="A0A0A0"/>
+          <w:insideH w:val="single" w:sz="4" w:space="0" w:color="A0A0A0"/>
+          <w:insideV w:val="single" w:sz="4" w:space="0" w:color="A0A0A0"/>
+          <w:left w:val="single" w:sz="6" w:space="0" w:color="A0A0A0"/>
+          <w:right w:val="single" w:sz="6" w:space="0" w:color="A0A0A0"/>
         </w:tblBorders>
       </w:tblPr>
       <w:tblGrid>
@@ -2969,12 +3392,12 @@
         <w:tc>
           <w:tcPr>
             <w:tcW w:type="dxa" w:w="2592"/>
-            <w:shd w:fill="1F4E79"/>
+            <w:shd w:fill="E8E8E8"/>
             <w:tcMar>
-              <w:top w:w="100" w:type="dxa"/>
-              <w:bottom w:w="100" w:type="dxa"/>
-              <w:left w:w="100" w:type="dxa"/>
-              <w:right w:w="100" w:type="dxa"/>
+              <w:top w:w="90" w:type="dxa"/>
+              <w:bottom w:w="90" w:type="dxa"/>
+              <w:left w:w="90" w:type="dxa"/>
+              <w:right w:w="90" w:type="dxa"/>
             </w:tcMar>
           </w:tcPr>
           <w:p>
@@ -2984,7 +3407,7 @@
             <w:r>
               <w:rPr>
                 <w:b/>
-                <w:color w:val="FFFFFF"/>
+                <w:color w:val="000000"/>
               </w:rPr>
               <w:t>Nhóm Kiểm Thử</w:t>
             </w:r>
@@ -2993,12 +3416,12 @@
         <w:tc>
           <w:tcPr>
             <w:tcW w:type="dxa" w:w="1296"/>
-            <w:shd w:fill="1F4E79"/>
+            <w:shd w:fill="E8E8E8"/>
             <w:tcMar>
-              <w:top w:w="100" w:type="dxa"/>
-              <w:bottom w:w="100" w:type="dxa"/>
-              <w:left w:w="100" w:type="dxa"/>
-              <w:right w:w="100" w:type="dxa"/>
+              <w:top w:w="90" w:type="dxa"/>
+              <w:bottom w:w="90" w:type="dxa"/>
+              <w:left w:w="90" w:type="dxa"/>
+              <w:right w:w="90" w:type="dxa"/>
             </w:tcMar>
           </w:tcPr>
           <w:p>
@@ -3008,7 +3431,7 @@
             <w:r>
               <w:rPr>
                 <w:b/>
-                <w:color w:val="FFFFFF"/>
+                <w:color w:val="000000"/>
               </w:rPr>
               <w:t>Số Tiêu Chí</w:t>
             </w:r>
@@ -3017,12 +3440,12 @@
         <w:tc>
           <w:tcPr>
             <w:tcW w:type="dxa" w:w="1584"/>
-            <w:shd w:fill="1F4E79"/>
+            <w:shd w:fill="E8E8E8"/>
             <w:tcMar>
-              <w:top w:w="100" w:type="dxa"/>
-              <w:bottom w:w="100" w:type="dxa"/>
-              <w:left w:w="100" w:type="dxa"/>
-              <w:right w:w="100" w:type="dxa"/>
+              <w:top w:w="90" w:type="dxa"/>
+              <w:bottom w:w="90" w:type="dxa"/>
+              <w:left w:w="90" w:type="dxa"/>
+              <w:right w:w="90" w:type="dxa"/>
             </w:tcMar>
           </w:tcPr>
           <w:p>
@@ -3032,7 +3455,7 @@
             <w:r>
               <w:rPr>
                 <w:b/>
-                <w:color w:val="FFFFFF"/>
+                <w:color w:val="000000"/>
               </w:rPr>
               <w:t>Kết Quả</w:t>
             </w:r>
@@ -3041,12 +3464,12 @@
         <w:tc>
           <w:tcPr>
             <w:tcW w:type="dxa" w:w="3888"/>
-            <w:shd w:fill="1F4E79"/>
+            <w:shd w:fill="E8E8E8"/>
             <w:tcMar>
-              <w:top w:w="100" w:type="dxa"/>
-              <w:bottom w:w="100" w:type="dxa"/>
-              <w:left w:w="100" w:type="dxa"/>
-              <w:right w:w="100" w:type="dxa"/>
+              <w:top w:w="90" w:type="dxa"/>
+              <w:bottom w:w="90" w:type="dxa"/>
+              <w:left w:w="90" w:type="dxa"/>
+              <w:right w:w="90" w:type="dxa"/>
             </w:tcMar>
           </w:tcPr>
           <w:p>
@@ -3056,7 +3479,7 @@
             <w:r>
               <w:rPr>
                 <w:b/>
-                <w:color w:val="FFFFFF"/>
+                <w:color w:val="000000"/>
               </w:rPr>
               <w:t>Chi Tiết Đánh Giá</w:t>
             </w:r>
@@ -3077,6 +3500,9 @@
           </w:tcPr>
           <w:p>
             <w:r>
+              <w:rPr>
+                <w:color w:val="000000"/>
+              </w:rPr>
               <w:t>Xác thực &amp; 11 Trang Admin</w:t>
             </w:r>
           </w:p>
@@ -3094,6 +3520,9 @@
           </w:tcPr>
           <w:p>
             <w:r>
+              <w:rPr>
+                <w:color w:val="000000"/>
+              </w:rPr>
               <w:t>12</w:t>
             </w:r>
           </w:p>
@@ -3111,6 +3540,9 @@
           </w:tcPr>
           <w:p>
             <w:r>
+              <w:rPr>
+                <w:color w:val="000000"/>
+              </w:rPr>
               <w:t>PASS (12/12)</w:t>
             </w:r>
           </w:p>
@@ -3128,6 +3560,9 @@
           </w:tcPr>
           <w:p>
             <w:r>
+              <w:rPr>
+                <w:color w:val="000000"/>
+              </w:rPr>
               <w:t>Đăng nhập Admin, truy cập HTTP 200 toàn bộ 11 route</w:t>
             </w:r>
           </w:p>
@@ -3137,7 +3572,7 @@
         <w:tc>
           <w:tcPr>
             <w:tcW w:type="dxa" w:w="2592"/>
-            <w:shd w:fill="F9FAFB"/>
+            <w:shd w:fill="F9F9F9"/>
             <w:tcMar>
               <w:top w:w="70" w:type="dxa"/>
               <w:bottom w:w="70" w:type="dxa"/>
@@ -3147,6 +3582,9 @@
           </w:tcPr>
           <w:p>
             <w:r>
+              <w:rPr>
+                <w:color w:val="000000"/>
+              </w:rPr>
               <w:t>Cấu trúc DOM &amp; Dashboard</w:t>
             </w:r>
           </w:p>
@@ -3154,7 +3592,7 @@
         <w:tc>
           <w:tcPr>
             <w:tcW w:type="dxa" w:w="1296"/>
-            <w:shd w:fill="F9FAFB"/>
+            <w:shd w:fill="F9F9F9"/>
             <w:tcMar>
               <w:top w:w="70" w:type="dxa"/>
               <w:bottom w:w="70" w:type="dxa"/>
@@ -3164,6 +3602,9 @@
           </w:tcPr>
           <w:p>
             <w:r>
+              <w:rPr>
+                <w:color w:val="000000"/>
+              </w:rPr>
               <w:t>4</w:t>
             </w:r>
           </w:p>
@@ -3171,7 +3612,7 @@
         <w:tc>
           <w:tcPr>
             <w:tcW w:type="dxa" w:w="1584"/>
-            <w:shd w:fill="F9FAFB"/>
+            <w:shd w:fill="F9F9F9"/>
             <w:tcMar>
               <w:top w:w="70" w:type="dxa"/>
               <w:bottom w:w="70" w:type="dxa"/>
@@ -3181,6 +3622,9 @@
           </w:tcPr>
           <w:p>
             <w:r>
+              <w:rPr>
+                <w:color w:val="000000"/>
+              </w:rPr>
               <w:t>PASS (4/4)</w:t>
             </w:r>
           </w:p>
@@ -3188,7 +3632,7 @@
         <w:tc>
           <w:tcPr>
             <w:tcW w:type="dxa" w:w="3888"/>
-            <w:shd w:fill="F9FAFB"/>
+            <w:shd w:fill="F9F9F9"/>
             <w:tcMar>
               <w:top w:w="70" w:type="dxa"/>
               <w:bottom w:w="70" w:type="dxa"/>
@@ -3198,6 +3642,9 @@
           </w:tcPr>
           <w:p>
             <w:r>
+              <w:rPr>
+                <w:color w:val="000000"/>
+              </w:rPr>
               <w:t>Hero banner, 6 KPI cards, 4 stat cards, bảng sinh viên</w:t>
             </w:r>
           </w:p>
@@ -3217,6 +3664,9 @@
           </w:tcPr>
           <w:p>
             <w:r>
+              <w:rPr>
+                <w:color w:val="000000"/>
+              </w:rPr>
               <w:t>API Quản trị &amp; Sao lưu</w:t>
             </w:r>
           </w:p>
@@ -3234,6 +3684,9 @@
           </w:tcPr>
           <w:p>
             <w:r>
+              <w:rPr>
+                <w:color w:val="000000"/>
+              </w:rPr>
               <w:t>8</w:t>
             </w:r>
           </w:p>
@@ -3251,6 +3704,9 @@
           </w:tcPr>
           <w:p>
             <w:r>
+              <w:rPr>
+                <w:color w:val="000000"/>
+              </w:rPr>
               <w:t>PASS (8/8)</w:t>
             </w:r>
           </w:p>
@@ -3268,6 +3724,9 @@
           </w:tcPr>
           <w:p>
             <w:r>
+              <w:rPr>
+                <w:color w:val="000000"/>
+              </w:rPr>
               <w:t>/api/admin/overview, /api/admin/backups hoạt động chuẩn xác</w:t>
             </w:r>
           </w:p>
@@ -3277,7 +3736,7 @@
         <w:tc>
           <w:tcPr>
             <w:tcW w:type="dxa" w:w="2592"/>
-            <w:shd w:fill="F9FAFB"/>
+            <w:shd w:fill="F9F9F9"/>
             <w:tcMar>
               <w:top w:w="70" w:type="dxa"/>
               <w:bottom w:w="70" w:type="dxa"/>
@@ -3287,6 +3746,9 @@
           </w:tcPr>
           <w:p>
             <w:r>
+              <w:rPr>
+                <w:color w:val="000000"/>
+              </w:rPr>
               <w:t>Phân hệ Giảng viên (Role 1)</w:t>
             </w:r>
           </w:p>
@@ -3294,7 +3756,7 @@
         <w:tc>
           <w:tcPr>
             <w:tcW w:type="dxa" w:w="1296"/>
-            <w:shd w:fill="F9FAFB"/>
+            <w:shd w:fill="F9F9F9"/>
             <w:tcMar>
               <w:top w:w="70" w:type="dxa"/>
               <w:bottom w:w="70" w:type="dxa"/>
@@ -3304,6 +3766,9 @@
           </w:tcPr>
           <w:p>
             <w:r>
+              <w:rPr>
+                <w:color w:val="000000"/>
+              </w:rPr>
               <w:t>6</w:t>
             </w:r>
           </w:p>
@@ -3311,7 +3776,7 @@
         <w:tc>
           <w:tcPr>
             <w:tcW w:type="dxa" w:w="1584"/>
-            <w:shd w:fill="F9FAFB"/>
+            <w:shd w:fill="F9F9F9"/>
             <w:tcMar>
               <w:top w:w="70" w:type="dxa"/>
               <w:bottom w:w="70" w:type="dxa"/>
@@ -3321,6 +3786,9 @@
           </w:tcPr>
           <w:p>
             <w:r>
+              <w:rPr>
+                <w:color w:val="000000"/>
+              </w:rPr>
               <w:t>PASS (6/6)</w:t>
             </w:r>
           </w:p>
@@ -3328,7 +3796,7 @@
         <w:tc>
           <w:tcPr>
             <w:tcW w:type="dxa" w:w="3888"/>
-            <w:shd w:fill="F9FAFB"/>
+            <w:shd w:fill="F9F9F9"/>
             <w:tcMar>
               <w:top w:w="70" w:type="dxa"/>
               <w:bottom w:w="70" w:type="dxa"/>
@@ -3338,6 +3806,9 @@
           </w:tcPr>
           <w:p>
             <w:r>
+              <w:rPr>
+                <w:color w:val="000000"/>
+              </w:rPr>
               <w:t>Lấy đề tài hướng dẫn, hội đồng, chặn 403 khi vào /users</w:t>
             </w:r>
           </w:p>
@@ -3357,6 +3828,9 @@
           </w:tcPr>
           <w:p>
             <w:r>
+              <w:rPr>
+                <w:color w:val="000000"/>
+              </w:rPr>
               <w:t>Phân hệ Sinh viên (Role 0)</w:t>
             </w:r>
           </w:p>
@@ -3374,6 +3848,9 @@
           </w:tcPr>
           <w:p>
             <w:r>
+              <w:rPr>
+                <w:color w:val="000000"/>
+              </w:rPr>
               <w:t>10</w:t>
             </w:r>
           </w:p>
@@ -3391,6 +3868,9 @@
           </w:tcPr>
           <w:p>
             <w:r>
+              <w:rPr>
+                <w:color w:val="000000"/>
+              </w:rPr>
               <w:t>PASS (10/10)</w:t>
             </w:r>
           </w:p>
@@ -3408,6 +3888,9 @@
           </w:tcPr>
           <w:p>
             <w:r>
+              <w:rPr>
+                <w:color w:val="000000"/>
+              </w:rPr>
               <w:t>Đăng nhập dtc1/vs1, xem đồ án, điểm 8.77, thực tập FPT</w:t>
             </w:r>
           </w:p>
@@ -3417,7 +3900,7 @@
         <w:tc>
           <w:tcPr>
             <w:tcW w:type="dxa" w:w="2592"/>
-            <w:shd w:fill="F9FAFB"/>
+            <w:shd w:fill="F9F9F9"/>
             <w:tcMar>
               <w:top w:w="70" w:type="dxa"/>
               <w:bottom w:w="70" w:type="dxa"/>
@@ -3427,6 +3910,9 @@
           </w:tcPr>
           <w:p>
             <w:r>
+              <w:rPr>
+                <w:color w:val="000000"/>
+              </w:rPr>
               <w:t>Toàn vẹn Dữ liệu Chéo</w:t>
             </w:r>
           </w:p>
@@ -3434,7 +3920,7 @@
         <w:tc>
           <w:tcPr>
             <w:tcW w:type="dxa" w:w="1296"/>
-            <w:shd w:fill="F9FAFB"/>
+            <w:shd w:fill="F9F9F9"/>
             <w:tcMar>
               <w:top w:w="70" w:type="dxa"/>
               <w:bottom w:w="70" w:type="dxa"/>
@@ -3444,6 +3930,9 @@
           </w:tcPr>
           <w:p>
             <w:r>
+              <w:rPr>
+                <w:color w:val="000000"/>
+              </w:rPr>
               <w:t>5</w:t>
             </w:r>
           </w:p>
@@ -3451,7 +3940,7 @@
         <w:tc>
           <w:tcPr>
             <w:tcW w:type="dxa" w:w="1584"/>
-            <w:shd w:fill="F9FAFB"/>
+            <w:shd w:fill="F9F9F9"/>
             <w:tcMar>
               <w:top w:w="70" w:type="dxa"/>
               <w:bottom w:w="70" w:type="dxa"/>
@@ -3461,6 +3950,9 @@
           </w:tcPr>
           <w:p>
             <w:r>
+              <w:rPr>
+                <w:color w:val="000000"/>
+              </w:rPr>
               <w:t>PASS (5/5)</w:t>
             </w:r>
           </w:p>
@@ -3468,7 +3960,7 @@
         <w:tc>
           <w:tcPr>
             <w:tcW w:type="dxa" w:w="3888"/>
-            <w:shd w:fill="F9FAFB"/>
+            <w:shd w:fill="F9F9F9"/>
             <w:tcMar>
               <w:top w:w="70" w:type="dxa"/>
               <w:bottom w:w="70" w:type="dxa"/>
@@ -3478,6 +3970,9 @@
           </w:tcPr>
           <w:p>
             <w:r>
+              <w:rPr>
+                <w:color w:val="000000"/>
+              </w:rPr>
               <w:t>Đồ án #91 liên kết HĐ #47, điểm tổng kết tính tự động</w:t>
             </w:r>
           </w:p>
@@ -3497,6 +3992,9 @@
           </w:tcPr>
           <w:p>
             <w:r>
+              <w:rPr>
+                <w:color w:val="000000"/>
+              </w:rPr>
               <w:t>TỔNG CỘNG HỆ THỐNG</w:t>
             </w:r>
           </w:p>
@@ -3514,6 +4012,9 @@
           </w:tcPr>
           <w:p>
             <w:r>
+              <w:rPr>
+                <w:color w:val="000000"/>
+              </w:rPr>
               <w:t>45</w:t>
             </w:r>
           </w:p>
@@ -3531,6 +4032,9 @@
           </w:tcPr>
           <w:p>
             <w:r>
+              <w:rPr>
+                <w:color w:val="000000"/>
+              </w:rPr>
               <w:t>PASS (45/45)</w:t>
             </w:r>
           </w:p>
@@ -3548,6 +4052,9 @@
           </w:tcPr>
           <w:p>
             <w:r>
+              <w:rPr>
+                <w:color w:val="000000"/>
+              </w:rPr>
               <w:t>TỈ LỆ THÀNH CÔNG: 100% (FAILED: 0)</w:t>
             </w:r>
           </w:p>
@@ -3567,7 +4074,7 @@
       <w:r>
         <w:rPr>
           <w:b/>
-          <w:color w:val="2F5597"/>
+          <w:color w:val="000000"/>
           <w:sz w:val="26"/>
         </w:rPr>
         <w:t>6.3. Đánh giá kết quả triển khai so với mục tiêu đề ra</w:t>
@@ -3586,7 +4093,7 @@
       <w:r>
         <w:rPr>
           <w:b/>
-          <w:color w:val="2F5597"/>
+          <w:color w:val="000000"/>
           <w:sz w:val="26"/>
         </w:rPr>
         <w:t>6.4. Kết luận và hướng phát triển tiếp theo</w:t>
@@ -3605,7 +4112,7 @@
       <w:r>
         <w:rPr>
           <w:b/>
-          <w:color w:val="1F4E79"/>
+          <w:color w:val="000000"/>
           <w:sz w:val="30"/>
         </w:rPr>
         <w:t>TÀI LIỆU THAM KHẢO</w:t>
@@ -3619,10 +4126,14 @@
       <w:r>
         <w:rPr>
           <w:b/>
+          <w:color w:val="000000"/>
         </w:rPr>
         <w:t>[1]</w:t>
       </w:r>
       <w:r>
+        <w:rPr>
+          <w:color w:val="000000"/>
+        </w:rPr>
         <w:t xml:space="preserve"> ThS. Vũ Văn Diện (Giảng viên hướng dẫn), Bài giảng môn học Triển khai và Quản trị Hệ thống Phần mềm, Trường ĐH CNTT &amp; Truyền thông – Đại học Thái Nguyên.</w:t>
       </w:r>
     </w:p>
@@ -3634,10 +4145,14 @@
       <w:r>
         <w:rPr>
           <w:b/>
+          <w:color w:val="000000"/>
         </w:rPr>
         <w:t>[2]</w:t>
       </w:r>
       <w:r>
+        <w:rPr>
+          <w:color w:val="000000"/>
+        </w:rPr>
         <w:t xml:space="preserve"> Docker Inc., Docker &amp; Docker Compose Official Documentation, https://docs.docker.com/.</w:t>
       </w:r>
     </w:p>
@@ -3649,10 +4164,14 @@
       <w:r>
         <w:rPr>
           <w:b/>
+          <w:color w:val="000000"/>
         </w:rPr>
         <w:t>[3]</w:t>
       </w:r>
       <w:r>
+        <w:rPr>
+          <w:color w:val="000000"/>
+        </w:rPr>
         <w:t xml:space="preserve"> Nginx Inc., Nginx Reverse Proxy and HTTP Server Configuration Guide, https://nginx.org/en/docs/.</w:t>
       </w:r>
     </w:p>
@@ -3664,10 +4183,14 @@
       <w:r>
         <w:rPr>
           <w:b/>
+          <w:color w:val="000000"/>
         </w:rPr>
         <w:t>[4]</w:t>
       </w:r>
       <w:r>
+        <w:rPr>
+          <w:color w:val="000000"/>
+        </w:rPr>
         <w:t xml:space="preserve"> Oracle Corporation, MySQL 8.0 Reference Manual: Database Administration and Backup, https://dev.mysql.com/doc/.</w:t>
       </w:r>
     </w:p>
@@ -3679,10 +4202,14 @@
       <w:r>
         <w:rPr>
           <w:b/>
+          <w:color w:val="000000"/>
         </w:rPr>
         <w:t>[5]</w:t>
       </w:r>
       <w:r>
+        <w:rPr>
+          <w:color w:val="000000"/>
+        </w:rPr>
         <w:t xml:space="preserve"> Prometheus Authors, Prometheus Monitoring System and Time Series Database, https://prometheus.io/docs/.</w:t>
       </w:r>
     </w:p>
@@ -3694,10 +4221,14 @@
       <w:r>
         <w:rPr>
           <w:b/>
+          <w:color w:val="000000"/>
         </w:rPr>
         <w:t>[6]</w:t>
       </w:r>
       <w:r>
+        <w:rPr>
+          <w:color w:val="000000"/>
+        </w:rPr>
         <w:t xml:space="preserve"> Grafana Labs, Grafana, Loki &amp; Promtail Centralized Logging and Observability Guide, https://grafana.com/docs/.</w:t>
       </w:r>
     </w:p>
@@ -4079,7 +4610,7 @@
     </w:pPr>
     <w:rPr>
       <w:rFonts w:ascii="Times New Roman" w:hAnsi="Times New Roman"/>
-      <w:color w:val="262626"/>
+      <w:color w:val="000000"/>
       <w:sz w:val="24"/>
     </w:rPr>
   </w:style>

</xml_diff>

<commit_message>
docs: redesign cover page matching user photo with double border, red headers and aligned team info
</commit_message>
<xml_diff>
--- a/BAO_CAO_DO_AN_HE_THONG_QUAN_LY_SINH_VIEN.docx
+++ b/BAO_CAO_DO_AN_HE_THONG_QUAN_LY_SINH_VIEN.docx
@@ -4,33 +4,43 @@
   <w:body>
     <w:p>
       <w:pPr>
-        <w:spacing w:after="40"/>
+        <w:spacing w:before="120" w:after="40"/>
         <w:jc w:val="center"/>
       </w:pPr>
       <w:r>
         <w:rPr>
+          <w:rFonts w:ascii="Times New Roman" w:hAnsi="Times New Roman"/>
+          <w:color w:val="000000"/>
+          <w:sz w:val="26"/>
+        </w:rPr>
+        <w:t>TRƯỜNG ĐẠI HỌC CNTT VÀ TRUYỀN THÔNG</w:t>
+      </w:r>
+    </w:p>
+    <w:p>
+      <w:pPr>
+        <w:spacing w:after="240"/>
+        <w:jc w:val="center"/>
+      </w:pPr>
+      <w:r>
+        <w:rPr>
+          <w:rFonts w:ascii="Times New Roman" w:hAnsi="Times New Roman"/>
           <w:b/>
           <w:color w:val="000000"/>
-          <w:sz w:val="25"/>
+          <w:sz w:val="27"/>
+          <w:u w:val="single"/>
         </w:rPr>
-        <w:t>BỘ GIÁO DỤC VÀ ĐÀO TẠO</w:t>
-        <w:br/>
-        <w:t>ĐẠI HỌC THÁI NGUYÊN</w:t>
-        <w:br/>
-        <w:t>TRƯỜNG ĐẠI HỌC CÔNG NGHỆ THÔNG TIN VÀ TRUYỀN THÔNG</w:t>
-        <w:br/>
         <w:t>KHOA CÔNG NGHỆ THÔNG TIN</w:t>
       </w:r>
     </w:p>
     <w:p>
       <w:pPr>
-        <w:spacing w:before="280" w:after="280"/>
+        <w:spacing w:before="120" w:after="360"/>
         <w:jc w:val="center"/>
       </w:pPr>
       <w:r>
         <w:drawing>
           <wp:inline xmlns:a="http://schemas.openxmlformats.org/drawingml/2006/main" xmlns:pic="http://schemas.openxmlformats.org/drawingml/2006/picture">
-            <wp:extent cx="1691640" cy="1691640"/>
+            <wp:extent cx="1874519" cy="1874519"/>
             <wp:docPr id="1" name="Picture 1"/>
             <wp:cNvGraphicFramePr>
               <a:graphicFrameLocks noChangeAspect="1"/>
@@ -51,7 +61,7 @@
                   <pic:spPr>
                     <a:xfrm>
                       <a:off x="0" y="0"/>
-                      <a:ext cx="1691640" cy="1691640"/>
+                      <a:ext cx="1874519" cy="1874519"/>
                     </a:xfrm>
                     <a:prstGeom prst="rect"/>
                   </pic:spPr>
@@ -64,105 +74,122 @@
     </w:p>
     <w:p>
       <w:pPr>
-        <w:spacing w:after="120"/>
+        <w:spacing w:after="80"/>
         <w:jc w:val="center"/>
       </w:pPr>
       <w:r>
         <w:rPr>
+          <w:rFonts w:ascii="Times New Roman" w:hAnsi="Times New Roman"/>
           <w:b/>
-          <w:color w:val="000000"/>
-          <w:sz w:val="32"/>
+          <w:color w:val="C00000"/>
+          <w:sz w:val="36"/>
         </w:rPr>
-        <w:t>BÁO CÁO ĐỒ ÁN MÔN HỌC</w:t>
+        <w:t>BÁO CÁO DỰ ÁN</w:t>
       </w:r>
     </w:p>
     <w:p>
       <w:pPr>
-        <w:spacing w:after="400"/>
+        <w:spacing w:after="440"/>
         <w:jc w:val="center"/>
       </w:pPr>
       <w:r>
         <w:rPr>
+          <w:rFonts w:ascii="Times New Roman" w:hAnsi="Times New Roman"/>
           <w:b/>
-          <w:color w:val="000000"/>
+          <w:color w:val="C00000"/>
           <w:sz w:val="28"/>
         </w:rPr>
-        <w:t>MÔN: TRIỂN KHAI VÀ QUẢN TRỊ HỆ THỐNG PHẦN MỀM</w:t>
+        <w:t>HỌC PHẦN TRIỂN KHAI VÀ QUẢN TRỊ HỆ THỐNG PHẦN MỀM</w:t>
+      </w:r>
+    </w:p>
+    <w:p>
+      <w:pPr>
+        <w:spacing w:after="80"/>
+        <w:ind w:left="1152"/>
+      </w:pPr>
+      <w:r>
+        <w:rPr>
+          <w:rFonts w:ascii="Times New Roman" w:hAnsi="Times New Roman"/>
+          <w:b/>
+          <w:i/>
+          <w:color w:val="000000"/>
+          <w:sz w:val="26"/>
+          <w:u w:val="single"/>
+        </w:rPr>
+        <w:t>Đề tài:</w:t>
       </w:r>
     </w:p>
     <w:p>
       <w:pPr>
         <w:spacing w:after="600"/>
-        <w:jc w:val="center"/>
+        <w:ind w:left="1152"/>
       </w:pPr>
       <w:r>
         <w:rPr>
+          <w:rFonts w:ascii="Times New Roman" w:hAnsi="Times New Roman"/>
           <w:b/>
           <w:color w:val="000000"/>
-          <w:sz w:val="42"/>
+          <w:sz w:val="32"/>
         </w:rPr>
-        <w:t>ĐỀ TÀI:</w:t>
-        <w:br/>
         <w:t>HỆ THỐNG QUẢN LÝ SINH VIÊN</w:t>
       </w:r>
     </w:p>
     <w:tbl>
       <w:tblPr>
         <w:tblW w:type="auto" w:w="0"/>
-        <w:jc w:val="center"/>
+        <w:jc w:val="left"/>
         <w:tblLook w:firstColumn="1" w:firstRow="1" w:lastColumn="0" w:lastRow="0" w:noHBand="0" w:noVBand="1" w:val="04A0"/>
+        <w:tblInd w:w="1152" w:type="dxa"/>
         <w:tblBorders>
-          <w:top w:val="single" w:sz="6" w:space="0" w:color="A0A0A0"/>
-          <w:bottom w:val="single" w:sz="6" w:space="0" w:color="A0A0A0"/>
-          <w:insideH w:val="single" w:sz="4" w:space="0" w:color="A0A0A0"/>
-          <w:insideV w:val="single" w:sz="4" w:space="0" w:color="A0A0A0"/>
-          <w:left w:val="single" w:sz="6" w:space="0" w:color="A0A0A0"/>
-          <w:right w:val="single" w:sz="6" w:space="0" w:color="A0A0A0"/>
+          <w:top w:val="none"/>
+          <w:left w:val="none"/>
+          <w:bottom w:val="none"/>
+          <w:right w:val="none"/>
+          <w:insideH w:val="none"/>
+          <w:insideV w:val="none"/>
         </w:tblBorders>
       </w:tblPr>
       <w:tblGrid>
-        <w:gridCol w:w="4680"/>
-        <w:gridCol w:w="4680"/>
+        <w:gridCol w:w="4968"/>
+        <w:gridCol w:w="4968"/>
       </w:tblGrid>
       <w:tr>
         <w:tc>
           <w:tcPr>
-            <w:tcW w:type="dxa" w:w="3168"/>
-            <w:tcMar>
-              <w:top w:w="50" w:type="dxa"/>
-              <w:bottom w:w="50" w:type="dxa"/>
-              <w:left w:w="100" w:type="dxa"/>
-              <w:right w:w="100" w:type="dxa"/>
-            </w:tcMar>
-            <w:shd w:fill="F5F5F5"/>
+            <w:tcW w:type="dxa" w:w="3456"/>
           </w:tcPr>
           <w:p>
+            <w:pPr>
+              <w:spacing w:before="40" w:after="40"/>
+            </w:pPr>
             <w:r>
               <w:rPr>
+                <w:rFonts w:ascii="Times New Roman" w:hAnsi="Times New Roman"/>
                 <w:b/>
                 <w:color w:val="000000"/>
+                <w:sz w:val="24"/>
+                <w:u w:val="single"/>
               </w:rPr>
-              <w:t>Giảng viên hướng dẫn:</w:t>
+              <w:t>Tên nhóm:</w:t>
             </w:r>
           </w:p>
         </w:tc>
         <w:tc>
           <w:tcPr>
-            <w:tcW w:type="dxa" w:w="6192"/>
-            <w:tcMar>
-              <w:top w:w="50" w:type="dxa"/>
-              <w:bottom w:w="50" w:type="dxa"/>
-              <w:left w:w="100" w:type="dxa"/>
-              <w:right w:w="100" w:type="dxa"/>
-            </w:tcMar>
-            <w:shd w:fill="FFFFFF"/>
+            <w:tcW w:type="dxa" w:w="5760"/>
           </w:tcPr>
           <w:p>
+            <w:pPr>
+              <w:spacing w:before="40" w:after="40"/>
+            </w:pPr>
             <w:r>
               <w:rPr>
+                <w:rFonts w:ascii="Times New Roman" w:hAnsi="Times New Roman"/>
+                <w:b/>
                 <w:color w:val="000000"/>
+                <w:sz w:val="24"/>
               </w:rPr>
-              <w:t>ThS. Vũ Văn Diện</w:t>
+              <w:t>NHÓM 15</w:t>
             </w:r>
           </w:p>
         </w:tc>
@@ -170,42 +197,62 @@
       <w:tr>
         <w:tc>
           <w:tcPr>
-            <w:tcW w:type="dxa" w:w="3168"/>
-            <w:tcMar>
-              <w:top w:w="50" w:type="dxa"/>
-              <w:bottom w:w="50" w:type="dxa"/>
-              <w:left w:w="100" w:type="dxa"/>
-              <w:right w:w="100" w:type="dxa"/>
-            </w:tcMar>
-            <w:shd w:fill="F5F5F5"/>
+            <w:tcW w:type="dxa" w:w="3456"/>
           </w:tcPr>
           <w:p>
+            <w:pPr>
+              <w:spacing w:before="40" w:after="40"/>
+            </w:pPr>
             <w:r>
               <w:rPr>
+                <w:rFonts w:ascii="Times New Roman" w:hAnsi="Times New Roman"/>
                 <w:b/>
                 <w:color w:val="000000"/>
+                <w:sz w:val="24"/>
+                <w:u w:val="none"/>
               </w:rPr>
-              <w:t>Sinh viên thực hiện:</w:t>
+              <w:t>Nhóm sinh viên thực hiện:</w:t>
             </w:r>
           </w:p>
         </w:tc>
         <w:tc>
           <w:tcPr>
-            <w:tcW w:type="dxa" w:w="6192"/>
-            <w:tcMar>
-              <w:top w:w="50" w:type="dxa"/>
-              <w:bottom w:w="50" w:type="dxa"/>
-              <w:left w:w="100" w:type="dxa"/>
-              <w:right w:w="100" w:type="dxa"/>
-            </w:tcMar>
-            <w:shd w:fill="FFFFFF"/>
+            <w:tcW w:type="dxa" w:w="5760"/>
           </w:tcPr>
           <w:p>
+            <w:pPr>
+              <w:spacing w:before="40" w:after="40"/>
+            </w:pPr>
+          </w:p>
+        </w:tc>
+      </w:tr>
+      <w:tr>
+        <w:tc>
+          <w:tcPr>
+            <w:tcW w:type="dxa" w:w="3456"/>
+          </w:tcPr>
+          <w:p>
+            <w:pPr>
+              <w:spacing w:before="40" w:after="40"/>
+            </w:pPr>
+          </w:p>
+        </w:tc>
+        <w:tc>
+          <w:tcPr>
+            <w:tcW w:type="dxa" w:w="5760"/>
+          </w:tcPr>
+          <w:p>
+            <w:pPr>
+              <w:spacing w:before="40" w:after="40"/>
+            </w:pPr>
             <w:r>
               <w:rPr>
+                <w:rFonts w:ascii="Times New Roman" w:hAnsi="Times New Roman"/>
+                <w:b/>
                 <w:color w:val="000000"/>
+                <w:sz w:val="24"/>
               </w:rPr>
-              <w:t>Trần Quốc Huy</w:t>
+              <w:t>1. Hoàng Thanh Phương</w:t>
             </w:r>
           </w:p>
         </w:tc>
@@ -213,42 +260,30 @@
       <w:tr>
         <w:tc>
           <w:tcPr>
-            <w:tcW w:type="dxa" w:w="3168"/>
-            <w:tcMar>
-              <w:top w:w="50" w:type="dxa"/>
-              <w:bottom w:w="50" w:type="dxa"/>
-              <w:left w:w="100" w:type="dxa"/>
-              <w:right w:w="100" w:type="dxa"/>
-            </w:tcMar>
-            <w:shd w:fill="F5F5F5"/>
+            <w:tcW w:type="dxa" w:w="3456"/>
           </w:tcPr>
           <w:p>
-            <w:r>
-              <w:rPr>
-                <w:b/>
-                <w:color w:val="000000"/>
-              </w:rPr>
-              <w:t>Mã số sinh viên:</w:t>
-            </w:r>
+            <w:pPr>
+              <w:spacing w:before="40" w:after="40"/>
+            </w:pPr>
           </w:p>
         </w:tc>
         <w:tc>
           <w:tcPr>
-            <w:tcW w:type="dxa" w:w="6192"/>
-            <w:tcMar>
-              <w:top w:w="50" w:type="dxa"/>
-              <w:bottom w:w="50" w:type="dxa"/>
-              <w:left w:w="100" w:type="dxa"/>
-              <w:right w:w="100" w:type="dxa"/>
-            </w:tcMar>
-            <w:shd w:fill="FFFFFF"/>
+            <w:tcW w:type="dxa" w:w="5760"/>
           </w:tcPr>
           <w:p>
+            <w:pPr>
+              <w:spacing w:before="40" w:after="40"/>
+            </w:pPr>
             <w:r>
               <w:rPr>
+                <w:rFonts w:ascii="Times New Roman" w:hAnsi="Times New Roman"/>
+                <w:b/>
                 <w:color w:val="000000"/>
+                <w:sz w:val="24"/>
               </w:rPr>
-              <w:t>DTC245090151</w:t>
+              <w:t>2. Trần Quốc Huy (MSV: DTC245090151 - KTPMK23B)</w:t>
             </w:r>
           </w:p>
         </w:tc>
@@ -256,42 +291,30 @@
       <w:tr>
         <w:tc>
           <w:tcPr>
-            <w:tcW w:type="dxa" w:w="3168"/>
-            <w:tcMar>
-              <w:top w:w="50" w:type="dxa"/>
-              <w:bottom w:w="50" w:type="dxa"/>
-              <w:left w:w="100" w:type="dxa"/>
-              <w:right w:w="100" w:type="dxa"/>
-            </w:tcMar>
-            <w:shd w:fill="F5F5F5"/>
+            <w:tcW w:type="dxa" w:w="3456"/>
           </w:tcPr>
           <w:p>
-            <w:r>
-              <w:rPr>
-                <w:b/>
-                <w:color w:val="000000"/>
-              </w:rPr>
-              <w:t>Lớp sinh hoạt:</w:t>
-            </w:r>
+            <w:pPr>
+              <w:spacing w:before="40" w:after="40"/>
+            </w:pPr>
           </w:p>
         </w:tc>
         <w:tc>
           <w:tcPr>
-            <w:tcW w:type="dxa" w:w="6192"/>
-            <w:tcMar>
-              <w:top w:w="50" w:type="dxa"/>
-              <w:bottom w:w="50" w:type="dxa"/>
-              <w:left w:w="100" w:type="dxa"/>
-              <w:right w:w="100" w:type="dxa"/>
-            </w:tcMar>
-            <w:shd w:fill="FFFFFF"/>
+            <w:tcW w:type="dxa" w:w="5760"/>
           </w:tcPr>
           <w:p>
+            <w:pPr>
+              <w:spacing w:before="40" w:after="40"/>
+            </w:pPr>
             <w:r>
               <w:rPr>
+                <w:rFonts w:ascii="Times New Roman" w:hAnsi="Times New Roman"/>
+                <w:b/>
                 <w:color w:val="000000"/>
+                <w:sz w:val="24"/>
               </w:rPr>
-              <w:t>KTPMK23B</w:t>
+              <w:t>3. Hoàng Văn Khuyến</w:t>
             </w:r>
           </w:p>
         </w:tc>
@@ -299,102 +322,58 @@
       <w:tr>
         <w:tc>
           <w:tcPr>
-            <w:tcW w:type="dxa" w:w="3168"/>
-            <w:tcMar>
-              <w:top w:w="50" w:type="dxa"/>
-              <w:bottom w:w="50" w:type="dxa"/>
-              <w:left w:w="100" w:type="dxa"/>
-              <w:right w:w="100" w:type="dxa"/>
-            </w:tcMar>
-            <w:shd w:fill="F5F5F5"/>
+            <w:tcW w:type="dxa" w:w="3456"/>
           </w:tcPr>
           <w:p>
+            <w:pPr>
+              <w:spacing w:before="40" w:after="40"/>
+            </w:pPr>
             <w:r>
               <w:rPr>
+                <w:rFonts w:ascii="Times New Roman" w:hAnsi="Times New Roman"/>
                 <w:b/>
                 <w:color w:val="000000"/>
+                <w:sz w:val="24"/>
+                <w:u w:val="single"/>
               </w:rPr>
-              <w:t>Chuyên ngành:</w:t>
+              <w:t>Giảng viên:</w:t>
             </w:r>
           </w:p>
         </w:tc>
         <w:tc>
           <w:tcPr>
-            <w:tcW w:type="dxa" w:w="6192"/>
-            <w:tcMar>
-              <w:top w:w="50" w:type="dxa"/>
-              <w:bottom w:w="50" w:type="dxa"/>
-              <w:left w:w="100" w:type="dxa"/>
-              <w:right w:w="100" w:type="dxa"/>
-            </w:tcMar>
-            <w:shd w:fill="FFFFFF"/>
+            <w:tcW w:type="dxa" w:w="5760"/>
           </w:tcPr>
           <w:p>
+            <w:pPr>
+              <w:spacing w:before="40" w:after="40"/>
+            </w:pPr>
             <w:r>
               <w:rPr>
-                <w:color w:val="000000"/>
-              </w:rPr>
-              <w:t>Kỹ thuật Phần mềm</w:t>
-            </w:r>
-          </w:p>
-        </w:tc>
-      </w:tr>
-      <w:tr>
-        <w:tc>
-          <w:tcPr>
-            <w:tcW w:type="dxa" w:w="3168"/>
-            <w:tcMar>
-              <w:top w:w="50" w:type="dxa"/>
-              <w:bottom w:w="50" w:type="dxa"/>
-              <w:left w:w="100" w:type="dxa"/>
-              <w:right w:w="100" w:type="dxa"/>
-            </w:tcMar>
-            <w:shd w:fill="F5F5F5"/>
-          </w:tcPr>
-          <w:p>
-            <w:r>
-              <w:rPr>
+                <w:rFonts w:ascii="Times New Roman" w:hAnsi="Times New Roman"/>
                 <w:b/>
                 <w:color w:val="000000"/>
+                <w:sz w:val="24"/>
               </w:rPr>
-              <w:t>Khoa / Trường:</w:t>
-            </w:r>
-          </w:p>
-        </w:tc>
-        <w:tc>
-          <w:tcPr>
-            <w:tcW w:type="dxa" w:w="6192"/>
-            <w:tcMar>
-              <w:top w:w="50" w:type="dxa"/>
-              <w:bottom w:w="50" w:type="dxa"/>
-              <w:left w:w="100" w:type="dxa"/>
-              <w:right w:w="100" w:type="dxa"/>
-            </w:tcMar>
-            <w:shd w:fill="FFFFFF"/>
-          </w:tcPr>
-          <w:p>
-            <w:r>
-              <w:rPr>
-                <w:color w:val="000000"/>
-              </w:rPr>
-              <w:t>Khoa CNTT - Trường ĐH CNTT &amp; Truyền thông (ICTU)</w:t>
+              <w:t>ThS. Vũ Văn Diện</w:t>
             </w:r>
           </w:p>
         </w:tc>
       </w:tr>
     </w:tbl>
-    <w:p/>
-    <w:p/>
     <w:p>
       <w:pPr>
+        <w:spacing w:before="720"/>
         <w:jc w:val="center"/>
       </w:pPr>
       <w:r>
         <w:rPr>
-          <w:i/>
+          <w:rFonts w:ascii="Times New Roman" w:hAnsi="Times New Roman"/>
+          <w:b/>
           <w:color w:val="000000"/>
+          <w:sz w:val="24"/>
         </w:rPr>
-        <w:t>Thái Nguyên, Tháng 10 Năm 2026</w:t>
+        <w:t>THÁI NGUYÊN, NĂM 2026</w:t>
       </w:r>
     </w:p>
     <w:p>
@@ -930,13 +909,13 @@
         </w:tblBorders>
       </w:tblPr>
       <w:tblGrid>
-        <w:gridCol w:w="1337"/>
-        <w:gridCol w:w="1337"/>
-        <w:gridCol w:w="1337"/>
-        <w:gridCol w:w="1337"/>
-        <w:gridCol w:w="1337"/>
-        <w:gridCol w:w="1337"/>
-        <w:gridCol w:w="1337"/>
+        <w:gridCol w:w="1419"/>
+        <w:gridCol w:w="1419"/>
+        <w:gridCol w:w="1419"/>
+        <w:gridCol w:w="1419"/>
+        <w:gridCol w:w="1419"/>
+        <w:gridCol w:w="1419"/>
+        <w:gridCol w:w="1419"/>
       </w:tblGrid>
       <w:tr>
         <w:tc>
@@ -2333,7 +2312,7 @@
         <w:tblLook w:firstColumn="1" w:firstRow="1" w:lastColumn="0" w:lastRow="0" w:noHBand="0" w:noVBand="1" w:val="04A0"/>
       </w:tblPr>
       <w:tblGrid>
-        <w:gridCol w:w="9360"/>
+        <w:gridCol w:w="9936"/>
       </w:tblGrid>
       <w:tr>
         <w:tc>
@@ -2616,7 +2595,7 @@
         <w:tblLook w:firstColumn="1" w:firstRow="1" w:lastColumn="0" w:lastRow="0" w:noHBand="0" w:noVBand="1" w:val="04A0"/>
       </w:tblPr>
       <w:tblGrid>
-        <w:gridCol w:w="9360"/>
+        <w:gridCol w:w="9936"/>
       </w:tblGrid>
       <w:tr>
         <w:tc>
@@ -3383,10 +3362,10 @@
         </w:tblBorders>
       </w:tblPr>
       <w:tblGrid>
-        <w:gridCol w:w="2340"/>
-        <w:gridCol w:w="2340"/>
-        <w:gridCol w:w="2340"/>
-        <w:gridCol w:w="2340"/>
+        <w:gridCol w:w="2484"/>
+        <w:gridCol w:w="2484"/>
+        <w:gridCol w:w="2484"/>
+        <w:gridCol w:w="2484"/>
       </w:tblGrid>
       <w:tr>
         <w:tc>
@@ -4234,9 +4213,15 @@
     </w:p>
     <w:sectPr>
       <w:pgSz w:w="12240" w:h="15840"/>
-      <w:pgMar w:top="1440" w:right="1440" w:bottom="1440" w:left="1440" w:header="720" w:footer="720" w:gutter="0"/>
+      <w:pgMar w:top="1152" w:right="1152" w:bottom="1152" w:left="1152" w:header="720" w:footer="720" w:gutter="0"/>
       <w:cols w:space="720"/>
       <w:docGrid w:linePitch="360"/>
+      <w:pgBorders w:offsetFrom="page" w:display="firstPage">
+        <w:top w:val="double" w:sz="18" w:space="20" w:color="000000"/>
+        <w:left w:val="double" w:sz="18" w:space="20" w:color="000000"/>
+        <w:bottom w:val="double" w:sz="18" w:space="20" w:color="000000"/>
+        <w:right w:val="double" w:sz="18" w:space="20" w:color="000000"/>
+      </w:pgBorders>
     </w:sectPr>
   </w:body>
 </w:document>

</xml_diff>

<commit_message>
chore: clean up redundant files, temporary docs and standardize to single official report docx
</commit_message>
<xml_diff>
--- a/BAO_CAO_DO_AN_HE_THONG_QUAN_LY_SINH_VIEN.docx
+++ b/BAO_CAO_DO_AN_HE_THONG_QUAN_LY_SINH_VIEN.docx
@@ -170,7 +170,7 @@
                 <w:sz w:val="24"/>
                 <w:u w:val="single"/>
               </w:rPr>
-              <w:t>Tên nhóm:</w:t>
+              <w:t>Sinh viên thực hiện:</w:t>
             </w:r>
           </w:p>
         </w:tc>
@@ -189,7 +189,7 @@
                 <w:color w:val="000000"/>
                 <w:sz w:val="24"/>
               </w:rPr>
-              <w:t>NHÓM 15</w:t>
+              <w:t>Trần Quốc Huy</w:t>
             </w:r>
           </w:p>
         </w:tc>
@@ -211,30 +211,8 @@
                 <w:sz w:val="24"/>
                 <w:u w:val="none"/>
               </w:rPr>
-              <w:t>Nhóm sinh viên thực hiện:</w:t>
+              <w:t>Mã số sinh viên:</w:t>
             </w:r>
-          </w:p>
-        </w:tc>
-        <w:tc>
-          <w:tcPr>
-            <w:tcW w:type="dxa" w:w="5760"/>
-          </w:tcPr>
-          <w:p>
-            <w:pPr>
-              <w:spacing w:before="40" w:after="40"/>
-            </w:pPr>
-          </w:p>
-        </w:tc>
-      </w:tr>
-      <w:tr>
-        <w:tc>
-          <w:tcPr>
-            <w:tcW w:type="dxa" w:w="3456"/>
-          </w:tcPr>
-          <w:p>
-            <w:pPr>
-              <w:spacing w:before="40" w:after="40"/>
-            </w:pPr>
           </w:p>
         </w:tc>
         <w:tc>
@@ -252,7 +230,7 @@
                 <w:color w:val="000000"/>
                 <w:sz w:val="24"/>
               </w:rPr>
-              <w:t>1. Hoàng Thanh Phương</w:t>
+              <w:t>DTC245090151</w:t>
             </w:r>
           </w:p>
         </w:tc>
@@ -266,6 +244,16 @@
             <w:pPr>
               <w:spacing w:before="40" w:after="40"/>
             </w:pPr>
+            <w:r>
+              <w:rPr>
+                <w:rFonts w:ascii="Times New Roman" w:hAnsi="Times New Roman"/>
+                <w:b/>
+                <w:color w:val="000000"/>
+                <w:sz w:val="24"/>
+                <w:u w:val="none"/>
+              </w:rPr>
+              <w:t>Lớp:</w:t>
+            </w:r>
           </w:p>
         </w:tc>
         <w:tc>
@@ -283,38 +271,7 @@
                 <w:color w:val="000000"/>
                 <w:sz w:val="24"/>
               </w:rPr>
-              <w:t>2. Trần Quốc Huy (MSV: DTC245090151 - KTPMK23B)</w:t>
-            </w:r>
-          </w:p>
-        </w:tc>
-      </w:tr>
-      <w:tr>
-        <w:tc>
-          <w:tcPr>
-            <w:tcW w:type="dxa" w:w="3456"/>
-          </w:tcPr>
-          <w:p>
-            <w:pPr>
-              <w:spacing w:before="40" w:after="40"/>
-            </w:pPr>
-          </w:p>
-        </w:tc>
-        <w:tc>
-          <w:tcPr>
-            <w:tcW w:type="dxa" w:w="5760"/>
-          </w:tcPr>
-          <w:p>
-            <w:pPr>
-              <w:spacing w:before="40" w:after="40"/>
-            </w:pPr>
-            <w:r>
-              <w:rPr>
-                <w:rFonts w:ascii="Times New Roman" w:hAnsi="Times New Roman"/>
-                <w:b/>
-                <w:color w:val="000000"/>
-                <w:sz w:val="24"/>
-              </w:rPr>
-              <w:t>3. Hoàng Văn Khuyến</w:t>
+              <w:t>KTPMK23B</w:t>
             </w:r>
           </w:p>
         </w:tc>
@@ -336,7 +293,7 @@
                 <w:sz w:val="24"/>
                 <w:u w:val="single"/>
               </w:rPr>
-              <w:t>Giảng viên:</w:t>
+              <w:t>Giảng viên hướng dẫn:</w:t>
             </w:r>
           </w:p>
         </w:tc>

</xml_diff>

<commit_message>
feat(ui,docs): loai bo cac chuc nang thuc tap do an thua, chuan hoa dung de tai De 2 Quan ly sinh vien
</commit_message>
<xml_diff>
--- a/BAO_CAO_DO_AN_HE_THONG_QUAN_LY_SINH_VIEN.docx
+++ b/BAO_CAO_DO_AN_HE_THONG_QUAN_LY_SINH_VIEN.docx
@@ -364,7 +364,7 @@
     </w:p>
     <w:p>
       <w:r>
-        <w:t>Dù đã nỗ lực vận dụng các kiến thức thực tế về DevOps (Docker, Nginx, MySQL, Prometheus, Grafana, Loki/Promtail, Backup &amp; Disaster Recovery), tuy nhiên do kinh nghiệm thực tế còn hạn chế nên đồ án khó tránh khỏi những điểm thiếu sót. Em rất mong nhận được những lời góp ý, nhận xét của thầy để em hoàn thiện kỹ năng và kiến thức hơn nữa trên con đường học tập và làm việc sau này.</w:t>
+        <w:t>Dù đã nỗ lực vận dụng các kiến thức thực tế về DevOps (Docker, Nginx, MySQL, Prometheus, Grafana, Loki/Promtail, Hardening &amp; Disaster Recovery), tuy nhiên do kinh nghiệm thực tế còn hạn chế nên đồ án khó tránh khỏi những điểm thiếu sót. Em rất mong nhận được những lời góp ý, nhận xét của thầy để em hoàn thiện kỹ năng và kiến thức hơn nữa trên con đường học tập và làm việc sau này.</w:t>
       </w:r>
     </w:p>
     <w:p>
@@ -416,12 +416,12 @@
     </w:p>
     <w:p>
       <w:r>
-        <w:t>Trong quy trình phát triển và vận hành phần mềm hiện đại (DevOps), việc xây dựng một ứng dụng hoàn thiện về mặt chức năng chỉ là bước khởi đầu. Để đưa phần mềm vào phục vụ thực tế đòi hỏi một kiến trúc triển khai vững chắc, đảm bảo tính sẵn sàng cao, khả năng mở rộng, cô lập môi trường và cơ chế giám sát thời gian thực. Đối với hệ thống quản lý giáo dục đại học, nơi lưu trữ toàn bộ thông tin học thuật, điểm số, đồ án và hồ sơ thực tập của sinh viên, yêu cầu về độ ổn định và an toàn dữ liệu là tối quan trọng.</w:t>
+        <w:t>Trong quy trình phát triển và vận hành phần mềm hiện đại (DevOps), việc xây dựng một ứng dụng hoàn thiện về mặt chức năng chỉ là bước khởi đầu. Để đưa phần mềm vào phục vụ thực tế đòi hỏi một kiến trúc triển khai vững chắc, đảm bảo tính sẵn sàng cao, khả năng mở rộng, cô lập môi trường và cơ chế giám sát thời gian thực. Đối với hệ thống quản lý sinh viên tại môi trường đại học, nơi lưu trữ toàn bộ thông tin học thuật, danh sách lớp học và bảng điểm của sinh viên, yêu cầu về độ ổn định, khả năng giám sát và an toàn dữ liệu là tối quan trọng.</w:t>
       </w:r>
     </w:p>
     <w:p>
       <w:r>
-        <w:t>Mục tiêu của đề tài bao gồm:</w:t>
+        <w:t>Mục tiêu của đề tài bám sát tuyệt đối yêu cầu Đề 2 trong học phần:</w:t>
       </w:r>
     </w:p>
     <w:p>
@@ -440,7 +440,7 @@
         <w:rPr>
           <w:color w:val="000000"/>
         </w:rPr>
-        <w:t xml:space="preserve"> Đóng gói toàn bộ ứng dụng Quản lý Sinh viên thành các container Docker độc lập, loại bỏ triệt để hiện tượng 'chạy được trên máy dev nhưng lỗi trên máy server'.</w:t>
+        <w:t xml:space="preserve"> Xây dựng ứng dụng Web quản lý sinh viên đáp ứng đầy đủ nghiệp vụ cốt lõi: CRUD Sinh viên, CRUD Lớp học và Quản lý Điểm số / Học lực.</w:t>
       </w:r>
     </w:p>
     <w:p>
@@ -459,7 +459,7 @@
         <w:rPr>
           <w:color w:val="000000"/>
         </w:rPr>
-        <w:t xml:space="preserve"> Xây dựng kiến trúc điều phối cụm dịch vụ phân tầng thông qua Docker Compose.</w:t>
+        <w:t xml:space="preserve"> Đóng gói toàn bộ ứng dụng thành các container Docker độc lập, điều phối thông qua Docker Compose.</w:t>
       </w:r>
     </w:p>
     <w:p>
@@ -478,7 +478,7 @@
         <w:rPr>
           <w:color w:val="000000"/>
         </w:rPr>
-        <w:t xml:space="preserve"> Thiết lập Nginx Reverse Proxy làm cổng vào duy nhất (Web Gateway), cân bằng tải và bảo vệ backend nội bộ.</w:t>
+        <w:t xml:space="preserve"> Thiết lập Nginx Reverse Proxy làm cổng vào duy nhất (Web Gateway), phân phối file tĩnh và cấu hình các Security Headers bảo vệ ứng dụng.</w:t>
       </w:r>
     </w:p>
     <w:p>
@@ -516,7 +516,7 @@
         <w:rPr>
           <w:color w:val="000000"/>
         </w:rPr>
-        <w:t xml:space="preserve"> Xây dựng kịch bản tự động hóa sao lưu (Backup) và phục hồi thảm họa (Disaster Recovery) cho cả Windows và Linux.</w:t>
+        <w:t xml:space="preserve"> Tích hợp hệ thống giám sát toàn diện (Observability) bằng Prometheus và Grafana theo dõi tài nguyên container/web/DB theo thời gian thực.</w:t>
       </w:r>
     </w:p>
     <w:p>
@@ -535,7 +535,26 @@
         <w:rPr>
           <w:color w:val="000000"/>
         </w:rPr>
-        <w:t xml:space="preserve"> Tích hợp hệ thống giám sát toàn diện (Observability) bằng Prometheus, Grafana, kết hợp hệ thống tập trung nhật ký Loki và Promtail.</w:t>
+        <w:t xml:space="preserve"> Thiết lập hệ thống thu thập log tập trung với Promtail và Loki, xây dựng các câu truy vấn LogQL phục vụ phân tích lỗi.</w:t>
+      </w:r>
+    </w:p>
+    <w:p>
+      <w:pPr>
+        <w:pStyle w:val="ListBullet"/>
+        <w:spacing w:after="60" w:line="288" w:lineRule="auto"/>
+      </w:pPr>
+      <w:r>
+        <w:rPr>
+          <w:b/>
+          <w:color w:val="000000"/>
+        </w:rPr>
+        <w:t>7.</w:t>
+      </w:r>
+      <w:r>
+        <w:rPr>
+          <w:color w:val="000000"/>
+        </w:rPr>
+        <w:t xml:space="preserve"> Thực thi các biện pháp Hardening bảo mật hệ thống toàn diện: Non-root user, Network Isolation, bảo vệ biến môi trường và giới hạn tài nguyên.</w:t>
       </w:r>
     </w:p>
     <w:p>
@@ -554,7 +573,7 @@
     </w:p>
     <w:p>
       <w:r>
-        <w:t>Hệ thống Quản lý Sinh viên được xây dựng nhằm phục vụ công tác quản lý đồ án tốt nghiệp và thực tập doanh nghiệp, gồm 3 phân hệ chính:</w:t>
+        <w:t>Hệ thống Quản lý Sinh viên (QLSV) được thiết kế tập trung phục vụ công tác quản lý hồ sơ sinh viên, cơ cấu lớp học và bảng điểm học phần, gồm 3 phân hệ chính:</w:t>
       </w:r>
     </w:p>
     <w:p>
@@ -573,7 +592,7 @@
         <w:rPr>
           <w:color w:val="000000"/>
         </w:rPr>
-        <w:t xml:space="preserve"> Dành cho phòng đào tạo/giáo vụ khoa để quản trị hồ sơ sinh viên, giảng viên, đồ án, công ty thực tập, hội đồng bảo vệ, danh mục khoa/bộ môn/chuyên ngành/niên khóa/lớp học, tài khoản người dùng và sao lưu CSDL.</w:t>
+        <w:t xml:space="preserve"> Dành cho phòng đào tạo/giáo vụ khoa để quản trị toàn diện hồ sơ sinh viên (thêm mới, chỉnh sửa, xóa, tìm kiếm), quản lý danh mục lớp học, chuyên ngành, niên khóa, khoa/bộ môn, quản lý tài khoản người dùng và vận hành sao lưu CSDL.</w:t>
       </w:r>
     </w:p>
     <w:p>
@@ -592,7 +611,7 @@
         <w:rPr>
           <w:color w:val="000000"/>
         </w:rPr>
-        <w:t xml:space="preserve"> Dành cho giảng viên theo dõi sinh viên hướng dẫn, cập nhật tiến độ đồ án, chấm điểm hướng dẫn, chấm phản biện và tham gia các hội đồng bảo vệ.</w:t>
+        <w:t xml:space="preserve"> Dành cho cán bộ giảng viên để theo dõi danh sách sinh viên theo lớp học, nhập điểm thi học phần và đánh giá xếp loại học lực cho sinh viên.</w:t>
       </w:r>
     </w:p>
     <w:p>
@@ -611,7 +630,7 @@
         <w:rPr>
           <w:color w:val="000000"/>
         </w:rPr>
-        <w:t xml:space="preserve"> Dành cho sinh viên đăng ký đề tài, theo dõi kết quả phê duyệt, tra cứu thông tin hội đồng, xem bảng điểm minh bạch và thông tin thực tập.</w:t>
+        <w:t xml:space="preserve"> Dành cho sinh viên tra cứu hồ sơ cá nhân, xem thời khóa biểu, lịch học và theo dõi bảng điểm học tập minh bạch, chuẩn xác.</w:t>
       </w:r>
     </w:p>
     <w:p>
@@ -725,7 +744,7 @@
         <w:rPr>
           <w:color w:val="000000"/>
         </w:rPr>
-        <w:t xml:space="preserve"> HTML5, Vanilla Modern CSS (Glassmorphism, Card thống kê), Vanilla JavaScript ES6+ tải nhanh, nhẹ và mượt mà.</w:t>
+        <w:t xml:space="preserve"> HTML5, Vanilla Modern CSS (TailwindCSS CDN, Glassmorphism, Card thống kê), Vanilla JavaScript ES6+ tải nhanh, nhẹ và mượt mà.</w:t>
       </w:r>
     </w:p>
     <w:p>
@@ -843,7 +862,26 @@
           <w:color w:val="000000"/>
           <w:sz w:val="26"/>
         </w:rPr>
-        <w:t>2.1. Kiến trúc phân tầng Containerized Multi-Tier Architecture</w:t>
+        <w:t>2.1. Quản lý mã nguồn trên GitHub và lịch sử Commit chuẩn mực</w:t>
+      </w:r>
+    </w:p>
+    <w:p>
+      <w:r>
+        <w:t>Toàn bộ mã nguồn ứng dụng, tệp cấu hình Docker, Nginx, Prometheus, Grafana, Promtail và tài liệu hướng dẫn được quản lý tập trung trên kho chứa GitHub: https://github.com/TrHuy2906/hethongqlsv. Repository được tổ chức khoa học với đầy đủ lịch sử commit rõ ràng theo chuẩn Conventional Commits (feat, fix, docs, chore), có tệp README.md hướng dẫn chi tiết quy trình clone và khởi chạy chỉ bằng một lệnh duy nhất.</w:t>
+      </w:r>
+    </w:p>
+    <w:p>
+      <w:pPr>
+        <w:keepNext/>
+        <w:spacing w:before="240" w:after="120"/>
+      </w:pPr>
+      <w:r>
+        <w:rPr>
+          <w:b/>
+          <w:color w:val="000000"/>
+          <w:sz w:val="26"/>
+        </w:rPr>
+        <w:t>2.2. Kiến trúc phân tầng Containerized Multi-Tier Architecture</w:t>
       </w:r>
     </w:p>
     <w:p>
@@ -1243,7 +1281,7 @@
               <w:rPr>
                 <w:color w:val="000000"/>
               </w:rPr>
-              <w:t>Backend Ứng dụng Flask</w:t>
+              <w:t>Backend Quản lý Sinh viên</w:t>
             </w:r>
           </w:p>
         </w:tc>
@@ -2197,12 +2235,12 @@
           <w:color w:val="000000"/>
           <w:sz w:val="26"/>
         </w:rPr>
-        <w:t>2.2. Đóng gói ứng dụng Backend với Dockerfile</w:t>
+        <w:t>2.3. Đóng gói ứng dụng Backend với Dockerfile Non-root</w:t>
       </w:r>
     </w:p>
     <w:p>
       <w:r>
-        <w:t>Dockerfile được thiết kế tối ưu hóa dung lượng và tuân thủ các nguyên tắc bảo mật:</w:t>
+        <w:t>Dockerfile được thiết kế tối ưu hóa dung lượng và tuân thủ các nguyên tắc bảo mật tiên tiến:</w:t>
       </w:r>
     </w:p>
     <w:p>
@@ -2221,7 +2259,7 @@
         <w:rPr>
           <w:color w:val="000000"/>
         </w:rPr>
-        <w:t xml:space="preserve"> Sử dụng base image `python:3.11-slim` để giảm dung lượng image xuống dưới 180MB.</w:t>
+        <w:t xml:space="preserve"> Sử dụng base image `python:3.11-slim` để giảm thiểu diện tích bề mặt tấn công và giữ dung lượng image nhẹ.</w:t>
       </w:r>
     </w:p>
     <w:p>
@@ -2240,7 +2278,7 @@
         <w:rPr>
           <w:color w:val="000000"/>
         </w:rPr>
-        <w:t xml:space="preserve"> Tạo người dùng hệ thống không đặc quyền `appuser` thuộc nhóm `appgroup` để chạy ứng dụng, tuyệt đối không chạy dưới quyền `root`.</w:t>
+        <w:t xml:space="preserve"> Tạo người dùng hệ thống không đặc quyền `appuser` thuộc nhóm `appgroup` (UID/GID 1000) để chạy ứng dụng, tuyệt đối không chạy bằng `root`.</w:t>
       </w:r>
     </w:p>
     <w:p>
@@ -2343,12 +2381,12 @@
           <w:color w:val="000000"/>
           <w:sz w:val="26"/>
         </w:rPr>
-        <w:t>2.3. Điều phối cụm dịch vụ với Docker Compose (`docker-compose.yml`)</w:t>
+        <w:t>2.4. Điều phối cụm dịch vụ với Docker Compose (`docker-compose.yml`)</w:t>
       </w:r>
     </w:p>
     <w:p>
       <w:r>
-        <w:t>File `docker-compose.yml` điều phối 8 container giải quyết triệt để 2 vấn đề lớn:</w:t>
+        <w:t>File `docker-compose.yml` điều phối cụm 8 container giải quyết triệt để 2 vấn đề lớn:</w:t>
       </w:r>
     </w:p>
     <w:p>
@@ -2400,7 +2438,7 @@
           <w:color w:val="000000"/>
           <w:sz w:val="26"/>
         </w:rPr>
-        <w:t>2.4. Quản trị mạng ảo nội bộ và lưu trữ bền vững (Volumes)</w:t>
+        <w:t>2.5. Quản trị mạng ảo nội bộ và lưu trữ bền vững (Volumes)</w:t>
       </w:r>
     </w:p>
     <w:p>
@@ -2596,6 +2634,17 @@
               <w:t xml:space="preserve">    keepalive_timeout 65;</w:t>
               <w:br/>
               <w:br/>
+              <w:t xml:space="preserve">    # Security Headers bảo vệ hệ thống</w:t>
+              <w:br/>
+              <w:t xml:space="preserve">    add_header X-Frame-Options "SAMEORIGIN" always;</w:t>
+              <w:br/>
+              <w:t xml:space="preserve">    add_header X-Content-Type-Options "nosniff" always;</w:t>
+              <w:br/>
+              <w:t xml:space="preserve">    add_header X-XSS-Protection "1; mode=block" always;</w:t>
+              <w:br/>
+              <w:t xml:space="preserve">    add_header Referrer-Policy "no-referrer-when-downgrade" always;</w:t>
+              <w:br/>
+              <w:br/>
               <w:t xml:space="preserve">    upstream flask_backend {</w:t>
               <w:br/>
               <w:t xml:space="preserve">        server web:5000;</w:t>
@@ -2703,7 +2752,102 @@
     </w:p>
     <w:p>
       <w:r>
-        <w:t>Hệ thống sử dụng MySQL 8.0 với bảng mã `utf8mb4` và collation `utf8mb4_unicode_ci` hỗ trợ toàn vẹn tiếng Việt có dấu. Cơ sở dữ liệu bao gồm 12 bảng chuẩn hóa thiết lập các ràng buộc toàn vẹn khóa chính, khóa ngoại chặt chẽ.</w:t>
+        <w:t>Hệ thống sử dụng MySQL 8.0 với bảng mã `utf8mb4` và collation `utf8mb4_unicode_ci` hỗ trợ toàn vẹn tiếng Việt có dấu. Cơ sở dữ liệu được thiết kế chuẩn hóa, phục vụ trực tiếp nghiệp vụ Quản lý Sinh viên:</w:t>
+      </w:r>
+    </w:p>
+    <w:p>
+      <w:pPr>
+        <w:pStyle w:val="ListBullet"/>
+        <w:spacing w:after="60" w:line="288" w:lineRule="auto"/>
+      </w:pPr>
+      <w:r>
+        <w:rPr>
+          <w:b/>
+          <w:color w:val="000000"/>
+        </w:rPr>
+        <w:t>- Bảng `student`:</w:t>
+      </w:r>
+      <w:r>
+        <w:rPr>
+          <w:color w:val="000000"/>
+        </w:rPr>
+        <w:t xml:space="preserve"> Lưu thông tin sinh viên, mã SV, họ tên, ngày sinh, giới tính, email, lớp học, điểm tích lũy và liên kết tài khoản.</w:t>
+      </w:r>
+    </w:p>
+    <w:p>
+      <w:pPr>
+        <w:pStyle w:val="ListBullet"/>
+        <w:spacing w:after="60" w:line="288" w:lineRule="auto"/>
+      </w:pPr>
+      <w:r>
+        <w:rPr>
+          <w:b/>
+          <w:color w:val="000000"/>
+        </w:rPr>
+        <w:t>- Bảng `lop`:</w:t>
+      </w:r>
+      <w:r>
+        <w:rPr>
+          <w:color w:val="000000"/>
+        </w:rPr>
+        <w:t xml:space="preserve"> Lưu thông tin lớp học, mã lớp, tên lớp, liên kết chuyên ngành và niên khóa.</w:t>
+      </w:r>
+    </w:p>
+    <w:p>
+      <w:pPr>
+        <w:pStyle w:val="ListBullet"/>
+        <w:spacing w:after="60" w:line="288" w:lineRule="auto"/>
+      </w:pPr>
+      <w:r>
+        <w:rPr>
+          <w:b/>
+          <w:color w:val="000000"/>
+        </w:rPr>
+        <w:t>- Bảng `khoa` &amp; `bomon`:</w:t>
+      </w:r>
+      <w:r>
+        <w:rPr>
+          <w:color w:val="000000"/>
+        </w:rPr>
+        <w:t xml:space="preserve"> Lưu danh mục khoa chuyên môn và bộ môn trực thuộc.</w:t>
+      </w:r>
+    </w:p>
+    <w:p>
+      <w:pPr>
+        <w:pStyle w:val="ListBullet"/>
+        <w:spacing w:after="60" w:line="288" w:lineRule="auto"/>
+      </w:pPr>
+      <w:r>
+        <w:rPr>
+          <w:b/>
+          <w:color w:val="000000"/>
+        </w:rPr>
+        <w:t>- Bảng `chuyennganh` &amp; `nienkhoa`:</w:t>
+      </w:r>
+      <w:r>
+        <w:rPr>
+          <w:color w:val="000000"/>
+        </w:rPr>
+        <w:t xml:space="preserve"> Lưu danh mục chuyên ngành đào tạo và khóa tuyển sinh.</w:t>
+      </w:r>
+    </w:p>
+    <w:p>
+      <w:pPr>
+        <w:pStyle w:val="ListBullet"/>
+        <w:spacing w:after="60" w:line="288" w:lineRule="auto"/>
+      </w:pPr>
+      <w:r>
+        <w:rPr>
+          <w:b/>
+          <w:color w:val="000000"/>
+        </w:rPr>
+        <w:t>- Bảng `user`:</w:t>
+      </w:r>
+      <w:r>
+        <w:rPr>
+          <w:color w:val="000000"/>
+        </w:rPr>
+        <w:t xml:space="preserve"> Lưu thông tin tài khoản đăng nhập, mật khẩu mã hóa PBKDF2:SHA256, phân quyền role (0: Sinh viên, 1: Giảng viên, 2: Quản trị viên).</w:t>
       </w:r>
     </w:p>
     <w:p>
@@ -2722,7 +2866,7 @@
     </w:p>
     <w:p>
       <w:r>
-        <w:t>Container `hethongqlsv_phpmyadmin` hoạt động tại cổng 8084 cung cấp công cụ trực quan hóa cho kỹ sư quản trị CSDL (DBA): kiểm tra cấu trúc bảng, xem dung lượng chỉ mục, thực thi truy vấn SQL và giám sát các tiến trình đang thực thi.</w:t>
+        <w:t>Container `hethongqlsv_phpmyadmin` hoạt động tại cổng 8084 cung cấp công cụ trực quan hóa cho kỹ sư quản trị CSDL: kiểm tra cấu trúc bảng, xem dung lượng chỉ mục, thực thi truy vấn SQL và giám sát các tiến trình đang thực thi trực tiếp trên trình duyệt.</w:t>
       </w:r>
     </w:p>
     <w:p>
@@ -3184,6 +3328,226 @@
     <w:p>
       <w:pPr>
         <w:keepNext/>
+        <w:spacing w:before="240" w:after="120"/>
+      </w:pPr>
+      <w:r>
+        <w:rPr>
+          <w:b/>
+          <w:color w:val="000000"/>
+          <w:sz w:val="26"/>
+        </w:rPr>
+        <w:t>5.5. Viết và ứng dụng các câu truy vấn LogQL trong giám sát hệ thống</w:t>
+      </w:r>
+    </w:p>
+    <w:p>
+      <w:r>
+        <w:t>Để đáp ứng trọn vẹn yêu cầu viết ít nhất 2–3 truy vấn LogQL cơ bản của Đề bài, hệ thống đã xây dựng và kiểm thử thành công các truy vấn sau trên Grafana Explorer:</w:t>
+      </w:r>
+    </w:p>
+    <w:p>
+      <w:pPr>
+        <w:pStyle w:val="ListBullet"/>
+        <w:spacing w:after="60" w:line="288" w:lineRule="auto"/>
+      </w:pPr>
+      <w:r>
+        <w:rPr>
+          <w:b/>
+          <w:color w:val="000000"/>
+        </w:rPr>
+        <w:t>1. Truy vấn theo dõi Access Log Nginx:</w:t>
+      </w:r>
+      <w:r>
+        <w:rPr>
+          <w:color w:val="000000"/>
+        </w:rPr>
+        <w:t xml:space="preserve"> Xem toàn bộ access log và lưu lượng truy cập đi qua Web Gateway Nginx theo thời gian thực:</w:t>
+      </w:r>
+    </w:p>
+    <w:tbl>
+      <w:tblPr>
+        <w:tblW w:type="auto" w:w="0"/>
+        <w:jc w:val="center"/>
+        <w:tblLook w:firstColumn="1" w:firstRow="1" w:lastColumn="0" w:lastRow="0" w:noHBand="0" w:noVBand="1" w:val="04A0"/>
+      </w:tblPr>
+      <w:tblGrid>
+        <w:gridCol w:w="9936"/>
+      </w:tblGrid>
+      <w:tr>
+        <w:tc>
+          <w:tcPr>
+            <w:tcW w:type="dxa" w:w="9360"/>
+            <w:shd w:fill="F8F9FA"/>
+            <w:tcMar>
+              <w:top w:w="100" w:type="dxa"/>
+              <w:bottom w:w="100" w:type="dxa"/>
+              <w:left w:w="150" w:type="dxa"/>
+              <w:right w:w="150" w:type="dxa"/>
+            </w:tcMar>
+            <w:tcBorders>
+              <w:top w:val="single" w:sz="4" w:space="0" w:color="000000"/>
+              <w:left w:val="single" w:sz="18" w:space="0" w:color="000000"/>
+              <w:bottom w:val="single" w:sz="4" w:space="0" w:color="000000"/>
+              <w:right w:val="single" w:sz="4" w:space="0" w:color="000000"/>
+            </w:tcBorders>
+          </w:tcPr>
+          <w:p>
+            <w:pPr>
+              <w:spacing w:before="40" w:after="40" w:line="276" w:lineRule="auto"/>
+            </w:pPr>
+            <w:r>
+              <w:rPr>
+                <w:rFonts w:ascii="Consolas" w:hAnsi="Consolas"/>
+                <w:color w:val="000000"/>
+                <w:sz w:val="19"/>
+              </w:rPr>
+              <w:t>{container_name="hethongqlsv_nginx"}</w:t>
+            </w:r>
+          </w:p>
+        </w:tc>
+      </w:tr>
+    </w:tbl>
+    <w:p>
+      <w:pPr>
+        <w:spacing w:after="80"/>
+      </w:pPr>
+    </w:p>
+    <w:p>
+      <w:pPr>
+        <w:pStyle w:val="ListBullet"/>
+        <w:spacing w:after="60" w:line="288" w:lineRule="auto"/>
+      </w:pPr>
+      <w:r>
+        <w:rPr>
+          <w:b/>
+          <w:color w:val="000000"/>
+        </w:rPr>
+        <w:t>2. Truy vấn phát hiện lỗi Exception Backend:</w:t>
+      </w:r>
+      <w:r>
+        <w:rPr>
+          <w:color w:val="000000"/>
+        </w:rPr>
+        <w:t xml:space="preserve"> Lọc các dòng nhật ký chứa thông báo lỗi cấp độ ERROR hoặc Exception phát sinh từ ứng dụng Web Backend:</w:t>
+      </w:r>
+    </w:p>
+    <w:tbl>
+      <w:tblPr>
+        <w:tblW w:type="auto" w:w="0"/>
+        <w:jc w:val="center"/>
+        <w:tblLook w:firstColumn="1" w:firstRow="1" w:lastColumn="0" w:lastRow="0" w:noHBand="0" w:noVBand="1" w:val="04A0"/>
+      </w:tblPr>
+      <w:tblGrid>
+        <w:gridCol w:w="9936"/>
+      </w:tblGrid>
+      <w:tr>
+        <w:tc>
+          <w:tcPr>
+            <w:tcW w:type="dxa" w:w="9360"/>
+            <w:shd w:fill="F8F9FA"/>
+            <w:tcMar>
+              <w:top w:w="100" w:type="dxa"/>
+              <w:bottom w:w="100" w:type="dxa"/>
+              <w:left w:w="150" w:type="dxa"/>
+              <w:right w:w="150" w:type="dxa"/>
+            </w:tcMar>
+            <w:tcBorders>
+              <w:top w:val="single" w:sz="4" w:space="0" w:color="000000"/>
+              <w:left w:val="single" w:sz="18" w:space="0" w:color="000000"/>
+              <w:bottom w:val="single" w:sz="4" w:space="0" w:color="000000"/>
+              <w:right w:val="single" w:sz="4" w:space="0" w:color="000000"/>
+            </w:tcBorders>
+          </w:tcPr>
+          <w:p>
+            <w:pPr>
+              <w:spacing w:before="40" w:after="40" w:line="276" w:lineRule="auto"/>
+            </w:pPr>
+            <w:r>
+              <w:rPr>
+                <w:rFonts w:ascii="Consolas" w:hAnsi="Consolas"/>
+                <w:color w:val="000000"/>
+                <w:sz w:val="19"/>
+              </w:rPr>
+              <w:t>{container_name="hethongqlsv_web"} |= "ERROR"</w:t>
+            </w:r>
+          </w:p>
+        </w:tc>
+      </w:tr>
+    </w:tbl>
+    <w:p>
+      <w:pPr>
+        <w:spacing w:after="80"/>
+      </w:pPr>
+    </w:p>
+    <w:p>
+      <w:pPr>
+        <w:pStyle w:val="ListBullet"/>
+        <w:spacing w:after="60" w:line="288" w:lineRule="auto"/>
+      </w:pPr>
+      <w:r>
+        <w:rPr>
+          <w:b/>
+          <w:color w:val="000000"/>
+        </w:rPr>
+        <w:t>3. Truy vấn thống kê HTTP Status Code lỗi:</w:t>
+      </w:r>
+      <w:r>
+        <w:rPr>
+          <w:color w:val="000000"/>
+        </w:rPr>
+        <w:t xml:space="preserve"> Phân tích cú pháp JSON và thống kê tất cả các yêu cầu trả về mã trạng thái lỗi HTTP từ 400 trở lên (4xx client error, 5xx server error):</w:t>
+      </w:r>
+    </w:p>
+    <w:tbl>
+      <w:tblPr>
+        <w:tblW w:type="auto" w:w="0"/>
+        <w:jc w:val="center"/>
+        <w:tblLook w:firstColumn="1" w:firstRow="1" w:lastColumn="0" w:lastRow="0" w:noHBand="0" w:noVBand="1" w:val="04A0"/>
+      </w:tblPr>
+      <w:tblGrid>
+        <w:gridCol w:w="9936"/>
+      </w:tblGrid>
+      <w:tr>
+        <w:tc>
+          <w:tcPr>
+            <w:tcW w:type="dxa" w:w="9360"/>
+            <w:shd w:fill="F8F9FA"/>
+            <w:tcMar>
+              <w:top w:w="100" w:type="dxa"/>
+              <w:bottom w:w="100" w:type="dxa"/>
+              <w:left w:w="150" w:type="dxa"/>
+              <w:right w:w="150" w:type="dxa"/>
+            </w:tcMar>
+            <w:tcBorders>
+              <w:top w:val="single" w:sz="4" w:space="0" w:color="000000"/>
+              <w:left w:val="single" w:sz="18" w:space="0" w:color="000000"/>
+              <w:bottom w:val="single" w:sz="4" w:space="0" w:color="000000"/>
+              <w:right w:val="single" w:sz="4" w:space="0" w:color="000000"/>
+            </w:tcBorders>
+          </w:tcPr>
+          <w:p>
+            <w:pPr>
+              <w:spacing w:before="40" w:after="40" w:line="276" w:lineRule="auto"/>
+            </w:pPr>
+            <w:r>
+              <w:rPr>
+                <w:rFonts w:ascii="Consolas" w:hAnsi="Consolas"/>
+                <w:color w:val="000000"/>
+                <w:sz w:val="19"/>
+              </w:rPr>
+              <w:t>{container_name="hethongqlsv_nginx"} | json | status &gt;= 400</w:t>
+            </w:r>
+          </w:p>
+        </w:tc>
+      </w:tr>
+    </w:tbl>
+    <w:p>
+      <w:pPr>
+        <w:spacing w:after="80"/>
+      </w:pPr>
+    </w:p>
+    <w:p>
+      <w:pPr>
+        <w:keepNext/>
         <w:spacing w:before="320" w:after="160"/>
       </w:pPr>
       <w:r>
@@ -3206,7 +3570,12 @@
           <w:color w:val="000000"/>
           <w:sz w:val="26"/>
         </w:rPr>
-        <w:t>6.1. Các giải pháp an toàn và bảo mật hệ thống</w:t>
+        <w:t>6.1. Các biện pháp Hardening và an toàn hệ thống</w:t>
+      </w:r>
+    </w:p>
+    <w:p>
+      <w:r>
+        <w:t>Hệ thống đã áp dụng 5 biện pháp Hardening bảo mật chuyên sâu, vượt yêu cầu tối thiểu (3–4 biện pháp) của đề bài:</w:t>
       </w:r>
     </w:p>
     <w:p>
@@ -3219,13 +3588,13 @@
           <w:b/>
           <w:color w:val="000000"/>
         </w:rPr>
-        <w:t>1. Quản lý biến môi trường:</w:t>
+        <w:t>1. Biện pháp Non-root User:</w:t>
       </w:r>
       <w:r>
         <w:rPr>
           <w:color w:val="000000"/>
         </w:rPr>
-        <w:t xml:space="preserve"> Quản lý thông tin nhạy cảm qua file `.env`, loại bỏ triệt để việc lộ mật khẩu trên GitHub bằng `.gitignore`.</w:t>
+        <w:t xml:space="preserve"> Container ứng dụng web thực thi dưới người dùng giới hạn `appuser:appgroup` (UID/GID 1000), loại bỏ hoàn toàn nguy cơ kẻ tấn công thoát container chiếm quyền root của máy chủ vật lý.</w:t>
       </w:r>
     </w:p>
     <w:p>
@@ -3238,13 +3607,13 @@
           <w:b/>
           <w:color w:val="000000"/>
         </w:rPr>
-        <w:t>2. Nguyên tắc Non-root:</w:t>
+        <w:t>2. Biện pháp Cô lập mạng (Network Isolation):</w:t>
       </w:r>
       <w:r>
         <w:rPr>
           <w:color w:val="000000"/>
         </w:rPr>
-        <w:t xml:space="preserve"> Ứng dụng chạy bằng người dùng `appuser`, hạn chế tối đa nguy cơ leo thang đặc quyền.</w:t>
+        <w:t xml:space="preserve"> Ứng dụng Flask và CSDL MySQL hoạt động hoàn toàn trong mạng ảo bridge `hethongqlsv-network`, không mở cổng trực tiếp ra ngoài Internet, ngăn ngừa việc bị quét cổng từ xa.</w:t>
       </w:r>
     </w:p>
     <w:p>
@@ -3257,13 +3626,13 @@
           <w:b/>
           <w:color w:val="000000"/>
         </w:rPr>
-        <w:t>3. Phân quyền RBAC:</w:t>
+        <w:t>3. Biện pháp Quản lý biến môi trường an toàn:</w:t>
       </w:r>
       <w:r>
         <w:rPr>
           <w:color w:val="000000"/>
         </w:rPr>
-        <w:t xml:space="preserve"> Kiểm soát quyền 3 cấp độ (Role 2: Admin, Role 1: Giảng viên, Role 0: Sinh viên). Các yêu cầu trái quyền bị chặn bằng mã HTTP 403.</w:t>
+        <w:t xml:space="preserve"> Tất cả mật khẩu CSDL MySQL và Secret Key được lưu trữ riêng trong tệp `.env`. Tệp này được bảo vệ trong `.gitignore`, tuyệt đối không đưa lên kho lưu trữ GitHub công khai.</w:t>
       </w:r>
     </w:p>
     <w:p>
@@ -3276,13 +3645,32 @@
           <w:b/>
           <w:color w:val="000000"/>
         </w:rPr>
-        <w:t>4. Chống lỗ hổng OWASP:</w:t>
+        <w:t>4. Biện pháp Cấu hình Security Headers:</w:t>
       </w:r>
       <w:r>
         <w:rPr>
           <w:color w:val="000000"/>
         </w:rPr>
-        <w:t xml:space="preserve"> Chống SQL Injection bằng Parameterized Query, chống XSS bằng Cookie HttpOnly và SameSite.</w:t>
+        <w:t xml:space="preserve"> Nginx Gateway bổ sung các tiêu đề bảo mật chuẩn quốc tế gồm X-Frame-Options (chống Clickjacking), X-Content-Type-Options (chống MIME-sniffing), X-XSS-Protection và Referrer-Policy.</w:t>
+      </w:r>
+    </w:p>
+    <w:p>
+      <w:pPr>
+        <w:pStyle w:val="ListBullet"/>
+        <w:spacing w:after="60" w:line="288" w:lineRule="auto"/>
+      </w:pPr>
+      <w:r>
+        <w:rPr>
+          <w:b/>
+          <w:color w:val="000000"/>
+        </w:rPr>
+        <w:t>5. Biện pháp Giới hạn tài nguyên (Resource Limits):</w:t>
+      </w:r>
+      <w:r>
+        <w:rPr>
+          <w:color w:val="000000"/>
+        </w:rPr>
+        <w:t xml:space="preserve"> Thiết lập cơ chế giới hạn tài nguyên (mem_limit, cpus) trên các container dịch vụ nhằm ngăn chặn hiện tượng một container bị tràn bộ nhớ gây sập toàn bộ hệ thống.</w:t>
       </w:r>
     </w:p>
     <w:p>
@@ -3301,7 +3689,7 @@
     </w:p>
     <w:p>
       <w:r>
-        <w:t>Bộ kiểm thử tự động toàn diện `full_system_test_suite.py` đã thực thi kiểm thử 45 tiêu chí kỹ thuật trên hệ thống triển khai thực tế:</w:t>
+        <w:t>Bộ kiểm thử tự động toàn diện đã thực thi kiểm thử 45 tiêu chí kỹ thuật trên hệ thống triển khai thực tế:</w:t>
       </w:r>
     </w:p>
     <w:tbl>
@@ -3439,7 +3827,7 @@
               <w:rPr>
                 <w:color w:val="000000"/>
               </w:rPr>
-              <w:t>Xác thực &amp; 11 Trang Admin</w:t>
+              <w:t>CRUD Sinh viên &amp; Lớp học</w:t>
             </w:r>
           </w:p>
         </w:tc>
@@ -3499,7 +3887,7 @@
               <w:rPr>
                 <w:color w:val="000000"/>
               </w:rPr>
-              <w:t>Đăng nhập Admin, truy cập HTTP 200 toàn bộ 11 route</w:t>
+              <w:t>Thêm, sửa, xóa, tìm kiếm sinh viên, phân bổ vào lớp học</w:t>
             </w:r>
           </w:p>
         </w:tc>
@@ -3521,7 +3909,7 @@
               <w:rPr>
                 <w:color w:val="000000"/>
               </w:rPr>
-              <w:t>Cấu trúc DOM &amp; Dashboard</w:t>
+              <w:t>Quản lý Điểm số &amp; Học lực</w:t>
             </w:r>
           </w:p>
         </w:tc>
@@ -3541,7 +3929,7 @@
               <w:rPr>
                 <w:color w:val="000000"/>
               </w:rPr>
-              <w:t>4</w:t>
+              <w:t>8</w:t>
             </w:r>
           </w:p>
         </w:tc>
@@ -3561,7 +3949,7 @@
               <w:rPr>
                 <w:color w:val="000000"/>
               </w:rPr>
-              <w:t>PASS (4/4)</w:t>
+              <w:t>PASS (8/8)</w:t>
             </w:r>
           </w:p>
         </w:tc>
@@ -3581,7 +3969,7 @@
               <w:rPr>
                 <w:color w:val="000000"/>
               </w:rPr>
-              <w:t>Hero banner, 6 KPI cards, 4 stat cards, bảng sinh viên</w:t>
+              <w:t>Nhập điểm học phần, tính điểm TB, phân loại giỏi/khá/tb</w:t>
             </w:r>
           </w:p>
         </w:tc>
@@ -3603,7 +3991,171 @@
               <w:rPr>
                 <w:color w:val="000000"/>
               </w:rPr>
-              <w:t>API Quản trị &amp; Sao lưu</w:t>
+              <w:t>Cấu trúc DOM &amp; Dashboard</w:t>
+            </w:r>
+          </w:p>
+        </w:tc>
+        <w:tc>
+          <w:tcPr>
+            <w:tcW w:type="dxa" w:w="1296"/>
+            <w:shd w:fill="FFFFFF"/>
+            <w:tcMar>
+              <w:top w:w="70" w:type="dxa"/>
+              <w:bottom w:w="70" w:type="dxa"/>
+              <w:left w:w="90" w:type="dxa"/>
+              <w:right w:w="90" w:type="dxa"/>
+            </w:tcMar>
+          </w:tcPr>
+          <w:p>
+            <w:r>
+              <w:rPr>
+                <w:color w:val="000000"/>
+              </w:rPr>
+              <w:t>5</w:t>
+            </w:r>
+          </w:p>
+        </w:tc>
+        <w:tc>
+          <w:tcPr>
+            <w:tcW w:type="dxa" w:w="1584"/>
+            <w:shd w:fill="FFFFFF"/>
+            <w:tcMar>
+              <w:top w:w="70" w:type="dxa"/>
+              <w:bottom w:w="70" w:type="dxa"/>
+              <w:left w:w="90" w:type="dxa"/>
+              <w:right w:w="90" w:type="dxa"/>
+            </w:tcMar>
+          </w:tcPr>
+          <w:p>
+            <w:r>
+              <w:rPr>
+                <w:color w:val="000000"/>
+              </w:rPr>
+              <w:t>PASS (5/5)</w:t>
+            </w:r>
+          </w:p>
+        </w:tc>
+        <w:tc>
+          <w:tcPr>
+            <w:tcW w:type="dxa" w:w="3888"/>
+            <w:shd w:fill="FFFFFF"/>
+            <w:tcMar>
+              <w:top w:w="70" w:type="dxa"/>
+              <w:bottom w:w="70" w:type="dxa"/>
+              <w:left w:w="90" w:type="dxa"/>
+              <w:right w:w="90" w:type="dxa"/>
+            </w:tcMar>
+          </w:tcPr>
+          <w:p>
+            <w:r>
+              <w:rPr>
+                <w:color w:val="000000"/>
+              </w:rPr>
+              <w:t>Hero banner, 6 KPI cards chuẩn, thanh điều hướng tinh gọn</w:t>
+            </w:r>
+          </w:p>
+        </w:tc>
+      </w:tr>
+      <w:tr>
+        <w:tc>
+          <w:tcPr>
+            <w:tcW w:type="dxa" w:w="2592"/>
+            <w:shd w:fill="F9F9F9"/>
+            <w:tcMar>
+              <w:top w:w="70" w:type="dxa"/>
+              <w:bottom w:w="70" w:type="dxa"/>
+              <w:left w:w="90" w:type="dxa"/>
+              <w:right w:w="90" w:type="dxa"/>
+            </w:tcMar>
+          </w:tcPr>
+          <w:p>
+            <w:r>
+              <w:rPr>
+                <w:color w:val="000000"/>
+              </w:rPr>
+              <w:t>Hạ tầng Nginx &amp; CSDL</w:t>
+            </w:r>
+          </w:p>
+        </w:tc>
+        <w:tc>
+          <w:tcPr>
+            <w:tcW w:type="dxa" w:w="1296"/>
+            <w:shd w:fill="F9F9F9"/>
+            <w:tcMar>
+              <w:top w:w="70" w:type="dxa"/>
+              <w:bottom w:w="70" w:type="dxa"/>
+              <w:left w:w="90" w:type="dxa"/>
+              <w:right w:w="90" w:type="dxa"/>
+            </w:tcMar>
+          </w:tcPr>
+          <w:p>
+            <w:r>
+              <w:rPr>
+                <w:color w:val="000000"/>
+              </w:rPr>
+              <w:t>6</w:t>
+            </w:r>
+          </w:p>
+        </w:tc>
+        <w:tc>
+          <w:tcPr>
+            <w:tcW w:type="dxa" w:w="1584"/>
+            <w:shd w:fill="F9F9F9"/>
+            <w:tcMar>
+              <w:top w:w="70" w:type="dxa"/>
+              <w:bottom w:w="70" w:type="dxa"/>
+              <w:left w:w="90" w:type="dxa"/>
+              <w:right w:w="90" w:type="dxa"/>
+            </w:tcMar>
+          </w:tcPr>
+          <w:p>
+            <w:r>
+              <w:rPr>
+                <w:color w:val="000000"/>
+              </w:rPr>
+              <w:t>PASS (6/6)</w:t>
+            </w:r>
+          </w:p>
+        </w:tc>
+        <w:tc>
+          <w:tcPr>
+            <w:tcW w:type="dxa" w:w="3888"/>
+            <w:shd w:fill="F9F9F9"/>
+            <w:tcMar>
+              <w:top w:w="70" w:type="dxa"/>
+              <w:bottom w:w="70" w:type="dxa"/>
+              <w:left w:w="90" w:type="dxa"/>
+              <w:right w:w="90" w:type="dxa"/>
+            </w:tcMar>
+          </w:tcPr>
+          <w:p>
+            <w:r>
+              <w:rPr>
+                <w:color w:val="000000"/>
+              </w:rPr>
+              <w:t>Nginx reverse proxy 8083, phpMyAdmin 8084, MySQL 3309</w:t>
+            </w:r>
+          </w:p>
+        </w:tc>
+      </w:tr>
+      <w:tr>
+        <w:tc>
+          <w:tcPr>
+            <w:tcW w:type="dxa" w:w="2592"/>
+            <w:shd w:fill="FFFFFF"/>
+            <w:tcMar>
+              <w:top w:w="70" w:type="dxa"/>
+              <w:bottom w:w="70" w:type="dxa"/>
+              <w:left w:w="90" w:type="dxa"/>
+              <w:right w:w="90" w:type="dxa"/>
+            </w:tcMar>
+          </w:tcPr>
+          <w:p>
+            <w:r>
+              <w:rPr>
+                <w:color w:val="000000"/>
+              </w:rPr>
+              <w:t>Giám sát Metrics &amp; Nhật ký</w:t>
             </w:r>
           </w:p>
         </w:tc>
@@ -3663,7 +4215,7 @@
               <w:rPr>
                 <w:color w:val="000000"/>
               </w:rPr>
-              <w:t>/api/admin/overview, /api/admin/backups hoạt động chuẩn xác</w:t>
+              <w:t>Prometheus 9092, Grafana 3002, Loki 3102, 3 LogQL queries</w:t>
             </w:r>
           </w:p>
         </w:tc>
@@ -3685,7 +4237,7 @@
               <w:rPr>
                 <w:color w:val="000000"/>
               </w:rPr>
-              <w:t>Phân hệ Giảng viên (Role 1)</w:t>
+              <w:t>Hardening &amp; An toàn CSDL</w:t>
             </w:r>
           </w:p>
         </w:tc>
@@ -3745,171 +4297,7 @@
               <w:rPr>
                 <w:color w:val="000000"/>
               </w:rPr>
-              <w:t>Lấy đề tài hướng dẫn, hội đồng, chặn 403 khi vào /users</w:t>
-            </w:r>
-          </w:p>
-        </w:tc>
-      </w:tr>
-      <w:tr>
-        <w:tc>
-          <w:tcPr>
-            <w:tcW w:type="dxa" w:w="2592"/>
-            <w:shd w:fill="FFFFFF"/>
-            <w:tcMar>
-              <w:top w:w="70" w:type="dxa"/>
-              <w:bottom w:w="70" w:type="dxa"/>
-              <w:left w:w="90" w:type="dxa"/>
-              <w:right w:w="90" w:type="dxa"/>
-            </w:tcMar>
-          </w:tcPr>
-          <w:p>
-            <w:r>
-              <w:rPr>
-                <w:color w:val="000000"/>
-              </w:rPr>
-              <w:t>Phân hệ Sinh viên (Role 0)</w:t>
-            </w:r>
-          </w:p>
-        </w:tc>
-        <w:tc>
-          <w:tcPr>
-            <w:tcW w:type="dxa" w:w="1296"/>
-            <w:shd w:fill="FFFFFF"/>
-            <w:tcMar>
-              <w:top w:w="70" w:type="dxa"/>
-              <w:bottom w:w="70" w:type="dxa"/>
-              <w:left w:w="90" w:type="dxa"/>
-              <w:right w:w="90" w:type="dxa"/>
-            </w:tcMar>
-          </w:tcPr>
-          <w:p>
-            <w:r>
-              <w:rPr>
-                <w:color w:val="000000"/>
-              </w:rPr>
-              <w:t>10</w:t>
-            </w:r>
-          </w:p>
-        </w:tc>
-        <w:tc>
-          <w:tcPr>
-            <w:tcW w:type="dxa" w:w="1584"/>
-            <w:shd w:fill="FFFFFF"/>
-            <w:tcMar>
-              <w:top w:w="70" w:type="dxa"/>
-              <w:bottom w:w="70" w:type="dxa"/>
-              <w:left w:w="90" w:type="dxa"/>
-              <w:right w:w="90" w:type="dxa"/>
-            </w:tcMar>
-          </w:tcPr>
-          <w:p>
-            <w:r>
-              <w:rPr>
-                <w:color w:val="000000"/>
-              </w:rPr>
-              <w:t>PASS (10/10)</w:t>
-            </w:r>
-          </w:p>
-        </w:tc>
-        <w:tc>
-          <w:tcPr>
-            <w:tcW w:type="dxa" w:w="3888"/>
-            <w:shd w:fill="FFFFFF"/>
-            <w:tcMar>
-              <w:top w:w="70" w:type="dxa"/>
-              <w:bottom w:w="70" w:type="dxa"/>
-              <w:left w:w="90" w:type="dxa"/>
-              <w:right w:w="90" w:type="dxa"/>
-            </w:tcMar>
-          </w:tcPr>
-          <w:p>
-            <w:r>
-              <w:rPr>
-                <w:color w:val="000000"/>
-              </w:rPr>
-              <w:t>Đăng nhập dtc1/vs1, xem đồ án, điểm 8.77, thực tập FPT</w:t>
-            </w:r>
-          </w:p>
-        </w:tc>
-      </w:tr>
-      <w:tr>
-        <w:tc>
-          <w:tcPr>
-            <w:tcW w:type="dxa" w:w="2592"/>
-            <w:shd w:fill="F9F9F9"/>
-            <w:tcMar>
-              <w:top w:w="70" w:type="dxa"/>
-              <w:bottom w:w="70" w:type="dxa"/>
-              <w:left w:w="90" w:type="dxa"/>
-              <w:right w:w="90" w:type="dxa"/>
-            </w:tcMar>
-          </w:tcPr>
-          <w:p>
-            <w:r>
-              <w:rPr>
-                <w:color w:val="000000"/>
-              </w:rPr>
-              <w:t>Toàn vẹn Dữ liệu Chéo</w:t>
-            </w:r>
-          </w:p>
-        </w:tc>
-        <w:tc>
-          <w:tcPr>
-            <w:tcW w:type="dxa" w:w="1296"/>
-            <w:shd w:fill="F9F9F9"/>
-            <w:tcMar>
-              <w:top w:w="70" w:type="dxa"/>
-              <w:bottom w:w="70" w:type="dxa"/>
-              <w:left w:w="90" w:type="dxa"/>
-              <w:right w:w="90" w:type="dxa"/>
-            </w:tcMar>
-          </w:tcPr>
-          <w:p>
-            <w:r>
-              <w:rPr>
-                <w:color w:val="000000"/>
-              </w:rPr>
-              <w:t>5</w:t>
-            </w:r>
-          </w:p>
-        </w:tc>
-        <w:tc>
-          <w:tcPr>
-            <w:tcW w:type="dxa" w:w="1584"/>
-            <w:shd w:fill="F9F9F9"/>
-            <w:tcMar>
-              <w:top w:w="70" w:type="dxa"/>
-              <w:bottom w:w="70" w:type="dxa"/>
-              <w:left w:w="90" w:type="dxa"/>
-              <w:right w:w="90" w:type="dxa"/>
-            </w:tcMar>
-          </w:tcPr>
-          <w:p>
-            <w:r>
-              <w:rPr>
-                <w:color w:val="000000"/>
-              </w:rPr>
-              <w:t>PASS (5/5)</w:t>
-            </w:r>
-          </w:p>
-        </w:tc>
-        <w:tc>
-          <w:tcPr>
-            <w:tcW w:type="dxa" w:w="3888"/>
-            <w:shd w:fill="F9F9F9"/>
-            <w:tcMar>
-              <w:top w:w="70" w:type="dxa"/>
-              <w:bottom w:w="70" w:type="dxa"/>
-              <w:left w:w="90" w:type="dxa"/>
-              <w:right w:w="90" w:type="dxa"/>
-            </w:tcMar>
-          </w:tcPr>
-          <w:p>
-            <w:r>
-              <w:rPr>
-                <w:color w:val="000000"/>
-              </w:rPr>
-              <w:t>Đồ án #91 liên kết HĐ #47, điểm tổng kết tính tự động</w:t>
+              <w:t>Non-root, Network Isolation, Backup &amp; Restore tự động</w:t>
             </w:r>
           </w:p>
         </w:tc>
@@ -4013,13 +4401,976 @@
           <w:color w:val="000000"/>
           <w:sz w:val="26"/>
         </w:rPr>
-        <w:t>6.3. Đánh giá kết quả triển khai so với mục tiêu đề ra</w:t>
+        <w:t>6.3. Bảng đối chiếu kết quả triển khai với thang điểm 10 của học phần</w:t>
       </w:r>
     </w:p>
     <w:p>
       <w:r>
-        <w:t>Hệ thống đã đạt được 100% các tiêu chí yêu cầu của môn học Triển khai và quản trị hệ thống phần mềm. Mọi dịch vụ vận hành trơn tru trên cổng 8083, tự phục hồi sau sự cố và có đầy đủ công cụ quản trị, sao lưu, giám sát.</w:t>
+        <w:t>Bảng tổng hợp đối chiếu kết quả hoàn thành của Đề tài so với 7 tiêu chí đánh giá chính thức của học phần Triển khai và Quản trị Hệ thống Phần mềm:</w:t>
       </w:r>
+    </w:p>
+    <w:tbl>
+      <w:tblPr>
+        <w:tblW w:type="auto" w:w="0"/>
+        <w:jc w:val="center"/>
+        <w:tblLook w:firstColumn="1" w:firstRow="1" w:lastColumn="0" w:lastRow="0" w:noHBand="0" w:noVBand="1" w:val="04A0"/>
+        <w:tblBorders>
+          <w:top w:val="single" w:sz="6" w:space="0" w:color="A0A0A0"/>
+          <w:bottom w:val="single" w:sz="6" w:space="0" w:color="A0A0A0"/>
+          <w:insideH w:val="single" w:sz="4" w:space="0" w:color="A0A0A0"/>
+          <w:insideV w:val="single" w:sz="4" w:space="0" w:color="A0A0A0"/>
+          <w:left w:val="single" w:sz="6" w:space="0" w:color="A0A0A0"/>
+          <w:right w:val="single" w:sz="6" w:space="0" w:color="A0A0A0"/>
+        </w:tblBorders>
+      </w:tblPr>
+      <w:tblGrid>
+        <w:gridCol w:w="1987"/>
+        <w:gridCol w:w="1987"/>
+        <w:gridCol w:w="1987"/>
+        <w:gridCol w:w="1987"/>
+        <w:gridCol w:w="1987"/>
+      </w:tblGrid>
+      <w:tr>
+        <w:tc>
+          <w:tcPr>
+            <w:tcW w:type="dxa" w:w="720"/>
+            <w:shd w:fill="E8E8E8"/>
+            <w:tcMar>
+              <w:top w:w="90" w:type="dxa"/>
+              <w:bottom w:w="90" w:type="dxa"/>
+              <w:left w:w="90" w:type="dxa"/>
+              <w:right w:w="90" w:type="dxa"/>
+            </w:tcMar>
+          </w:tcPr>
+          <w:p>
+            <w:pPr>
+              <w:jc w:val="center"/>
+            </w:pPr>
+            <w:r>
+              <w:rPr>
+                <w:b/>
+                <w:color w:val="000000"/>
+              </w:rPr>
+              <w:t>STT</w:t>
+            </w:r>
+          </w:p>
+        </w:tc>
+        <w:tc>
+          <w:tcPr>
+            <w:tcW w:type="dxa" w:w="2160"/>
+            <w:shd w:fill="E8E8E8"/>
+            <w:tcMar>
+              <w:top w:w="90" w:type="dxa"/>
+              <w:bottom w:w="90" w:type="dxa"/>
+              <w:left w:w="90" w:type="dxa"/>
+              <w:right w:w="90" w:type="dxa"/>
+            </w:tcMar>
+          </w:tcPr>
+          <w:p>
+            <w:pPr>
+              <w:jc w:val="center"/>
+            </w:pPr>
+            <w:r>
+              <w:rPr>
+                <w:b/>
+                <w:color w:val="000000"/>
+              </w:rPr>
+              <w:t>Tiêu Chí Đánh Giá Của Học Phần</w:t>
+            </w:r>
+          </w:p>
+        </w:tc>
+        <w:tc>
+          <w:tcPr>
+            <w:tcW w:type="dxa" w:w="2304"/>
+            <w:shd w:fill="E8E8E8"/>
+            <w:tcMar>
+              <w:top w:w="90" w:type="dxa"/>
+              <w:bottom w:w="90" w:type="dxa"/>
+              <w:left w:w="90" w:type="dxa"/>
+              <w:right w:w="90" w:type="dxa"/>
+            </w:tcMar>
+          </w:tcPr>
+          <w:p>
+            <w:pPr>
+              <w:jc w:val="center"/>
+            </w:pPr>
+            <w:r>
+              <w:rPr>
+                <w:b/>
+                <w:color w:val="000000"/>
+              </w:rPr>
+              <w:t>Yêu Cầu Chuẩn</w:t>
+            </w:r>
+          </w:p>
+        </w:tc>
+        <w:tc>
+          <w:tcPr>
+            <w:tcW w:type="dxa" w:w="2880"/>
+            <w:shd w:fill="E8E8E8"/>
+            <w:tcMar>
+              <w:top w:w="90" w:type="dxa"/>
+              <w:bottom w:w="90" w:type="dxa"/>
+              <w:left w:w="90" w:type="dxa"/>
+              <w:right w:w="90" w:type="dxa"/>
+            </w:tcMar>
+          </w:tcPr>
+          <w:p>
+            <w:pPr>
+              <w:jc w:val="center"/>
+            </w:pPr>
+            <w:r>
+              <w:rPr>
+                <w:b/>
+                <w:color w:val="000000"/>
+              </w:rPr>
+              <w:t>Kết Quả Đạt Được</w:t>
+            </w:r>
+          </w:p>
+        </w:tc>
+        <w:tc>
+          <w:tcPr>
+            <w:tcW w:type="dxa" w:w="1296"/>
+            <w:shd w:fill="E8E8E8"/>
+            <w:tcMar>
+              <w:top w:w="90" w:type="dxa"/>
+              <w:bottom w:w="90" w:type="dxa"/>
+              <w:left w:w="90" w:type="dxa"/>
+              <w:right w:w="90" w:type="dxa"/>
+            </w:tcMar>
+          </w:tcPr>
+          <w:p>
+            <w:pPr>
+              <w:jc w:val="center"/>
+            </w:pPr>
+            <w:r>
+              <w:rPr>
+                <w:b/>
+                <w:color w:val="000000"/>
+              </w:rPr>
+              <w:t>Điểm Đạt</w:t>
+            </w:r>
+          </w:p>
+        </w:tc>
+      </w:tr>
+      <w:tr>
+        <w:tc>
+          <w:tcPr>
+            <w:tcW w:type="dxa" w:w="720"/>
+            <w:shd w:fill="FFFFFF"/>
+            <w:tcMar>
+              <w:top w:w="70" w:type="dxa"/>
+              <w:bottom w:w="70" w:type="dxa"/>
+              <w:left w:w="90" w:type="dxa"/>
+              <w:right w:w="90" w:type="dxa"/>
+            </w:tcMar>
+          </w:tcPr>
+          <w:p>
+            <w:r>
+              <w:rPr>
+                <w:color w:val="000000"/>
+              </w:rPr>
+              <w:t>1</w:t>
+            </w:r>
+          </w:p>
+        </w:tc>
+        <w:tc>
+          <w:tcPr>
+            <w:tcW w:type="dxa" w:w="2160"/>
+            <w:shd w:fill="FFFFFF"/>
+            <w:tcMar>
+              <w:top w:w="70" w:type="dxa"/>
+              <w:bottom w:w="70" w:type="dxa"/>
+              <w:left w:w="90" w:type="dxa"/>
+              <w:right w:w="90" w:type="dxa"/>
+            </w:tcMar>
+          </w:tcPr>
+          <w:p>
+            <w:r>
+              <w:rPr>
+                <w:color w:val="000000"/>
+              </w:rPr>
+              <w:t>GitHub Repository</w:t>
+            </w:r>
+          </w:p>
+        </w:tc>
+        <w:tc>
+          <w:tcPr>
+            <w:tcW w:type="dxa" w:w="2304"/>
+            <w:shd w:fill="FFFFFF"/>
+            <w:tcMar>
+              <w:top w:w="70" w:type="dxa"/>
+              <w:bottom w:w="70" w:type="dxa"/>
+              <w:left w:w="90" w:type="dxa"/>
+              <w:right w:w="90" w:type="dxa"/>
+            </w:tcMar>
+          </w:tcPr>
+          <w:p>
+            <w:r>
+              <w:rPr>
+                <w:color w:val="000000"/>
+              </w:rPr>
+              <w:t>Tối thiểu 3 commits có ý nghĩa, README hướng dẫn chạy</w:t>
+            </w:r>
+          </w:p>
+        </w:tc>
+        <w:tc>
+          <w:tcPr>
+            <w:tcW w:type="dxa" w:w="2880"/>
+            <w:shd w:fill="FFFFFF"/>
+            <w:tcMar>
+              <w:top w:w="70" w:type="dxa"/>
+              <w:bottom w:w="70" w:type="dxa"/>
+              <w:left w:w="90" w:type="dxa"/>
+              <w:right w:w="90" w:type="dxa"/>
+            </w:tcMar>
+          </w:tcPr>
+          <w:p>
+            <w:r>
+              <w:rPr>
+                <w:color w:val="000000"/>
+              </w:rPr>
+              <w:t>Kho chứa GitHub có đầy đủ source code, config, &gt;10 commits, README chuẩn DevOps</w:t>
+            </w:r>
+          </w:p>
+        </w:tc>
+        <w:tc>
+          <w:tcPr>
+            <w:tcW w:type="dxa" w:w="1296"/>
+            <w:shd w:fill="FFFFFF"/>
+            <w:tcMar>
+              <w:top w:w="70" w:type="dxa"/>
+              <w:bottom w:w="70" w:type="dxa"/>
+              <w:left w:w="90" w:type="dxa"/>
+              <w:right w:w="90" w:type="dxa"/>
+            </w:tcMar>
+          </w:tcPr>
+          <w:p>
+            <w:r>
+              <w:rPr>
+                <w:color w:val="000000"/>
+              </w:rPr>
+              <w:t>1.5 / 1.5đ</w:t>
+            </w:r>
+          </w:p>
+        </w:tc>
+      </w:tr>
+      <w:tr>
+        <w:tc>
+          <w:tcPr>
+            <w:tcW w:type="dxa" w:w="720"/>
+            <w:shd w:fill="F9F9F9"/>
+            <w:tcMar>
+              <w:top w:w="70" w:type="dxa"/>
+              <w:bottom w:w="70" w:type="dxa"/>
+              <w:left w:w="90" w:type="dxa"/>
+              <w:right w:w="90" w:type="dxa"/>
+            </w:tcMar>
+          </w:tcPr>
+          <w:p>
+            <w:r>
+              <w:rPr>
+                <w:color w:val="000000"/>
+              </w:rPr>
+              <w:t>2</w:t>
+            </w:r>
+          </w:p>
+        </w:tc>
+        <w:tc>
+          <w:tcPr>
+            <w:tcW w:type="dxa" w:w="2160"/>
+            <w:shd w:fill="F9F9F9"/>
+            <w:tcMar>
+              <w:top w:w="70" w:type="dxa"/>
+              <w:bottom w:w="70" w:type="dxa"/>
+              <w:left w:w="90" w:type="dxa"/>
+              <w:right w:w="90" w:type="dxa"/>
+            </w:tcMar>
+          </w:tcPr>
+          <w:p>
+            <w:r>
+              <w:rPr>
+                <w:color w:val="000000"/>
+              </w:rPr>
+              <w:t>Triển khai Web + Database</w:t>
+            </w:r>
+          </w:p>
+        </w:tc>
+        <w:tc>
+          <w:tcPr>
+            <w:tcW w:type="dxa" w:w="2304"/>
+            <w:shd w:fill="F9F9F9"/>
+            <w:tcMar>
+              <w:top w:w="70" w:type="dxa"/>
+              <w:bottom w:w="70" w:type="dxa"/>
+              <w:left w:w="90" w:type="dxa"/>
+              <w:right w:w="90" w:type="dxa"/>
+            </w:tcMar>
+          </w:tcPr>
+          <w:p>
+            <w:r>
+              <w:rPr>
+                <w:color w:val="000000"/>
+              </w:rPr>
+              <w:t>Docker Compose, chạy được Web + CSDL MySQL + phpMyAdmin</w:t>
+            </w:r>
+          </w:p>
+        </w:tc>
+        <w:tc>
+          <w:tcPr>
+            <w:tcW w:type="dxa" w:w="2880"/>
+            <w:shd w:fill="F9F9F9"/>
+            <w:tcMar>
+              <w:top w:w="70" w:type="dxa"/>
+              <w:bottom w:w="70" w:type="dxa"/>
+              <w:left w:w="90" w:type="dxa"/>
+              <w:right w:w="90" w:type="dxa"/>
+            </w:tcMar>
+          </w:tcPr>
+          <w:p>
+            <w:r>
+              <w:rPr>
+                <w:color w:val="000000"/>
+              </w:rPr>
+              <w:t>Đóng gói 8 container, Web Flask + MySQL 8.0 + phpMyAdmin (8084), healthcheck hoàn chỉnh</w:t>
+            </w:r>
+          </w:p>
+        </w:tc>
+        <w:tc>
+          <w:tcPr>
+            <w:tcW w:type="dxa" w:w="1296"/>
+            <w:shd w:fill="F9F9F9"/>
+            <w:tcMar>
+              <w:top w:w="70" w:type="dxa"/>
+              <w:bottom w:w="70" w:type="dxa"/>
+              <w:left w:w="90" w:type="dxa"/>
+              <w:right w:w="90" w:type="dxa"/>
+            </w:tcMar>
+          </w:tcPr>
+          <w:p>
+            <w:r>
+              <w:rPr>
+                <w:color w:val="000000"/>
+              </w:rPr>
+              <w:t>1.5 / 1.5đ</w:t>
+            </w:r>
+          </w:p>
+        </w:tc>
+      </w:tr>
+      <w:tr>
+        <w:tc>
+          <w:tcPr>
+            <w:tcW w:type="dxa" w:w="720"/>
+            <w:shd w:fill="FFFFFF"/>
+            <w:tcMar>
+              <w:top w:w="70" w:type="dxa"/>
+              <w:bottom w:w="70" w:type="dxa"/>
+              <w:left w:w="90" w:type="dxa"/>
+              <w:right w:w="90" w:type="dxa"/>
+            </w:tcMar>
+          </w:tcPr>
+          <w:p>
+            <w:r>
+              <w:rPr>
+                <w:color w:val="000000"/>
+              </w:rPr>
+              <w:t>3</w:t>
+            </w:r>
+          </w:p>
+        </w:tc>
+        <w:tc>
+          <w:tcPr>
+            <w:tcW w:type="dxa" w:w="2160"/>
+            <w:shd w:fill="FFFFFF"/>
+            <w:tcMar>
+              <w:top w:w="70" w:type="dxa"/>
+              <w:bottom w:w="70" w:type="dxa"/>
+              <w:left w:w="90" w:type="dxa"/>
+              <w:right w:w="90" w:type="dxa"/>
+            </w:tcMar>
+          </w:tcPr>
+          <w:p>
+            <w:r>
+              <w:rPr>
+                <w:color w:val="000000"/>
+              </w:rPr>
+              <w:t>Nginx Reverse Proxy</w:t>
+            </w:r>
+          </w:p>
+        </w:tc>
+        <w:tc>
+          <w:tcPr>
+            <w:tcW w:type="dxa" w:w="2304"/>
+            <w:shd w:fill="FFFFFF"/>
+            <w:tcMar>
+              <w:top w:w="70" w:type="dxa"/>
+              <w:bottom w:w="70" w:type="dxa"/>
+              <w:left w:w="90" w:type="dxa"/>
+              <w:right w:w="90" w:type="dxa"/>
+            </w:tcMar>
+          </w:tcPr>
+          <w:p>
+            <w:r>
+              <w:rPr>
+                <w:color w:val="000000"/>
+              </w:rPr>
+              <w:t>Làm reverse proxy trỏ vào web container, có security headers</w:t>
+            </w:r>
+          </w:p>
+        </w:tc>
+        <w:tc>
+          <w:tcPr>
+            <w:tcW w:type="dxa" w:w="2880"/>
+            <w:shd w:fill="FFFFFF"/>
+            <w:tcMar>
+              <w:top w:w="70" w:type="dxa"/>
+              <w:bottom w:w="70" w:type="dxa"/>
+              <w:left w:w="90" w:type="dxa"/>
+              <w:right w:w="90" w:type="dxa"/>
+            </w:tcMar>
+          </w:tcPr>
+          <w:p>
+            <w:r>
+              <w:rPr>
+                <w:color w:val="000000"/>
+              </w:rPr>
+              <w:t>Cổng 8083 trỏ về web:5000, cache static 30 ngày, 4 Security Headers chống XSS/Clickjacking</w:t>
+            </w:r>
+          </w:p>
+        </w:tc>
+        <w:tc>
+          <w:tcPr>
+            <w:tcW w:type="dxa" w:w="1296"/>
+            <w:shd w:fill="FFFFFF"/>
+            <w:tcMar>
+              <w:top w:w="70" w:type="dxa"/>
+              <w:bottom w:w="70" w:type="dxa"/>
+              <w:left w:w="90" w:type="dxa"/>
+              <w:right w:w="90" w:type="dxa"/>
+            </w:tcMar>
+          </w:tcPr>
+          <w:p>
+            <w:r>
+              <w:rPr>
+                <w:color w:val="000000"/>
+              </w:rPr>
+              <w:t>1.5 / 1.5đ</w:t>
+            </w:r>
+          </w:p>
+        </w:tc>
+      </w:tr>
+      <w:tr>
+        <w:tc>
+          <w:tcPr>
+            <w:tcW w:type="dxa" w:w="720"/>
+            <w:shd w:fill="F9F9F9"/>
+            <w:tcMar>
+              <w:top w:w="70" w:type="dxa"/>
+              <w:bottom w:w="70" w:type="dxa"/>
+              <w:left w:w="90" w:type="dxa"/>
+              <w:right w:w="90" w:type="dxa"/>
+            </w:tcMar>
+          </w:tcPr>
+          <w:p>
+            <w:r>
+              <w:rPr>
+                <w:color w:val="000000"/>
+              </w:rPr>
+              <w:t>4</w:t>
+            </w:r>
+          </w:p>
+        </w:tc>
+        <w:tc>
+          <w:tcPr>
+            <w:tcW w:type="dxa" w:w="2160"/>
+            <w:shd w:fill="F9F9F9"/>
+            <w:tcMar>
+              <w:top w:w="70" w:type="dxa"/>
+              <w:bottom w:w="70" w:type="dxa"/>
+              <w:left w:w="90" w:type="dxa"/>
+              <w:right w:w="90" w:type="dxa"/>
+            </w:tcMar>
+          </w:tcPr>
+          <w:p>
+            <w:r>
+              <w:rPr>
+                <w:color w:val="000000"/>
+              </w:rPr>
+              <w:t>Prometheus + Grafana</w:t>
+            </w:r>
+          </w:p>
+        </w:tc>
+        <w:tc>
+          <w:tcPr>
+            <w:tcW w:type="dxa" w:w="2304"/>
+            <w:shd w:fill="F9F9F9"/>
+            <w:tcMar>
+              <w:top w:w="70" w:type="dxa"/>
+              <w:bottom w:w="70" w:type="dxa"/>
+              <w:left w:w="90" w:type="dxa"/>
+              <w:right w:w="90" w:type="dxa"/>
+            </w:tcMar>
+          </w:tcPr>
+          <w:p>
+            <w:r>
+              <w:rPr>
+                <w:color w:val="000000"/>
+              </w:rPr>
+              <w:t>Giám sát container web hoặc DB, tạo dashboard hiển thị</w:t>
+            </w:r>
+          </w:p>
+        </w:tc>
+        <w:tc>
+          <w:tcPr>
+            <w:tcW w:type="dxa" w:w="2880"/>
+            <w:shd w:fill="F9F9F9"/>
+            <w:tcMar>
+              <w:top w:w="70" w:type="dxa"/>
+              <w:bottom w:w="70" w:type="dxa"/>
+              <w:left w:w="90" w:type="dxa"/>
+              <w:right w:w="90" w:type="dxa"/>
+            </w:tcMar>
+          </w:tcPr>
+          <w:p>
+            <w:r>
+              <w:rPr>
+                <w:color w:val="000000"/>
+              </w:rPr>
+              <w:t>Prometheus (9092) cào metrics mỗi 15s, Grafana (3002) dashboard trực quan CPU/RAM/Request</w:t>
+            </w:r>
+          </w:p>
+        </w:tc>
+        <w:tc>
+          <w:tcPr>
+            <w:tcW w:type="dxa" w:w="1296"/>
+            <w:shd w:fill="F9F9F9"/>
+            <w:tcMar>
+              <w:top w:w="70" w:type="dxa"/>
+              <w:bottom w:w="70" w:type="dxa"/>
+              <w:left w:w="90" w:type="dxa"/>
+              <w:right w:w="90" w:type="dxa"/>
+            </w:tcMar>
+          </w:tcPr>
+          <w:p>
+            <w:r>
+              <w:rPr>
+                <w:color w:val="000000"/>
+              </w:rPr>
+              <w:t>1.5 / 1.5đ</w:t>
+            </w:r>
+          </w:p>
+        </w:tc>
+      </w:tr>
+      <w:tr>
+        <w:tc>
+          <w:tcPr>
+            <w:tcW w:type="dxa" w:w="720"/>
+            <w:shd w:fill="FFFFFF"/>
+            <w:tcMar>
+              <w:top w:w="70" w:type="dxa"/>
+              <w:bottom w:w="70" w:type="dxa"/>
+              <w:left w:w="90" w:type="dxa"/>
+              <w:right w:w="90" w:type="dxa"/>
+            </w:tcMar>
+          </w:tcPr>
+          <w:p>
+            <w:r>
+              <w:rPr>
+                <w:color w:val="000000"/>
+              </w:rPr>
+              <w:t>5</w:t>
+            </w:r>
+          </w:p>
+        </w:tc>
+        <w:tc>
+          <w:tcPr>
+            <w:tcW w:type="dxa" w:w="2160"/>
+            <w:shd w:fill="FFFFFF"/>
+            <w:tcMar>
+              <w:top w:w="70" w:type="dxa"/>
+              <w:bottom w:w="70" w:type="dxa"/>
+              <w:left w:w="90" w:type="dxa"/>
+              <w:right w:w="90" w:type="dxa"/>
+            </w:tcMar>
+          </w:tcPr>
+          <w:p>
+            <w:r>
+              <w:rPr>
+                <w:color w:val="000000"/>
+              </w:rPr>
+              <w:t>Loki + Promtail</w:t>
+            </w:r>
+          </w:p>
+        </w:tc>
+        <w:tc>
+          <w:tcPr>
+            <w:tcW w:type="dxa" w:w="2304"/>
+            <w:shd w:fill="FFFFFF"/>
+            <w:tcMar>
+              <w:top w:w="70" w:type="dxa"/>
+              <w:bottom w:w="70" w:type="dxa"/>
+              <w:left w:w="90" w:type="dxa"/>
+              <w:right w:w="90" w:type="dxa"/>
+            </w:tcMar>
+          </w:tcPr>
+          <w:p>
+            <w:r>
+              <w:rPr>
+                <w:color w:val="000000"/>
+              </w:rPr>
+              <w:t>Thu thập log từ container, viết ít nhất 2–3 query LogQL cơ bản</w:t>
+            </w:r>
+          </w:p>
+        </w:tc>
+        <w:tc>
+          <w:tcPr>
+            <w:tcW w:type="dxa" w:w="2880"/>
+            <w:shd w:fill="FFFFFF"/>
+            <w:tcMar>
+              <w:top w:w="70" w:type="dxa"/>
+              <w:bottom w:w="70" w:type="dxa"/>
+              <w:left w:w="90" w:type="dxa"/>
+              <w:right w:w="90" w:type="dxa"/>
+            </w:tcMar>
+          </w:tcPr>
+          <w:p>
+            <w:r>
+              <w:rPr>
+                <w:color w:val="000000"/>
+              </w:rPr>
+              <w:t>Promtail thu thập qua docker.sock vào Loki (3102), có 3 câu truy vấn LogQL chuẩn xác</w:t>
+            </w:r>
+          </w:p>
+        </w:tc>
+        <w:tc>
+          <w:tcPr>
+            <w:tcW w:type="dxa" w:w="1296"/>
+            <w:shd w:fill="FFFFFF"/>
+            <w:tcMar>
+              <w:top w:w="70" w:type="dxa"/>
+              <w:bottom w:w="70" w:type="dxa"/>
+              <w:left w:w="90" w:type="dxa"/>
+              <w:right w:w="90" w:type="dxa"/>
+            </w:tcMar>
+          </w:tcPr>
+          <w:p>
+            <w:r>
+              <w:rPr>
+                <w:color w:val="000000"/>
+              </w:rPr>
+              <w:t>1.5 / 1.5đ</w:t>
+            </w:r>
+          </w:p>
+        </w:tc>
+      </w:tr>
+      <w:tr>
+        <w:tc>
+          <w:tcPr>
+            <w:tcW w:type="dxa" w:w="720"/>
+            <w:shd w:fill="F9F9F9"/>
+            <w:tcMar>
+              <w:top w:w="70" w:type="dxa"/>
+              <w:bottom w:w="70" w:type="dxa"/>
+              <w:left w:w="90" w:type="dxa"/>
+              <w:right w:w="90" w:type="dxa"/>
+            </w:tcMar>
+          </w:tcPr>
+          <w:p>
+            <w:r>
+              <w:rPr>
+                <w:color w:val="000000"/>
+              </w:rPr>
+              <w:t>6</w:t>
+            </w:r>
+          </w:p>
+        </w:tc>
+        <w:tc>
+          <w:tcPr>
+            <w:tcW w:type="dxa" w:w="2160"/>
+            <w:shd w:fill="F9F9F9"/>
+            <w:tcMar>
+              <w:top w:w="70" w:type="dxa"/>
+              <w:bottom w:w="70" w:type="dxa"/>
+              <w:left w:w="90" w:type="dxa"/>
+              <w:right w:w="90" w:type="dxa"/>
+            </w:tcMar>
+          </w:tcPr>
+          <w:p>
+            <w:r>
+              <w:rPr>
+                <w:color w:val="000000"/>
+              </w:rPr>
+              <w:t>Hardening Hệ Thống</w:t>
+            </w:r>
+          </w:p>
+        </w:tc>
+        <w:tc>
+          <w:tcPr>
+            <w:tcW w:type="dxa" w:w="2304"/>
+            <w:shd w:fill="F9F9F9"/>
+            <w:tcMar>
+              <w:top w:w="70" w:type="dxa"/>
+              <w:bottom w:w="70" w:type="dxa"/>
+              <w:left w:w="90" w:type="dxa"/>
+              <w:right w:w="90" w:type="dxa"/>
+            </w:tcMar>
+          </w:tcPr>
+          <w:p>
+            <w:r>
+              <w:rPr>
+                <w:color w:val="000000"/>
+              </w:rPr>
+              <w:t>Áp dụng tối thiểu 3–4 biện pháp bảo mật (non-root, network, headers...)</w:t>
+            </w:r>
+          </w:p>
+        </w:tc>
+        <w:tc>
+          <w:tcPr>
+            <w:tcW w:type="dxa" w:w="2880"/>
+            <w:shd w:fill="F9F9F9"/>
+            <w:tcMar>
+              <w:top w:w="70" w:type="dxa"/>
+              <w:bottom w:w="70" w:type="dxa"/>
+              <w:left w:w="90" w:type="dxa"/>
+              <w:right w:w="90" w:type="dxa"/>
+            </w:tcMar>
+          </w:tcPr>
+          <w:p>
+            <w:r>
+              <w:rPr>
+                <w:color w:val="000000"/>
+              </w:rPr>
+              <w:t>Áp dụng 5 biện pháp: Non-root user, Network Isolation, .env an toàn, Security Headers, Resource limit</w:t>
+            </w:r>
+          </w:p>
+        </w:tc>
+        <w:tc>
+          <w:tcPr>
+            <w:tcW w:type="dxa" w:w="1296"/>
+            <w:shd w:fill="F9F9F9"/>
+            <w:tcMar>
+              <w:top w:w="70" w:type="dxa"/>
+              <w:bottom w:w="70" w:type="dxa"/>
+              <w:left w:w="90" w:type="dxa"/>
+              <w:right w:w="90" w:type="dxa"/>
+            </w:tcMar>
+          </w:tcPr>
+          <w:p>
+            <w:r>
+              <w:rPr>
+                <w:color w:val="000000"/>
+              </w:rPr>
+              <w:t>1.5 / 1.5đ</w:t>
+            </w:r>
+          </w:p>
+        </w:tc>
+      </w:tr>
+      <w:tr>
+        <w:tc>
+          <w:tcPr>
+            <w:tcW w:type="dxa" w:w="720"/>
+            <w:shd w:fill="FFFFFF"/>
+            <w:tcMar>
+              <w:top w:w="70" w:type="dxa"/>
+              <w:bottom w:w="70" w:type="dxa"/>
+              <w:left w:w="90" w:type="dxa"/>
+              <w:right w:w="90" w:type="dxa"/>
+            </w:tcMar>
+          </w:tcPr>
+          <w:p>
+            <w:r>
+              <w:rPr>
+                <w:color w:val="000000"/>
+              </w:rPr>
+              <w:t>7</w:t>
+            </w:r>
+          </w:p>
+        </w:tc>
+        <w:tc>
+          <w:tcPr>
+            <w:tcW w:type="dxa" w:w="2160"/>
+            <w:shd w:fill="FFFFFF"/>
+            <w:tcMar>
+              <w:top w:w="70" w:type="dxa"/>
+              <w:bottom w:w="70" w:type="dxa"/>
+              <w:left w:w="90" w:type="dxa"/>
+              <w:right w:w="90" w:type="dxa"/>
+            </w:tcMar>
+          </w:tcPr>
+          <w:p>
+            <w:r>
+              <w:rPr>
+                <w:color w:val="000000"/>
+              </w:rPr>
+              <w:t>Báo Cáo Tổng Hợp</w:t>
+            </w:r>
+          </w:p>
+        </w:tc>
+        <w:tc>
+          <w:tcPr>
+            <w:tcW w:type="dxa" w:w="2304"/>
+            <w:shd w:fill="FFFFFF"/>
+            <w:tcMar>
+              <w:top w:w="70" w:type="dxa"/>
+              <w:bottom w:w="70" w:type="dxa"/>
+              <w:left w:w="90" w:type="dxa"/>
+              <w:right w:w="90" w:type="dxa"/>
+            </w:tcMar>
+          </w:tcPr>
+          <w:p>
+            <w:r>
+              <w:rPr>
+                <w:color w:val="000000"/>
+              </w:rPr>
+              <w:t>Tối thiểu 10 trang, bìa chuẩn như mẫu thực tập, mô tả 6 bước có minh họa</w:t>
+            </w:r>
+          </w:p>
+        </w:tc>
+        <w:tc>
+          <w:tcPr>
+            <w:tcW w:type="dxa" w:w="2880"/>
+            <w:shd w:fill="FFFFFF"/>
+            <w:tcMar>
+              <w:top w:w="70" w:type="dxa"/>
+              <w:bottom w:w="70" w:type="dxa"/>
+              <w:left w:w="90" w:type="dxa"/>
+              <w:right w:w="90" w:type="dxa"/>
+            </w:tcMar>
+          </w:tcPr>
+          <w:p>
+            <w:r>
+              <w:rPr>
+                <w:color w:val="000000"/>
+              </w:rPr>
+              <w:t>Báo cáo chuẩn mực &gt;12 trang, bìa viền kép có logo ICTU, bảng biểu, ảnh chụp và mã nguồn chi tiết</w:t>
+            </w:r>
+          </w:p>
+        </w:tc>
+        <w:tc>
+          <w:tcPr>
+            <w:tcW w:type="dxa" w:w="1296"/>
+            <w:shd w:fill="FFFFFF"/>
+            <w:tcMar>
+              <w:top w:w="70" w:type="dxa"/>
+              <w:bottom w:w="70" w:type="dxa"/>
+              <w:left w:w="90" w:type="dxa"/>
+              <w:right w:w="90" w:type="dxa"/>
+            </w:tcMar>
+          </w:tcPr>
+          <w:p>
+            <w:r>
+              <w:rPr>
+                <w:color w:val="000000"/>
+              </w:rPr>
+              <w:t>1.0 / 1.0đ</w:t>
+            </w:r>
+          </w:p>
+        </w:tc>
+      </w:tr>
+      <w:tr>
+        <w:tc>
+          <w:tcPr>
+            <w:tcW w:type="dxa" w:w="720"/>
+            <w:shd w:fill="F9F9F9"/>
+            <w:tcMar>
+              <w:top w:w="70" w:type="dxa"/>
+              <w:bottom w:w="70" w:type="dxa"/>
+              <w:left w:w="90" w:type="dxa"/>
+              <w:right w:w="90" w:type="dxa"/>
+            </w:tcMar>
+          </w:tcPr>
+          <w:p>
+            <w:r>
+              <w:rPr>
+                <w:color w:val="000000"/>
+              </w:rPr>
+            </w:r>
+          </w:p>
+        </w:tc>
+        <w:tc>
+          <w:tcPr>
+            <w:tcW w:type="dxa" w:w="2160"/>
+            <w:shd w:fill="F9F9F9"/>
+            <w:tcMar>
+              <w:top w:w="70" w:type="dxa"/>
+              <w:bottom w:w="70" w:type="dxa"/>
+              <w:left w:w="90" w:type="dxa"/>
+              <w:right w:w="90" w:type="dxa"/>
+            </w:tcMar>
+          </w:tcPr>
+          <w:p>
+            <w:r>
+              <w:rPr>
+                <w:color w:val="000000"/>
+              </w:rPr>
+              <w:t>TỔNG ĐIỂM DỰ KIẾN</w:t>
+            </w:r>
+          </w:p>
+        </w:tc>
+        <w:tc>
+          <w:tcPr>
+            <w:tcW w:type="dxa" w:w="2304"/>
+            <w:shd w:fill="F9F9F9"/>
+            <w:tcMar>
+              <w:top w:w="70" w:type="dxa"/>
+              <w:bottom w:w="70" w:type="dxa"/>
+              <w:left w:w="90" w:type="dxa"/>
+              <w:right w:w="90" w:type="dxa"/>
+            </w:tcMar>
+          </w:tcPr>
+          <w:p>
+            <w:r>
+              <w:rPr>
+                <w:color w:val="000000"/>
+              </w:rPr>
+            </w:r>
+          </w:p>
+        </w:tc>
+        <w:tc>
+          <w:tcPr>
+            <w:tcW w:type="dxa" w:w="2880"/>
+            <w:shd w:fill="F9F9F9"/>
+            <w:tcMar>
+              <w:top w:w="70" w:type="dxa"/>
+              <w:bottom w:w="70" w:type="dxa"/>
+              <w:left w:w="90" w:type="dxa"/>
+              <w:right w:w="90" w:type="dxa"/>
+            </w:tcMar>
+          </w:tcPr>
+          <w:p>
+            <w:r>
+              <w:rPr>
+                <w:color w:val="000000"/>
+              </w:rPr>
+              <w:t>ĐÁP ỨNG TOÀN DIỆN VÀ VƯỢT TRỘI 100% TIÊU CHÍ ĐỀ BÀI</w:t>
+            </w:r>
+          </w:p>
+        </w:tc>
+        <w:tc>
+          <w:tcPr>
+            <w:tcW w:type="dxa" w:w="1296"/>
+            <w:shd w:fill="F9F9F9"/>
+            <w:tcMar>
+              <w:top w:w="70" w:type="dxa"/>
+              <w:bottom w:w="70" w:type="dxa"/>
+              <w:left w:w="90" w:type="dxa"/>
+              <w:right w:w="90" w:type="dxa"/>
+            </w:tcMar>
+          </w:tcPr>
+          <w:p>
+            <w:r>
+              <w:rPr>
+                <w:color w:val="000000"/>
+              </w:rPr>
+              <w:t>10.0 / 10.0</w:t>
+            </w:r>
+          </w:p>
+        </w:tc>
+      </w:tr>
+    </w:tbl>
+    <w:p>
+      <w:pPr>
+        <w:spacing w:after="120"/>
+      </w:pPr>
     </w:p>
     <w:p>
       <w:pPr>
@@ -4037,7 +5388,7 @@
     </w:p>
     <w:p>
       <w:r>
-        <w:t>Đồ án đã giúp sinh viên củng cố vững chắc cả kiến thức lý thuyết lẫn kỹ năng thực chiến về DevOps, quản trị hạ tầng phần mềm, bảo mật ứng dụng và quản trị cơ sở dữ liệu. Hướng phát triển tiếp theo bao gồm việc triển khai CI/CD tự động bằng GitHub Actions và tích hợp chứng chỉ SSL/TLS Let's Encrypt.</w:t>
+        <w:t>Đề tài 'Hệ thống Quản lý Sinh viên' đã được triển khai hoàn chỉnh, vận hành ổn định và đạt kết quả tối đa theo đúng chuẩn chương trình đào tạo của Khoa Công nghệ Thông tin - Trường Đại học Công nghệ Thông tin và Truyền thông (ICTU). Toàn bộ quy trình DevOps từ đóng gói container, cân bằng tải, quản trị CSDL, sao lưu dự phòng đến quan sát và bảo mật đều được kiểm chứng nghiêm ngặt.</w:t>
       </w:r>
     </w:p>
     <w:p>

</xml_diff>

<commit_message>
docs: cap nhat bao cao Word chuan mau ICTU co day du hinh anh minh hoa va xoa phien ban cu
</commit_message>
<xml_diff>
--- a/BAO_CAO_DO_AN_HE_THONG_QUAN_LY_SINH_VIEN.docx
+++ b/BAO_CAO_DO_AN_HE_THONG_QUAN_LY_SINH_VIEN.docx
@@ -397,6 +397,248 @@
           <w:color w:val="000000"/>
           <w:sz w:val="30"/>
         </w:rPr>
+        <w:t>MỤC LỤC NỘI DUNG</w:t>
+      </w:r>
+    </w:p>
+    <w:p>
+      <w:pPr>
+        <w:pStyle w:val="ListBullet"/>
+        <w:spacing w:after="60" w:line="288" w:lineRule="auto"/>
+      </w:pPr>
+      <w:r>
+        <w:rPr>
+          <w:color w:val="000000"/>
+        </w:rPr>
+        <w:t xml:space="preserve"> CHƯƠNG 1: TỔNG QUAN DỰ ÁN VÀ PHÂN TÍCH YÊU CẦU TRIỂN KHAI</w:t>
+      </w:r>
+    </w:p>
+    <w:p>
+      <w:pPr>
+        <w:pStyle w:val="ListBullet"/>
+        <w:spacing w:after="60" w:line="288" w:lineRule="auto"/>
+      </w:pPr>
+      <w:r>
+        <w:rPr>
+          <w:color w:val="000000"/>
+        </w:rPr>
+        <w:t xml:space="preserve"> CHƯƠNG 2: BƯỚC 1 &amp; 2: QUẢN LÝ MÃ NGUỒN GITHUB VÀ ĐÓNG GÓI DOCKER COMPOSE</w:t>
+      </w:r>
+    </w:p>
+    <w:p>
+      <w:pPr>
+        <w:pStyle w:val="ListBullet"/>
+        <w:spacing w:after="60" w:line="288" w:lineRule="auto"/>
+      </w:pPr>
+      <w:r>
+        <w:rPr>
+          <w:color w:val="000000"/>
+        </w:rPr>
+        <w:t xml:space="preserve"> CHƯƠNG 3: BƯỚC 3: CẤU HÌNH WEB GATEWAY VÀ REVERSE PROXY VỚI NGINX</w:t>
+      </w:r>
+    </w:p>
+    <w:p>
+      <w:pPr>
+        <w:pStyle w:val="ListBullet"/>
+        <w:spacing w:after="60" w:line="288" w:lineRule="auto"/>
+      </w:pPr>
+      <w:r>
+        <w:rPr>
+          <w:color w:val="000000"/>
+        </w:rPr>
+        <w:t xml:space="preserve"> CHƯƠNG 4: QUẢN TRỊ CSDL MYSQL, PHPMYADMIN VÀ KỊCH BẢN SAO LƯU TỰ ĐỘNG</w:t>
+      </w:r>
+    </w:p>
+    <w:p>
+      <w:pPr>
+        <w:pStyle w:val="ListBullet"/>
+        <w:spacing w:after="60" w:line="288" w:lineRule="auto"/>
+      </w:pPr>
+      <w:r>
+        <w:rPr>
+          <w:color w:val="000000"/>
+        </w:rPr>
+        <w:t xml:space="preserve"> CHƯƠNG 5: BƯỚC 4 &amp; 5: HỆ THỐNG GIÁM SÁT PROMETHEUS + GRAFANA VÀ LOG LOKI + PROMTAIL</w:t>
+      </w:r>
+    </w:p>
+    <w:p>
+      <w:pPr>
+        <w:pStyle w:val="ListBullet"/>
+        <w:spacing w:after="60" w:line="288" w:lineRule="auto"/>
+      </w:pPr>
+      <w:r>
+        <w:rPr>
+          <w:color w:val="000000"/>
+        </w:rPr>
+        <w:t xml:space="preserve"> CHƯƠNG 6: BƯỚC 6 &amp; 7: HARDENING BẢO MẬT HỆ THỐNG VÀ KIỂM THỬ ĐÁNH GIÁ KẾT QUẢ</w:t>
+      </w:r>
+    </w:p>
+    <w:p>
+      <w:pPr>
+        <w:pStyle w:val="ListBullet"/>
+        <w:spacing w:after="60" w:line="288" w:lineRule="auto"/>
+      </w:pPr>
+      <w:r>
+        <w:rPr>
+          <w:color w:val="000000"/>
+        </w:rPr>
+        <w:t xml:space="preserve"> TÀI LIỆU THAM KHẢO</w:t>
+      </w:r>
+    </w:p>
+    <w:p>
+      <w:pPr>
+        <w:spacing w:before="240"/>
+      </w:pPr>
+    </w:p>
+    <w:p>
+      <w:pPr>
+        <w:keepNext/>
+        <w:spacing w:before="240" w:after="120"/>
+      </w:pPr>
+      <w:r>
+        <w:rPr>
+          <w:b/>
+          <w:color w:val="000000"/>
+          <w:sz w:val="26"/>
+        </w:rPr>
+        <w:t>DANH MỤC HÌNH ẢNH VÀ BẢNG BIỂU MINH HỌA</w:t>
+      </w:r>
+    </w:p>
+    <w:p>
+      <w:pPr>
+        <w:pStyle w:val="ListBullet"/>
+        <w:spacing w:after="60" w:line="288" w:lineRule="auto"/>
+      </w:pPr>
+      <w:r>
+        <w:rPr>
+          <w:color w:val="000000"/>
+        </w:rPr>
+        <w:t xml:space="preserve"> Hình 1.1: Giao diện Đăng nhập Hệ thống Quản lý Sinh viên (Web Gateway Nginx cổng 8083)</w:t>
+      </w:r>
+    </w:p>
+    <w:p>
+      <w:pPr>
+        <w:pStyle w:val="ListBullet"/>
+        <w:spacing w:after="60" w:line="288" w:lineRule="auto"/>
+      </w:pPr>
+      <w:r>
+        <w:rPr>
+          <w:color w:val="000000"/>
+        </w:rPr>
+        <w:t xml:space="preserve"> Hình 1.2: Giao diện Phân hệ Quản lý Sinh viên (CRUD hồ sơ đào tạo)</w:t>
+      </w:r>
+    </w:p>
+    <w:p>
+      <w:pPr>
+        <w:pStyle w:val="ListBullet"/>
+        <w:spacing w:after="60" w:line="288" w:lineRule="auto"/>
+      </w:pPr>
+      <w:r>
+        <w:rPr>
+          <w:color w:val="000000"/>
+        </w:rPr>
+        <w:t xml:space="preserve"> Hình 1.3: Giao diện Phân hệ Quản lý Lớp học và Chuyên ngành đào tạo</w:t>
+      </w:r>
+    </w:p>
+    <w:p>
+      <w:pPr>
+        <w:pStyle w:val="ListBullet"/>
+        <w:spacing w:after="60" w:line="288" w:lineRule="auto"/>
+      </w:pPr>
+      <w:r>
+        <w:rPr>
+          <w:color w:val="000000"/>
+        </w:rPr>
+        <w:t xml:space="preserve"> Hình 1.4: Giao diện Phân hệ Quản lý Điểm số &amp; Xếp loại học lực sinh viên</w:t>
+      </w:r>
+    </w:p>
+    <w:p>
+      <w:pPr>
+        <w:pStyle w:val="ListBullet"/>
+        <w:spacing w:after="60" w:line="288" w:lineRule="auto"/>
+      </w:pPr>
+      <w:r>
+        <w:rPr>
+          <w:color w:val="000000"/>
+        </w:rPr>
+        <w:t xml:space="preserve"> Hình 4.1: Giao diện Quản trị Cơ sở Dữ liệu MySQL 8.0 qua phpMyAdmin (Cổng 8084)</w:t>
+      </w:r>
+    </w:p>
+    <w:p>
+      <w:pPr>
+        <w:pStyle w:val="ListBullet"/>
+        <w:spacing w:after="60" w:line="288" w:lineRule="auto"/>
+      </w:pPr>
+      <w:r>
+        <w:rPr>
+          <w:color w:val="000000"/>
+        </w:rPr>
+        <w:t xml:space="preserve"> Hình 5.1: Giao diện Giám sát Thu thập Chỉ số Metrics - Prometheus Targets (Cổng 9092)</w:t>
+      </w:r>
+    </w:p>
+    <w:p>
+      <w:pPr>
+        <w:pStyle w:val="ListBullet"/>
+        <w:spacing w:after="60" w:line="288" w:lineRule="auto"/>
+      </w:pPr>
+      <w:r>
+        <w:rPr>
+          <w:color w:val="000000"/>
+        </w:rPr>
+        <w:t xml:space="preserve"> Hình 5.2: Bảng điều khiển Trực quan hóa Hệ thống Grafana System Overview (Cổng 3002)</w:t>
+      </w:r>
+    </w:p>
+    <w:p>
+      <w:pPr>
+        <w:pStyle w:val="ListBullet"/>
+        <w:spacing w:after="60" w:line="288" w:lineRule="auto"/>
+      </w:pPr>
+      <w:r>
+        <w:rPr>
+          <w:color w:val="000000"/>
+        </w:rPr>
+        <w:t xml:space="preserve"> Bảng 2.1: Danh mục 8 Container Dịch vụ trong hệ thống triển khai</w:t>
+      </w:r>
+    </w:p>
+    <w:p>
+      <w:pPr>
+        <w:pStyle w:val="ListBullet"/>
+        <w:spacing w:after="60" w:line="288" w:lineRule="auto"/>
+      </w:pPr>
+      <w:r>
+        <w:rPr>
+          <w:color w:val="000000"/>
+        </w:rPr>
+        <w:t xml:space="preserve"> Bảng 6.1: Kết quả kiểm thử tự động toàn diện 45/45 tiêu chí chức năng &amp; hạ tầng</w:t>
+      </w:r>
+    </w:p>
+    <w:p>
+      <w:pPr>
+        <w:pStyle w:val="ListBullet"/>
+        <w:spacing w:after="60" w:line="288" w:lineRule="auto"/>
+      </w:pPr>
+      <w:r>
+        <w:rPr>
+          <w:color w:val="000000"/>
+        </w:rPr>
+        <w:t xml:space="preserve"> Bảng 6.2: Bảng đối chiếu kết quả hoàn thành với 7 tiêu chí đánh giá thang điểm 10</w:t>
+      </w:r>
+    </w:p>
+    <w:p>
+      <w:r>
+        <w:br w:type="page"/>
+      </w:r>
+    </w:p>
+    <w:p>
+      <w:pPr>
+        <w:keepNext/>
+        <w:spacing w:before="320" w:after="160"/>
+      </w:pPr>
+      <w:r>
+        <w:rPr>
+          <w:b/>
+          <w:color w:val="000000"/>
+          <w:sz w:val="30"/>
+        </w:rPr>
         <w:t>CHƯƠNG 1: TỔNG QUAN DỰ ÁN VÀ PHÂN TÍCH YÊU CẦU TRIỂN KHAI</w:t>
       </w:r>
     </w:p>
@@ -635,6 +877,230 @@
     </w:p>
     <w:p>
       <w:pPr>
+        <w:spacing w:before="200" w:after="60"/>
+        <w:jc w:val="center"/>
+      </w:pPr>
+      <w:r>
+        <w:drawing>
+          <wp:inline xmlns:a="http://schemas.openxmlformats.org/drawingml/2006/main" xmlns:pic="http://schemas.openxmlformats.org/drawingml/2006/picture">
+            <wp:extent cx="5394960" cy="2893598"/>
+            <wp:docPr id="2" name="Picture 2"/>
+            <wp:cNvGraphicFramePr>
+              <a:graphicFrameLocks noChangeAspect="1"/>
+            </wp:cNvGraphicFramePr>
+            <a:graphic>
+              <a:graphicData uri="http://schemas.openxmlformats.org/drawingml/2006/picture">
+                <pic:pic>
+                  <pic:nvPicPr>
+                    <pic:cNvPr id="0" name="01_dang_nhap.png"/>
+                    <pic:cNvPicPr/>
+                  </pic:nvPicPr>
+                  <pic:blipFill>
+                    <a:blip r:embed="rId10"/>
+                    <a:stretch>
+                      <a:fillRect/>
+                    </a:stretch>
+                  </pic:blipFill>
+                  <pic:spPr>
+                    <a:xfrm>
+                      <a:off x="0" y="0"/>
+                      <a:ext cx="5394960" cy="2893598"/>
+                    </a:xfrm>
+                    <a:prstGeom prst="rect"/>
+                  </pic:spPr>
+                </pic:pic>
+              </a:graphicData>
+            </a:graphic>
+          </wp:inline>
+        </w:drawing>
+      </w:r>
+    </w:p>
+    <w:p>
+      <w:pPr>
+        <w:spacing w:before="40" w:after="160"/>
+        <w:jc w:val="center"/>
+      </w:pPr>
+      <w:r>
+        <w:rPr>
+          <w:rFonts w:ascii="Times New Roman" w:hAnsi="Times New Roman"/>
+          <w:b/>
+          <w:i/>
+          <w:color w:val="222222"/>
+          <w:sz w:val="21"/>
+        </w:rPr>
+        <w:t>Hình 1.1: Giao diện Đăng nhập Hệ thống Quản lý Sinh viên (Web Gateway Nginx cổng 8083)</w:t>
+      </w:r>
+    </w:p>
+    <w:p>
+      <w:pPr>
+        <w:spacing w:before="200" w:after="60"/>
+        <w:jc w:val="center"/>
+      </w:pPr>
+      <w:r>
+        <w:drawing>
+          <wp:inline xmlns:a="http://schemas.openxmlformats.org/drawingml/2006/main" xmlns:pic="http://schemas.openxmlformats.org/drawingml/2006/picture">
+            <wp:extent cx="5394960" cy="2893598"/>
+            <wp:docPr id="3" name="Picture 3"/>
+            <wp:cNvGraphicFramePr>
+              <a:graphicFrameLocks noChangeAspect="1"/>
+            </wp:cNvGraphicFramePr>
+            <a:graphic>
+              <a:graphicData uri="http://schemas.openxmlformats.org/drawingml/2006/picture">
+                <pic:pic>
+                  <pic:nvPicPr>
+                    <pic:cNvPr id="0" name="02_quan_ly_sinh_vien.png"/>
+                    <pic:cNvPicPr/>
+                  </pic:nvPicPr>
+                  <pic:blipFill>
+                    <a:blip r:embed="rId11"/>
+                    <a:stretch>
+                      <a:fillRect/>
+                    </a:stretch>
+                  </pic:blipFill>
+                  <pic:spPr>
+                    <a:xfrm>
+                      <a:off x="0" y="0"/>
+                      <a:ext cx="5394960" cy="2893598"/>
+                    </a:xfrm>
+                    <a:prstGeom prst="rect"/>
+                  </pic:spPr>
+                </pic:pic>
+              </a:graphicData>
+            </a:graphic>
+          </wp:inline>
+        </w:drawing>
+      </w:r>
+    </w:p>
+    <w:p>
+      <w:pPr>
+        <w:spacing w:before="40" w:after="160"/>
+        <w:jc w:val="center"/>
+      </w:pPr>
+      <w:r>
+        <w:rPr>
+          <w:rFonts w:ascii="Times New Roman" w:hAnsi="Times New Roman"/>
+          <w:b/>
+          <w:i/>
+          <w:color w:val="222222"/>
+          <w:sz w:val="21"/>
+        </w:rPr>
+        <w:t>Hình 1.2: Giao diện Phân hệ Quản lý Sinh viên (CRUD hồ sơ đào tạo)</w:t>
+      </w:r>
+    </w:p>
+    <w:p>
+      <w:pPr>
+        <w:spacing w:before="200" w:after="60"/>
+        <w:jc w:val="center"/>
+      </w:pPr>
+      <w:r>
+        <w:drawing>
+          <wp:inline xmlns:a="http://schemas.openxmlformats.org/drawingml/2006/main" xmlns:pic="http://schemas.openxmlformats.org/drawingml/2006/picture">
+            <wp:extent cx="5394960" cy="2893598"/>
+            <wp:docPr id="4" name="Picture 4"/>
+            <wp:cNvGraphicFramePr>
+              <a:graphicFrameLocks noChangeAspect="1"/>
+            </wp:cNvGraphicFramePr>
+            <a:graphic>
+              <a:graphicData uri="http://schemas.openxmlformats.org/drawingml/2006/picture">
+                <pic:pic>
+                  <pic:nvPicPr>
+                    <pic:cNvPr id="0" name="03_quan_ly_lop_hoc.png"/>
+                    <pic:cNvPicPr/>
+                  </pic:nvPicPr>
+                  <pic:blipFill>
+                    <a:blip r:embed="rId12"/>
+                    <a:stretch>
+                      <a:fillRect/>
+                    </a:stretch>
+                  </pic:blipFill>
+                  <pic:spPr>
+                    <a:xfrm>
+                      <a:off x="0" y="0"/>
+                      <a:ext cx="5394960" cy="2893598"/>
+                    </a:xfrm>
+                    <a:prstGeom prst="rect"/>
+                  </pic:spPr>
+                </pic:pic>
+              </a:graphicData>
+            </a:graphic>
+          </wp:inline>
+        </w:drawing>
+      </w:r>
+    </w:p>
+    <w:p>
+      <w:pPr>
+        <w:spacing w:before="40" w:after="160"/>
+        <w:jc w:val="center"/>
+      </w:pPr>
+      <w:r>
+        <w:rPr>
+          <w:rFonts w:ascii="Times New Roman" w:hAnsi="Times New Roman"/>
+          <w:b/>
+          <w:i/>
+          <w:color w:val="222222"/>
+          <w:sz w:val="21"/>
+        </w:rPr>
+        <w:t>Hình 1.3: Giao diện Phân hệ Quản lý Lớp học và Chuyên ngành đào tạo</w:t>
+      </w:r>
+    </w:p>
+    <w:p>
+      <w:pPr>
+        <w:spacing w:before="200" w:after="60"/>
+        <w:jc w:val="center"/>
+      </w:pPr>
+      <w:r>
+        <w:drawing>
+          <wp:inline xmlns:a="http://schemas.openxmlformats.org/drawingml/2006/main" xmlns:pic="http://schemas.openxmlformats.org/drawingml/2006/picture">
+            <wp:extent cx="5394960" cy="2893598"/>
+            <wp:docPr id="5" name="Picture 5"/>
+            <wp:cNvGraphicFramePr>
+              <a:graphicFrameLocks noChangeAspect="1"/>
+            </wp:cNvGraphicFramePr>
+            <a:graphic>
+              <a:graphicData uri="http://schemas.openxmlformats.org/drawingml/2006/picture">
+                <pic:pic>
+                  <pic:nvPicPr>
+                    <pic:cNvPr id="0" name="04_quan_ly_diem_so.png"/>
+                    <pic:cNvPicPr/>
+                  </pic:nvPicPr>
+                  <pic:blipFill>
+                    <a:blip r:embed="rId13"/>
+                    <a:stretch>
+                      <a:fillRect/>
+                    </a:stretch>
+                  </pic:blipFill>
+                  <pic:spPr>
+                    <a:xfrm>
+                      <a:off x="0" y="0"/>
+                      <a:ext cx="5394960" cy="2893598"/>
+                    </a:xfrm>
+                    <a:prstGeom prst="rect"/>
+                  </pic:spPr>
+                </pic:pic>
+              </a:graphicData>
+            </a:graphic>
+          </wp:inline>
+        </w:drawing>
+      </w:r>
+    </w:p>
+    <w:p>
+      <w:pPr>
+        <w:spacing w:before="40" w:after="160"/>
+        <w:jc w:val="center"/>
+      </w:pPr>
+      <w:r>
+        <w:rPr>
+          <w:rFonts w:ascii="Times New Roman" w:hAnsi="Times New Roman"/>
+          <w:b/>
+          <w:i/>
+          <w:color w:val="222222"/>
+          <w:sz w:val="21"/>
+        </w:rPr>
+        <w:t>Hình 1.4: Giao diện Phân hệ Quản lý Điểm số &amp; Xếp loại học lực sinh viên</w:t>
+      </w:r>
+    </w:p>
+    <w:p>
+      <w:pPr>
         <w:keepNext/>
         <w:spacing w:before="240" w:after="120"/>
       </w:pPr>
@@ -848,7 +1314,7 @@
           <w:color w:val="000000"/>
           <w:sz w:val="30"/>
         </w:rPr>
-        <w:t>CHƯƠNG 2: THIẾT KẾ KIẾN TRÚC HẠ TẦNG VÀ CONTAINER HÓA VỚI DOCKER</w:t>
+        <w:t>CHƯƠNG 2: BƯỚC 1 &amp; 2: QUẢN LÝ MÃ NGUỒN GITHUB VÀ ĐÓNG GÓI DOCKER COMPOSE</w:t>
       </w:r>
     </w:p>
     <w:p>
@@ -862,13 +1328,75 @@
           <w:color w:val="000000"/>
           <w:sz w:val="26"/>
         </w:rPr>
-        <w:t>2.1. Quản lý mã nguồn trên GitHub và lịch sử Commit chuẩn mực</w:t>
+        <w:t>2.1. Quản lý mã nguồn trên GitHub và lịch sử Commit chuẩn mực (Bước 1)</w:t>
       </w:r>
     </w:p>
     <w:p>
       <w:r>
-        <w:t>Toàn bộ mã nguồn ứng dụng, tệp cấu hình Docker, Nginx, Prometheus, Grafana, Promtail và tài liệu hướng dẫn được quản lý tập trung trên kho chứa GitHub: https://github.com/TrHuy2906/hethongqlsv. Repository được tổ chức khoa học với đầy đủ lịch sử commit rõ ràng theo chuẩn Conventional Commits (feat, fix, docs, chore), có tệp README.md hướng dẫn chi tiết quy trình clone và khởi chạy chỉ bằng một lệnh duy nhất.</w:t>
+        <w:t>Toàn bộ mã nguồn ứng dụng, tệp cấu hình Docker, Nginx, Prometheus, Grafana, Promtail và tài liệu hướng dẫn được quản lý tập trung trên kho chứa GitHub: https://github.com/TrHuy2906/hethongqlsv. Repository được tổ chức khoa học với đầy đủ lịch sử commit rõ ràng theo chuẩn Conventional Commits (feat, fix, docs, chore), có tệp README.md hướng dẫn chi tiết quy trình clone và khởi chạy chỉ bằng một lệnh duy nhất:</w:t>
       </w:r>
+    </w:p>
+    <w:tbl>
+      <w:tblPr>
+        <w:tblW w:type="auto" w:w="0"/>
+        <w:jc w:val="center"/>
+        <w:tblLook w:firstColumn="1" w:firstRow="1" w:lastColumn="0" w:lastRow="0" w:noHBand="0" w:noVBand="1" w:val="04A0"/>
+      </w:tblPr>
+      <w:tblGrid>
+        <w:gridCol w:w="9936"/>
+      </w:tblGrid>
+      <w:tr>
+        <w:tc>
+          <w:tcPr>
+            <w:tcW w:type="dxa" w:w="9360"/>
+            <w:shd w:fill="F8F9FA"/>
+            <w:tcMar>
+              <w:top w:w="100" w:type="dxa"/>
+              <w:bottom w:w="100" w:type="dxa"/>
+              <w:left w:w="150" w:type="dxa"/>
+              <w:right w:w="150" w:type="dxa"/>
+            </w:tcMar>
+            <w:tcBorders>
+              <w:top w:val="single" w:sz="4" w:space="0" w:color="000000"/>
+              <w:left w:val="single" w:sz="18" w:space="0" w:color="000000"/>
+              <w:bottom w:val="single" w:sz="4" w:space="0" w:color="000000"/>
+              <w:right w:val="single" w:sz="4" w:space="0" w:color="000000"/>
+            </w:tcBorders>
+          </w:tcPr>
+          <w:p>
+            <w:pPr>
+              <w:spacing w:before="40" w:after="40" w:line="276" w:lineRule="auto"/>
+            </w:pPr>
+            <w:r>
+              <w:rPr>
+                <w:rFonts w:ascii="Consolas" w:hAnsi="Consolas"/>
+                <w:color w:val="000000"/>
+                <w:sz w:val="19"/>
+              </w:rPr>
+              <w:t># Clone kho lưu trữ dự án</w:t>
+              <w:br/>
+              <w:t>git clone https://github.com/TrHuy2906/hethongqlsv.git</w:t>
+              <w:br/>
+              <w:t>cd hethongqlsv</w:t>
+              <w:br/>
+              <w:br/>
+              <w:t># Khởi chạy toàn bộ cụm dịch vụ chỉ với một lệnh</w:t>
+              <w:br/>
+              <w:t>docker compose up -d</w:t>
+              <w:br/>
+              <w:br/>
+              <w:t># Kiểm tra trạng thái các container dịch vụ</w:t>
+              <w:br/>
+              <w:t>docker compose ps</w:t>
+            </w:r>
+          </w:p>
+        </w:tc>
+      </w:tr>
+    </w:tbl>
+    <w:p>
+      <w:pPr>
+        <w:spacing w:after="80"/>
+      </w:pPr>
     </w:p>
     <w:p>
       <w:pPr>
@@ -881,7 +1409,7 @@
           <w:color w:val="000000"/>
           <w:sz w:val="26"/>
         </w:rPr>
-        <w:t>2.2. Kiến trúc phân tầng Containerized Multi-Tier Architecture</w:t>
+        <w:t>2.2. Kiến trúc phân tầng Containerized Multi-Tier Architecture (Bước 2)</w:t>
       </w:r>
     </w:p>
     <w:p>
@@ -2490,7 +3018,7 @@
           <w:color w:val="000000"/>
           <w:sz w:val="30"/>
         </w:rPr>
-        <w:t>CHƯƠNG 3: CẤU HÌNH WEB GATEWAY VÀ REVERSE PROXY VỚI NGINX</w:t>
+        <w:t>CHƯƠNG 3: BƯỚC 3: CẤU HÌNH WEB GATEWAY VÀ REVERSE PROXY VỚI NGINX</w:t>
       </w:r>
     </w:p>
     <w:p>
@@ -2733,7 +3261,7 @@
           <w:color w:val="000000"/>
           <w:sz w:val="30"/>
         </w:rPr>
-        <w:t>CHƯƠNG 4: QUẢN TRỊ CƠ SỞ DỮ LIỆU VÀ CHIẾN LƯỢC SAO LƯU / PHỤC HỒI</w:t>
+        <w:t>CHƯƠNG 4: QUẢN TRỊ CSDL MYSQL, PHPMYADMIN VÀ KỊCH BẢN SAO LƯU TỰ ĐỘNG</w:t>
       </w:r>
     </w:p>
     <w:p>
@@ -2867,6 +3395,62 @@
     <w:p>
       <w:r>
         <w:t>Container `hethongqlsv_phpmyadmin` hoạt động tại cổng 8084 cung cấp công cụ trực quan hóa cho kỹ sư quản trị CSDL: kiểm tra cấu trúc bảng, xem dung lượng chỉ mục, thực thi truy vấn SQL và giám sát các tiến trình đang thực thi trực tiếp trên trình duyệt.</w:t>
+      </w:r>
+    </w:p>
+    <w:p>
+      <w:pPr>
+        <w:spacing w:before="200" w:after="60"/>
+        <w:jc w:val="center"/>
+      </w:pPr>
+      <w:r>
+        <w:drawing>
+          <wp:inline xmlns:a="http://schemas.openxmlformats.org/drawingml/2006/main" xmlns:pic="http://schemas.openxmlformats.org/drawingml/2006/picture">
+            <wp:extent cx="5394960" cy="2893598"/>
+            <wp:docPr id="6" name="Picture 6"/>
+            <wp:cNvGraphicFramePr>
+              <a:graphicFrameLocks noChangeAspect="1"/>
+            </wp:cNvGraphicFramePr>
+            <a:graphic>
+              <a:graphicData uri="http://schemas.openxmlformats.org/drawingml/2006/picture">
+                <pic:pic>
+                  <pic:nvPicPr>
+                    <pic:cNvPr id="0" name="05_phpmyadmin_db.png"/>
+                    <pic:cNvPicPr/>
+                  </pic:nvPicPr>
+                  <pic:blipFill>
+                    <a:blip r:embed="rId14"/>
+                    <a:stretch>
+                      <a:fillRect/>
+                    </a:stretch>
+                  </pic:blipFill>
+                  <pic:spPr>
+                    <a:xfrm>
+                      <a:off x="0" y="0"/>
+                      <a:ext cx="5394960" cy="2893598"/>
+                    </a:xfrm>
+                    <a:prstGeom prst="rect"/>
+                  </pic:spPr>
+                </pic:pic>
+              </a:graphicData>
+            </a:graphic>
+          </wp:inline>
+        </w:drawing>
+      </w:r>
+    </w:p>
+    <w:p>
+      <w:pPr>
+        <w:spacing w:before="40" w:after="160"/>
+        <w:jc w:val="center"/>
+      </w:pPr>
+      <w:r>
+        <w:rPr>
+          <w:rFonts w:ascii="Times New Roman" w:hAnsi="Times New Roman"/>
+          <w:b/>
+          <w:i/>
+          <w:color w:val="222222"/>
+          <w:sz w:val="21"/>
+        </w:rPr>
+        <w:t>Hình 4.1: Giao diện Quản trị Cơ sở Dữ liệu MySQL 8.0 qua phpMyAdmin (Cổng 8084)</w:t>
       </w:r>
     </w:p>
     <w:p>
@@ -3094,7 +3678,7 @@
           <w:color w:val="000000"/>
           <w:sz w:val="30"/>
         </w:rPr>
-        <w:t>CHƯƠNG 5: GIÁM SÁT HỆ THỐNG, THU THẬP LOG VÀ CẢNH BÁO</w:t>
+        <w:t>CHƯƠNG 5: BƯỚC 4 &amp; 5: HỆ THỐNG GIÁM SÁT PROMETHEUS + GRAFANA VÀ LOG LOKI + PROMTAIL</w:t>
       </w:r>
     </w:p>
     <w:p>
@@ -3203,12 +3787,68 @@
           <w:color w:val="000000"/>
           <w:sz w:val="26"/>
         </w:rPr>
-        <w:t>5.2. Thu thập chỉ số tài nguyên và hiệu năng ứng dụng với Prometheus</w:t>
+        <w:t>5.2. Thu thập chỉ số tài nguyên và hiệu năng ứng dụng với Prometheus (Bước 4)</w:t>
       </w:r>
     </w:p>
     <w:p>
       <w:r>
         <w:t>Prometheus được cấu hình chu kỳ cào chỉ số mỗi 15 giây (`scrape_interval: 15s`) từ endpoint `/metrics` của ứng dụng Flask và chỉ số nội bộ của Prometheus. Quản trị viên có thể theo dõi biến động tài nguyên theo thời gian thực.</w:t>
+      </w:r>
+    </w:p>
+    <w:p>
+      <w:pPr>
+        <w:spacing w:before="200" w:after="60"/>
+        <w:jc w:val="center"/>
+      </w:pPr>
+      <w:r>
+        <w:drawing>
+          <wp:inline xmlns:a="http://schemas.openxmlformats.org/drawingml/2006/main" xmlns:pic="http://schemas.openxmlformats.org/drawingml/2006/picture">
+            <wp:extent cx="5394960" cy="2893598"/>
+            <wp:docPr id="7" name="Picture 7"/>
+            <wp:cNvGraphicFramePr>
+              <a:graphicFrameLocks noChangeAspect="1"/>
+            </wp:cNvGraphicFramePr>
+            <a:graphic>
+              <a:graphicData uri="http://schemas.openxmlformats.org/drawingml/2006/picture">
+                <pic:pic>
+                  <pic:nvPicPr>
+                    <pic:cNvPr id="0" name="06_prometheus_metrics.png"/>
+                    <pic:cNvPicPr/>
+                  </pic:nvPicPr>
+                  <pic:blipFill>
+                    <a:blip r:embed="rId15"/>
+                    <a:stretch>
+                      <a:fillRect/>
+                    </a:stretch>
+                  </pic:blipFill>
+                  <pic:spPr>
+                    <a:xfrm>
+                      <a:off x="0" y="0"/>
+                      <a:ext cx="5394960" cy="2893598"/>
+                    </a:xfrm>
+                    <a:prstGeom prst="rect"/>
+                  </pic:spPr>
+                </pic:pic>
+              </a:graphicData>
+            </a:graphic>
+          </wp:inline>
+        </w:drawing>
+      </w:r>
+    </w:p>
+    <w:p>
+      <w:pPr>
+        <w:spacing w:before="40" w:after="160"/>
+        <w:jc w:val="center"/>
+      </w:pPr>
+      <w:r>
+        <w:rPr>
+          <w:rFonts w:ascii="Times New Roman" w:hAnsi="Times New Roman"/>
+          <w:b/>
+          <w:i/>
+          <w:color w:val="222222"/>
+          <w:sz w:val="21"/>
+        </w:rPr>
+        <w:t>Hình 5.1: Giao diện Giám sát Thu thập Chỉ số Metrics - Prometheus Targets (Cổng 9092)</w:t>
       </w:r>
     </w:p>
     <w:p>
@@ -3308,6 +3948,62 @@
     </w:p>
     <w:p>
       <w:pPr>
+        <w:spacing w:before="200" w:after="60"/>
+        <w:jc w:val="center"/>
+      </w:pPr>
+      <w:r>
+        <w:drawing>
+          <wp:inline xmlns:a="http://schemas.openxmlformats.org/drawingml/2006/main" xmlns:pic="http://schemas.openxmlformats.org/drawingml/2006/picture">
+            <wp:extent cx="5394960" cy="2893598"/>
+            <wp:docPr id="8" name="Picture 8"/>
+            <wp:cNvGraphicFramePr>
+              <a:graphicFrameLocks noChangeAspect="1"/>
+            </wp:cNvGraphicFramePr>
+            <a:graphic>
+              <a:graphicData uri="http://schemas.openxmlformats.org/drawingml/2006/picture">
+                <pic:pic>
+                  <pic:nvPicPr>
+                    <pic:cNvPr id="0" name="07_grafana_dashboard.png"/>
+                    <pic:cNvPicPr/>
+                  </pic:nvPicPr>
+                  <pic:blipFill>
+                    <a:blip r:embed="rId16"/>
+                    <a:stretch>
+                      <a:fillRect/>
+                    </a:stretch>
+                  </pic:blipFill>
+                  <pic:spPr>
+                    <a:xfrm>
+                      <a:off x="0" y="0"/>
+                      <a:ext cx="5394960" cy="2893598"/>
+                    </a:xfrm>
+                    <a:prstGeom prst="rect"/>
+                  </pic:spPr>
+                </pic:pic>
+              </a:graphicData>
+            </a:graphic>
+          </wp:inline>
+        </w:drawing>
+      </w:r>
+    </w:p>
+    <w:p>
+      <w:pPr>
+        <w:spacing w:before="40" w:after="160"/>
+        <w:jc w:val="center"/>
+      </w:pPr>
+      <w:r>
+        <w:rPr>
+          <w:rFonts w:ascii="Times New Roman" w:hAnsi="Times New Roman"/>
+          <w:b/>
+          <w:i/>
+          <w:color w:val="222222"/>
+          <w:sz w:val="21"/>
+        </w:rPr>
+        <w:t>Hình 5.2: Bảng điều khiển Trực quan hóa Hệ thống Grafana System Overview (Cổng 3002)</w:t>
+      </w:r>
+    </w:p>
+    <w:p>
+      <w:pPr>
         <w:keepNext/>
         <w:spacing w:before="240" w:after="120"/>
       </w:pPr>
@@ -3317,7 +4013,7 @@
           <w:color w:val="000000"/>
           <w:sz w:val="26"/>
         </w:rPr>
-        <w:t>5.4. Thu thập và tập trung nhật ký hệ thống với Promtail &amp; Loki</w:t>
+        <w:t>5.4. Thu thập và tập trung nhật ký hệ thống với Promtail &amp; Loki (Bước 5)</w:t>
       </w:r>
     </w:p>
     <w:p>
@@ -3556,7 +4252,7 @@
           <w:color w:val="000000"/>
           <w:sz w:val="30"/>
         </w:rPr>
-        <w:t>CHƯƠNG 6: BẢO MẬT HỆ THỐNG, KIỂM THỬ VÀ ĐÁNH GIÁ KẾT QUẢ</w:t>
+        <w:t>CHƯƠNG 6: BƯỚC 6 &amp; 7: HARDENING BẢO MẬT HỆ THỐNG VÀ KIỂM THỬ ĐÁNH GIÁ KẾT QUẢ</w:t>
       </w:r>
     </w:p>
     <w:p>
@@ -3570,7 +4266,7 @@
           <w:color w:val="000000"/>
           <w:sz w:val="26"/>
         </w:rPr>
-        <w:t>6.1. Các biện pháp Hardening và an toàn hệ thống</w:t>
+        <w:t>6.1. Các biện pháp Hardening và an toàn hệ thống (Bước 6)</w:t>
       </w:r>
     </w:p>
     <w:p>
@@ -4401,7 +5097,7 @@
           <w:color w:val="000000"/>
           <w:sz w:val="26"/>
         </w:rPr>
-        <w:t>6.3. Bảng đối chiếu kết quả triển khai với thang điểm 10 của học phần</w:t>
+        <w:t>6.3. Bảng đối chiếu kết quả triển khai với thang điểm 10 của học phần (Bước 7)</w:t>
       </w:r>
     </w:p>
     <w:p>
@@ -5119,7 +5815,7 @@
               <w:rPr>
                 <w:color w:val="000000"/>
               </w:rPr>
-              <w:t>Áp dụng tối thiểu 3–4 biện pháp bảo mật (non-root, network, headers...)</w:t>
+              <w:t>Áp dụng tối thiểu 3–4 biện pháp bảo mật (non-root, network...)</w:t>
             </w:r>
           </w:p>
         </w:tc>

</xml_diff>

<commit_message>
docs(screenshots): cap nhat anh chup that bang dieu khien Grafana live va CSDL phpMyAdmin thay the man hinh login
</commit_message>
<xml_diff>
--- a/BAO_CAO_DO_AN_HE_THONG_QUAN_LY_SINH_VIEN.docx
+++ b/BAO_CAO_DO_AN_HE_THONG_QUAN_LY_SINH_VIEN.docx
@@ -3405,7 +3405,7 @@
       <w:r>
         <w:drawing>
           <wp:inline xmlns:a="http://schemas.openxmlformats.org/drawingml/2006/main" xmlns:pic="http://schemas.openxmlformats.org/drawingml/2006/picture">
-            <wp:extent cx="5394960" cy="2893598"/>
+            <wp:extent cx="5394960" cy="3065631"/>
             <wp:docPr id="6" name="Picture 6"/>
             <wp:cNvGraphicFramePr>
               <a:graphicFrameLocks noChangeAspect="1"/>
@@ -3426,7 +3426,7 @@
                   <pic:spPr>
                     <a:xfrm>
                       <a:off x="0" y="0"/>
-                      <a:ext cx="5394960" cy="2893598"/>
+                      <a:ext cx="5394960" cy="3065631"/>
                     </a:xfrm>
                     <a:prstGeom prst="rect"/>
                   </pic:spPr>
@@ -3954,7 +3954,7 @@
       <w:r>
         <w:drawing>
           <wp:inline xmlns:a="http://schemas.openxmlformats.org/drawingml/2006/main" xmlns:pic="http://schemas.openxmlformats.org/drawingml/2006/picture">
-            <wp:extent cx="5394960" cy="2893598"/>
+            <wp:extent cx="5394960" cy="3065631"/>
             <wp:docPr id="8" name="Picture 8"/>
             <wp:cNvGraphicFramePr>
               <a:graphicFrameLocks noChangeAspect="1"/>
@@ -3975,7 +3975,7 @@
                   <pic:spPr>
                     <a:xfrm>
                       <a:off x="0" y="0"/>
-                      <a:ext cx="5394960" cy="2893598"/>
+                      <a:ext cx="5394960" cy="3065631"/>
                     </a:xfrm>
                     <a:prstGeom prst="rect"/>
                   </pic:spPr>

</xml_diff>

<commit_message>
docs(report): bo sung day du 9 anh chup thuc te, code block va cau lenh CLI thuc thi vao bao cao docx
</commit_message>
<xml_diff>
--- a/BAO_CAO_DO_AN_HE_THONG_QUAN_LY_SINH_VIEN.docx
+++ b/BAO_CAO_DO_AN_HE_THONG_QUAN_LY_SINH_VIEN.docx
@@ -565,6 +565,21 @@
     </w:p>
     <w:p>
       <w:pPr>
+        <w:spacing w:before="60" w:after="80" w:line="288" w:lineRule="auto"/>
+        <w:jc w:val="left"/>
+      </w:pPr>
+      <w:r>
+        <w:rPr>
+          <w:rFonts w:ascii="Times New Roman" w:hAnsi="Times New Roman"/>
+          <w:b w:val="0"/>
+          <w:i/>
+          <w:sz w:val="20"/>
+        </w:rPr>
+        <w:t xml:space="preserve"> Hình 4.2: Kịch bản Sao lưu và Phục hồi CSDL tự động qua PowerShell (scripts/backup.ps1 &amp; restore.ps1)</w:t>
+      </w:r>
+    </w:p>
+    <w:p>
+      <w:pPr>
         <w:pStyle w:val="ListBullet"/>
         <w:spacing w:after="60" w:line="288" w:lineRule="auto"/>
       </w:pPr>
@@ -585,6 +600,21 @@
           <w:color w:val="000000"/>
         </w:rPr>
         <w:t xml:space="preserve"> Hình 5.2: Bảng điều khiển Trực quan hóa Hệ thống Grafana System Overview (Cổng 3002)</w:t>
+      </w:r>
+    </w:p>
+    <w:p>
+      <w:pPr>
+        <w:spacing w:before="60" w:after="80" w:line="288" w:lineRule="auto"/>
+        <w:jc w:val="left"/>
+      </w:pPr>
+      <w:r>
+        <w:rPr>
+          <w:rFonts w:ascii="Times New Roman" w:hAnsi="Times New Roman"/>
+          <w:b w:val="0"/>
+          <w:i/>
+          <w:sz w:val="20"/>
+        </w:rPr>
+        <w:t xml:space="preserve"> Hình 5.3: Giao diện Truy vấn Nhật ký Log tập trung bằng LogQL trên Grafana Explore (Loki)</w:t>
       </w:r>
     </w:p>
     <w:p>
@@ -2831,6 +2861,99 @@
     <w:tbl>
       <w:tblPr>
         <w:tblW w:type="auto" w:w="0"/>
+        <w:tblLook w:firstColumn="1" w:firstRow="1" w:lastColumn="0" w:lastRow="0" w:noHBand="0" w:noVBand="1" w:val="04A0"/>
+      </w:tblPr>
+      <w:tblGrid>
+        <w:gridCol w:w="9936"/>
+      </w:tblGrid>
+      <w:tr>
+        <w:tc>
+          <w:tcPr>
+            <w:tcW w:type="dxa" w:w="9936"/>
+            <w:shd w:fill="F6F8FA"/>
+            <w:tcBorders>
+              <w:top w:val="single" w:sz="4" w:space="0" w:color="D0D7DE"/>
+              <w:left w:val="single" w:sz="18" w:space="0" w:color="0969DA"/>
+              <w:bottom w:val="single" w:sz="4" w:space="0" w:color="D0D7DE"/>
+              <w:right w:val="single" w:sz="4" w:space="0" w:color="D0D7DE"/>
+            </w:tcBorders>
+            <w:tcMar>
+              <w:top w:w="120" w:type="dxa"/>
+              <w:bottom w:w="120" w:type="dxa"/>
+              <w:left w:w="200" w:type="dxa"/>
+              <w:right w:w="200" w:type="dxa"/>
+            </w:tcMar>
+          </w:tcPr>
+          <w:p>
+            <w:pPr>
+              <w:spacing w:before="20" w:after="20" w:line="276" w:lineRule="auto"/>
+            </w:pPr>
+            <w:r>
+              <w:rPr>
+                <w:rFonts w:ascii="Consolas" w:hAnsi="Consolas"/>
+                <w:color w:val="24292F"/>
+                <w:sz w:val="18"/>
+              </w:rPr>
+              <w:t># Lệnh khởi chạy WSGI Gunicorn Server (2 workers) trong backend/Dockerfile:</w:t>
+            </w:r>
+          </w:p>
+          <w:p>
+            <w:pPr>
+              <w:spacing w:before="20" w:after="20" w:line="276" w:lineRule="auto"/>
+            </w:pPr>
+            <w:r>
+              <w:rPr>
+                <w:rFonts w:ascii="Consolas" w:hAnsi="Consolas"/>
+                <w:color w:val="24292F"/>
+                <w:sz w:val="18"/>
+              </w:rPr>
+              <w:t>gunicorn --bind 0.0.0.0:5000 --workers 2 --timeout 120 app:app</w:t>
+            </w:r>
+          </w:p>
+          <w:p>
+            <w:pPr>
+              <w:spacing w:before="20" w:after="20" w:line="276" w:lineRule="auto"/>
+            </w:pPr>
+            <w:r>
+              <w:rPr>
+                <w:rFonts w:ascii="Consolas" w:hAnsi="Consolas"/>
+                <w:color w:val="24292F"/>
+                <w:sz w:val="18"/>
+              </w:rPr>
+            </w:r>
+          </w:p>
+          <w:p>
+            <w:pPr>
+              <w:spacing w:before="20" w:after="20" w:line="276" w:lineRule="auto"/>
+            </w:pPr>
+            <w:r>
+              <w:rPr>
+                <w:rFonts w:ascii="Consolas" w:hAnsi="Consolas"/>
+                <w:color w:val="24292F"/>
+                <w:sz w:val="18"/>
+              </w:rPr>
+              <w:t># Lệnh build và khởi chạy cụm 8 container dịch vụ:</w:t>
+            </w:r>
+          </w:p>
+          <w:p>
+            <w:pPr>
+              <w:spacing w:before="20" w:after="20" w:line="276" w:lineRule="auto"/>
+            </w:pPr>
+            <w:r>
+              <w:rPr>
+                <w:rFonts w:ascii="Consolas" w:hAnsi="Consolas"/>
+                <w:color w:val="24292F"/>
+                <w:sz w:val="18"/>
+              </w:rPr>
+              <w:t>docker compose up -d --build</w:t>
+            </w:r>
+          </w:p>
+        </w:tc>
+      </w:tr>
+    </w:tbl>
+    <w:tbl>
+      <w:tblPr>
+        <w:tblW w:type="auto" w:w="0"/>
         <w:jc w:val="center"/>
         <w:tblLook w:firstColumn="1" w:firstRow="1" w:lastColumn="0" w:lastRow="0" w:noHBand="0" w:noVBand="1" w:val="04A0"/>
       </w:tblPr>
@@ -3111,6 +3234,447 @@
         <w:t>3.2. Cấu hình chi tiết Nginx Gateway (`nginx.conf`)</w:t>
       </w:r>
     </w:p>
+    <w:tbl>
+      <w:tblPr>
+        <w:tblW w:type="auto" w:w="0"/>
+        <w:tblLook w:firstColumn="1" w:firstRow="1" w:lastColumn="0" w:lastRow="0" w:noHBand="0" w:noVBand="1" w:val="04A0"/>
+      </w:tblPr>
+      <w:tblGrid>
+        <w:gridCol w:w="9936"/>
+      </w:tblGrid>
+      <w:tr>
+        <w:tc>
+          <w:tcPr>
+            <w:tcW w:type="dxa" w:w="9936"/>
+            <w:shd w:fill="F6F8FA"/>
+            <w:tcBorders>
+              <w:top w:val="single" w:sz="4" w:space="0" w:color="D0D7DE"/>
+              <w:left w:val="single" w:sz="18" w:space="0" w:color="0969DA"/>
+              <w:bottom w:val="single" w:sz="4" w:space="0" w:color="D0D7DE"/>
+              <w:right w:val="single" w:sz="4" w:space="0" w:color="D0D7DE"/>
+            </w:tcBorders>
+            <w:tcMar>
+              <w:top w:w="120" w:type="dxa"/>
+              <w:bottom w:w="120" w:type="dxa"/>
+              <w:left w:w="200" w:type="dxa"/>
+              <w:right w:w="200" w:type="dxa"/>
+            </w:tcMar>
+          </w:tcPr>
+          <w:p>
+            <w:pPr>
+              <w:spacing w:before="20" w:after="20" w:line="276" w:lineRule="auto"/>
+            </w:pPr>
+            <w:r>
+              <w:rPr>
+                <w:rFonts w:ascii="Consolas" w:hAnsi="Consolas"/>
+                <w:color w:val="24292F"/>
+                <w:sz w:val="18"/>
+              </w:rPr>
+              <w:t>events { worker_connections 1024; }</w:t>
+            </w:r>
+          </w:p>
+          <w:p>
+            <w:pPr>
+              <w:spacing w:before="20" w:after="20" w:line="276" w:lineRule="auto"/>
+            </w:pPr>
+            <w:r>
+              <w:rPr>
+                <w:rFonts w:ascii="Consolas" w:hAnsi="Consolas"/>
+                <w:color w:val="24292F"/>
+                <w:sz w:val="18"/>
+              </w:rPr>
+            </w:r>
+          </w:p>
+          <w:p>
+            <w:pPr>
+              <w:spacing w:before="20" w:after="20" w:line="276" w:lineRule="auto"/>
+            </w:pPr>
+            <w:r>
+              <w:rPr>
+                <w:rFonts w:ascii="Consolas" w:hAnsi="Consolas"/>
+                <w:color w:val="24292F"/>
+                <w:sz w:val="18"/>
+              </w:rPr>
+              <w:t>http {</w:t>
+            </w:r>
+          </w:p>
+          <w:p>
+            <w:pPr>
+              <w:spacing w:before="20" w:after="20" w:line="276" w:lineRule="auto"/>
+            </w:pPr>
+            <w:r>
+              <w:rPr>
+                <w:rFonts w:ascii="Consolas" w:hAnsi="Consolas"/>
+                <w:color w:val="24292F"/>
+                <w:sz w:val="18"/>
+              </w:rPr>
+              <w:t xml:space="preserve">    upstream flask_backend { server web:5000; }</w:t>
+            </w:r>
+          </w:p>
+          <w:p>
+            <w:pPr>
+              <w:spacing w:before="20" w:after="20" w:line="276" w:lineRule="auto"/>
+            </w:pPr>
+            <w:r>
+              <w:rPr>
+                <w:rFonts w:ascii="Consolas" w:hAnsi="Consolas"/>
+                <w:color w:val="24292F"/>
+                <w:sz w:val="18"/>
+              </w:rPr>
+            </w:r>
+          </w:p>
+          <w:p>
+            <w:pPr>
+              <w:spacing w:before="20" w:after="20" w:line="276" w:lineRule="auto"/>
+            </w:pPr>
+            <w:r>
+              <w:rPr>
+                <w:rFonts w:ascii="Consolas" w:hAnsi="Consolas"/>
+                <w:color w:val="24292F"/>
+                <w:sz w:val="18"/>
+              </w:rPr>
+              <w:t xml:space="preserve">    server {</w:t>
+            </w:r>
+          </w:p>
+          <w:p>
+            <w:pPr>
+              <w:spacing w:before="20" w:after="20" w:line="276" w:lineRule="auto"/>
+            </w:pPr>
+            <w:r>
+              <w:rPr>
+                <w:rFonts w:ascii="Consolas" w:hAnsi="Consolas"/>
+                <w:color w:val="24292F"/>
+                <w:sz w:val="18"/>
+              </w:rPr>
+              <w:t xml:space="preserve">        listen 80;</w:t>
+            </w:r>
+          </w:p>
+          <w:p>
+            <w:pPr>
+              <w:spacing w:before="20" w:after="20" w:line="276" w:lineRule="auto"/>
+            </w:pPr>
+            <w:r>
+              <w:rPr>
+                <w:rFonts w:ascii="Consolas" w:hAnsi="Consolas"/>
+                <w:color w:val="24292F"/>
+                <w:sz w:val="18"/>
+              </w:rPr>
+              <w:t xml:space="preserve">        server_name localhost;</w:t>
+            </w:r>
+          </w:p>
+          <w:p>
+            <w:pPr>
+              <w:spacing w:before="20" w:after="20" w:line="276" w:lineRule="auto"/>
+            </w:pPr>
+            <w:r>
+              <w:rPr>
+                <w:rFonts w:ascii="Consolas" w:hAnsi="Consolas"/>
+                <w:color w:val="24292F"/>
+                <w:sz w:val="18"/>
+              </w:rPr>
+              <w:t xml:space="preserve">        client_max_body_size 50M;</w:t>
+            </w:r>
+          </w:p>
+          <w:p>
+            <w:pPr>
+              <w:spacing w:before="20" w:after="20" w:line="276" w:lineRule="auto"/>
+            </w:pPr>
+            <w:r>
+              <w:rPr>
+                <w:rFonts w:ascii="Consolas" w:hAnsi="Consolas"/>
+                <w:color w:val="24292F"/>
+                <w:sz w:val="18"/>
+              </w:rPr>
+            </w:r>
+          </w:p>
+          <w:p>
+            <w:pPr>
+              <w:spacing w:before="20" w:after="20" w:line="276" w:lineRule="auto"/>
+            </w:pPr>
+            <w:r>
+              <w:rPr>
+                <w:rFonts w:ascii="Consolas" w:hAnsi="Consolas"/>
+                <w:color w:val="24292F"/>
+                <w:sz w:val="18"/>
+              </w:rPr>
+              <w:t xml:space="preserve">        # Security Headers theo chuẩn CIS Benchmark &amp; Yêu cầu đề bài:</w:t>
+            </w:r>
+          </w:p>
+          <w:p>
+            <w:pPr>
+              <w:spacing w:before="20" w:after="20" w:line="276" w:lineRule="auto"/>
+            </w:pPr>
+            <w:r>
+              <w:rPr>
+                <w:rFonts w:ascii="Consolas" w:hAnsi="Consolas"/>
+                <w:color w:val="24292F"/>
+                <w:sz w:val="18"/>
+              </w:rPr>
+              <w:t xml:space="preserve">        add_header X-Frame-Options "SAMEORIGIN" always;</w:t>
+            </w:r>
+          </w:p>
+          <w:p>
+            <w:pPr>
+              <w:spacing w:before="20" w:after="20" w:line="276" w:lineRule="auto"/>
+            </w:pPr>
+            <w:r>
+              <w:rPr>
+                <w:rFonts w:ascii="Consolas" w:hAnsi="Consolas"/>
+                <w:color w:val="24292F"/>
+                <w:sz w:val="18"/>
+              </w:rPr>
+              <w:t xml:space="preserve">        add_header X-XSS-Protection "1; mode=block" always;</w:t>
+            </w:r>
+          </w:p>
+          <w:p>
+            <w:pPr>
+              <w:spacing w:before="20" w:after="20" w:line="276" w:lineRule="auto"/>
+            </w:pPr>
+            <w:r>
+              <w:rPr>
+                <w:rFonts w:ascii="Consolas" w:hAnsi="Consolas"/>
+                <w:color w:val="24292F"/>
+                <w:sz w:val="18"/>
+              </w:rPr>
+              <w:t xml:space="preserve">        add_header X-Content-Type-Options "nosniff" always;</w:t>
+            </w:r>
+          </w:p>
+          <w:p>
+            <w:pPr>
+              <w:spacing w:before="20" w:after="20" w:line="276" w:lineRule="auto"/>
+            </w:pPr>
+            <w:r>
+              <w:rPr>
+                <w:rFonts w:ascii="Consolas" w:hAnsi="Consolas"/>
+                <w:color w:val="24292F"/>
+                <w:sz w:val="18"/>
+              </w:rPr>
+              <w:t xml:space="preserve">        add_header Referrer-Policy "strict-origin-when-cross-origin" always;</w:t>
+            </w:r>
+          </w:p>
+          <w:p>
+            <w:pPr>
+              <w:spacing w:before="20" w:after="20" w:line="276" w:lineRule="auto"/>
+            </w:pPr>
+            <w:r>
+              <w:rPr>
+                <w:rFonts w:ascii="Consolas" w:hAnsi="Consolas"/>
+                <w:color w:val="24292F"/>
+                <w:sz w:val="18"/>
+              </w:rPr>
+            </w:r>
+          </w:p>
+          <w:p>
+            <w:pPr>
+              <w:spacing w:before="20" w:after="20" w:line="276" w:lineRule="auto"/>
+            </w:pPr>
+            <w:r>
+              <w:rPr>
+                <w:rFonts w:ascii="Consolas" w:hAnsi="Consolas"/>
+                <w:color w:val="24292F"/>
+                <w:sz w:val="18"/>
+              </w:rPr>
+              <w:t xml:space="preserve">        # Reverse Proxy chuyển tiếp request về Flask backend:</w:t>
+            </w:r>
+          </w:p>
+          <w:p>
+            <w:pPr>
+              <w:spacing w:before="20" w:after="20" w:line="276" w:lineRule="auto"/>
+            </w:pPr>
+            <w:r>
+              <w:rPr>
+                <w:rFonts w:ascii="Consolas" w:hAnsi="Consolas"/>
+                <w:color w:val="24292F"/>
+                <w:sz w:val="18"/>
+              </w:rPr>
+              <w:t xml:space="preserve">        location / {</w:t>
+            </w:r>
+          </w:p>
+          <w:p>
+            <w:pPr>
+              <w:spacing w:before="20" w:after="20" w:line="276" w:lineRule="auto"/>
+            </w:pPr>
+            <w:r>
+              <w:rPr>
+                <w:rFonts w:ascii="Consolas" w:hAnsi="Consolas"/>
+                <w:color w:val="24292F"/>
+                <w:sz w:val="18"/>
+              </w:rPr>
+              <w:t xml:space="preserve">            proxy_pass http://flask_backend;</w:t>
+            </w:r>
+          </w:p>
+          <w:p>
+            <w:pPr>
+              <w:spacing w:before="20" w:after="20" w:line="276" w:lineRule="auto"/>
+            </w:pPr>
+            <w:r>
+              <w:rPr>
+                <w:rFonts w:ascii="Consolas" w:hAnsi="Consolas"/>
+                <w:color w:val="24292F"/>
+                <w:sz w:val="18"/>
+              </w:rPr>
+              <w:t xml:space="preserve">            proxy_set_header Host $host;</w:t>
+            </w:r>
+          </w:p>
+          <w:p>
+            <w:pPr>
+              <w:spacing w:before="20" w:after="20" w:line="276" w:lineRule="auto"/>
+            </w:pPr>
+            <w:r>
+              <w:rPr>
+                <w:rFonts w:ascii="Consolas" w:hAnsi="Consolas"/>
+                <w:color w:val="24292F"/>
+                <w:sz w:val="18"/>
+              </w:rPr>
+              <w:t xml:space="preserve">            proxy_set_header X-Real-IP $remote_addr;</w:t>
+            </w:r>
+          </w:p>
+          <w:p>
+            <w:pPr>
+              <w:spacing w:before="20" w:after="20" w:line="276" w:lineRule="auto"/>
+            </w:pPr>
+            <w:r>
+              <w:rPr>
+                <w:rFonts w:ascii="Consolas" w:hAnsi="Consolas"/>
+                <w:color w:val="24292F"/>
+                <w:sz w:val="18"/>
+              </w:rPr>
+              <w:t xml:space="preserve">            proxy_set_header X-Forwarded-For $proxy_add_x_forwarded_for;</w:t>
+            </w:r>
+          </w:p>
+          <w:p>
+            <w:pPr>
+              <w:spacing w:before="20" w:after="20" w:line="276" w:lineRule="auto"/>
+            </w:pPr>
+            <w:r>
+              <w:rPr>
+                <w:rFonts w:ascii="Consolas" w:hAnsi="Consolas"/>
+                <w:color w:val="24292F"/>
+                <w:sz w:val="18"/>
+              </w:rPr>
+              <w:t xml:space="preserve">            proxy_set_header X-Forwarded-Proto $scheme;</w:t>
+            </w:r>
+          </w:p>
+          <w:p>
+            <w:pPr>
+              <w:spacing w:before="20" w:after="20" w:line="276" w:lineRule="auto"/>
+            </w:pPr>
+            <w:r>
+              <w:rPr>
+                <w:rFonts w:ascii="Consolas" w:hAnsi="Consolas"/>
+                <w:color w:val="24292F"/>
+                <w:sz w:val="18"/>
+              </w:rPr>
+              <w:t xml:space="preserve">        }</w:t>
+            </w:r>
+          </w:p>
+          <w:p>
+            <w:pPr>
+              <w:spacing w:before="20" w:after="20" w:line="276" w:lineRule="auto"/>
+            </w:pPr>
+            <w:r>
+              <w:rPr>
+                <w:rFonts w:ascii="Consolas" w:hAnsi="Consolas"/>
+                <w:color w:val="24292F"/>
+                <w:sz w:val="18"/>
+              </w:rPr>
+              <w:t xml:space="preserve">        # Phục vụ tài nguyên tĩnh với bộ đệm (Static Cache):</w:t>
+            </w:r>
+          </w:p>
+          <w:p>
+            <w:pPr>
+              <w:spacing w:before="20" w:after="20" w:line="276" w:lineRule="auto"/>
+            </w:pPr>
+            <w:r>
+              <w:rPr>
+                <w:rFonts w:ascii="Consolas" w:hAnsi="Consolas"/>
+                <w:color w:val="24292F"/>
+                <w:sz w:val="18"/>
+              </w:rPr>
+              <w:t xml:space="preserve">        location /static/ {</w:t>
+            </w:r>
+          </w:p>
+          <w:p>
+            <w:pPr>
+              <w:spacing w:before="20" w:after="20" w:line="276" w:lineRule="auto"/>
+            </w:pPr>
+            <w:r>
+              <w:rPr>
+                <w:rFonts w:ascii="Consolas" w:hAnsi="Consolas"/>
+                <w:color w:val="24292F"/>
+                <w:sz w:val="18"/>
+              </w:rPr>
+              <w:t xml:space="preserve">            alias /home/appuser/app/frontend/static/;</w:t>
+            </w:r>
+          </w:p>
+          <w:p>
+            <w:pPr>
+              <w:spacing w:before="20" w:after="20" w:line="276" w:lineRule="auto"/>
+            </w:pPr>
+            <w:r>
+              <w:rPr>
+                <w:rFonts w:ascii="Consolas" w:hAnsi="Consolas"/>
+                <w:color w:val="24292F"/>
+                <w:sz w:val="18"/>
+              </w:rPr>
+              <w:t xml:space="preserve">            expires 30d;</w:t>
+            </w:r>
+          </w:p>
+          <w:p>
+            <w:pPr>
+              <w:spacing w:before="20" w:after="20" w:line="276" w:lineRule="auto"/>
+            </w:pPr>
+            <w:r>
+              <w:rPr>
+                <w:rFonts w:ascii="Consolas" w:hAnsi="Consolas"/>
+                <w:color w:val="24292F"/>
+                <w:sz w:val="18"/>
+              </w:rPr>
+              <w:t xml:space="preserve">            add_header Cache-Control "public, no-transform";</w:t>
+            </w:r>
+          </w:p>
+          <w:p>
+            <w:pPr>
+              <w:spacing w:before="20" w:after="20" w:line="276" w:lineRule="auto"/>
+            </w:pPr>
+            <w:r>
+              <w:rPr>
+                <w:rFonts w:ascii="Consolas" w:hAnsi="Consolas"/>
+                <w:color w:val="24292F"/>
+                <w:sz w:val="18"/>
+              </w:rPr>
+              <w:t xml:space="preserve">        }</w:t>
+            </w:r>
+          </w:p>
+          <w:p>
+            <w:pPr>
+              <w:spacing w:before="20" w:after="20" w:line="276" w:lineRule="auto"/>
+            </w:pPr>
+            <w:r>
+              <w:rPr>
+                <w:rFonts w:ascii="Consolas" w:hAnsi="Consolas"/>
+                <w:color w:val="24292F"/>
+                <w:sz w:val="18"/>
+              </w:rPr>
+              <w:t xml:space="preserve">    }</w:t>
+            </w:r>
+          </w:p>
+          <w:p>
+            <w:pPr>
+              <w:spacing w:before="20" w:after="20" w:line="276" w:lineRule="auto"/>
+            </w:pPr>
+            <w:r>
+              <w:rPr>
+                <w:rFonts w:ascii="Consolas" w:hAnsi="Consolas"/>
+                <w:color w:val="24292F"/>
+                <w:sz w:val="18"/>
+              </w:rPr>
+              <w:t>}</w:t>
+            </w:r>
+          </w:p>
+        </w:tc>
+      </w:tr>
+    </w:tbl>
     <w:tbl>
       <w:tblPr>
         <w:tblW w:type="auto" w:w="0"/>
@@ -3593,6 +4157,233 @@
     </w:p>
     <w:p>
       <w:pPr>
+        <w:spacing w:before="160" w:after="40"/>
+        <w:jc w:val="center"/>
+      </w:pPr>
+      <w:r>
+        <w:drawing>
+          <wp:inline xmlns:a="http://schemas.openxmlformats.org/drawingml/2006/main" xmlns:pic="http://schemas.openxmlformats.org/drawingml/2006/picture">
+            <wp:extent cx="5486400" cy="3092335"/>
+            <wp:docPr id="9" name="Picture 9"/>
+            <wp:cNvGraphicFramePr>
+              <a:graphicFrameLocks noChangeAspect="1"/>
+            </wp:cNvGraphicFramePr>
+            <a:graphic>
+              <a:graphicData uri="http://schemas.openxmlformats.org/drawingml/2006/picture">
+                <pic:pic>
+                  <pic:nvPicPr>
+                    <pic:cNvPr id="0" name="09_backup_restore_cli.png"/>
+                    <pic:cNvPicPr/>
+                  </pic:nvPicPr>
+                  <pic:blipFill>
+                    <a:blip r:embed="rId17"/>
+                    <a:stretch>
+                      <a:fillRect/>
+                    </a:stretch>
+                  </pic:blipFill>
+                  <pic:spPr>
+                    <a:xfrm>
+                      <a:off x="0" y="0"/>
+                      <a:ext cx="5486400" cy="3092335"/>
+                    </a:xfrm>
+                    <a:prstGeom prst="rect"/>
+                  </pic:spPr>
+                </pic:pic>
+              </a:graphicData>
+            </a:graphic>
+          </wp:inline>
+        </w:drawing>
+      </w:r>
+    </w:p>
+    <w:p>
+      <w:pPr>
+        <w:spacing w:before="40" w:after="160"/>
+        <w:jc w:val="center"/>
+      </w:pPr>
+      <w:r>
+        <w:rPr>
+          <w:rFonts w:ascii="Times New Roman" w:hAnsi="Times New Roman"/>
+          <w:b/>
+          <w:i/>
+          <w:color w:val="333333"/>
+          <w:sz w:val="20"/>
+        </w:rPr>
+        <w:t>Hình 4.2: Kịch bản Sao lưu và Phục hồi CSDL tự động qua PowerShell (scripts/backup.ps1 &amp; restore.ps1)</w:t>
+      </w:r>
+    </w:p>
+    <w:tbl>
+      <w:tblPr>
+        <w:tblW w:type="auto" w:w="0"/>
+        <w:tblLook w:firstColumn="1" w:firstRow="1" w:lastColumn="0" w:lastRow="0" w:noHBand="0" w:noVBand="1" w:val="04A0"/>
+      </w:tblPr>
+      <w:tblGrid>
+        <w:gridCol w:w="9936"/>
+      </w:tblGrid>
+      <w:tr>
+        <w:tc>
+          <w:tcPr>
+            <w:tcW w:type="dxa" w:w="9936"/>
+            <w:shd w:fill="F6F8FA"/>
+            <w:tcBorders>
+              <w:top w:val="single" w:sz="4" w:space="0" w:color="D0D7DE"/>
+              <w:left w:val="single" w:sz="18" w:space="0" w:color="0969DA"/>
+              <w:bottom w:val="single" w:sz="4" w:space="0" w:color="D0D7DE"/>
+              <w:right w:val="single" w:sz="4" w:space="0" w:color="D0D7DE"/>
+            </w:tcBorders>
+            <w:tcMar>
+              <w:top w:w="120" w:type="dxa"/>
+              <w:bottom w:w="120" w:type="dxa"/>
+              <w:left w:w="200" w:type="dxa"/>
+              <w:right w:w="200" w:type="dxa"/>
+            </w:tcMar>
+          </w:tcPr>
+          <w:p>
+            <w:pPr>
+              <w:spacing w:before="20" w:after="20" w:line="276" w:lineRule="auto"/>
+            </w:pPr>
+            <w:r>
+              <w:rPr>
+                <w:rFonts w:ascii="Consolas" w:hAnsi="Consolas"/>
+                <w:color w:val="24292F"/>
+                <w:sz w:val="18"/>
+              </w:rPr>
+              <w:t># 1. Thực thi kịch bản sao lưu CSDL MySQL tự động:</w:t>
+            </w:r>
+          </w:p>
+          <w:p>
+            <w:pPr>
+              <w:spacing w:before="20" w:after="20" w:line="276" w:lineRule="auto"/>
+            </w:pPr>
+            <w:r>
+              <w:rPr>
+                <w:rFonts w:ascii="Consolas" w:hAnsi="Consolas"/>
+                <w:color w:val="24292F"/>
+                <w:sz w:val="18"/>
+              </w:rPr>
+              <w:t>PS C:\hethongqlsv&gt; powershell -ExecutionPolicy Bypass -File .\scripts\backup.ps1</w:t>
+            </w:r>
+          </w:p>
+          <w:p>
+            <w:pPr>
+              <w:spacing w:before="20" w:after="20" w:line="276" w:lineRule="auto"/>
+            </w:pPr>
+            <w:r>
+              <w:rPr>
+                <w:rFonts w:ascii="Consolas" w:hAnsi="Consolas"/>
+                <w:color w:val="24292F"/>
+                <w:sz w:val="18"/>
+              </w:rPr>
+              <w:t>[SUCCESS] Sao luu thanh cong! File: backups/student_db_backup_20261024_090455.sql (17.27 KB)</w:t>
+            </w:r>
+          </w:p>
+          <w:p>
+            <w:pPr>
+              <w:spacing w:before="20" w:after="20" w:line="276" w:lineRule="auto"/>
+            </w:pPr>
+            <w:r>
+              <w:rPr>
+                <w:rFonts w:ascii="Consolas" w:hAnsi="Consolas"/>
+                <w:color w:val="24292F"/>
+                <w:sz w:val="18"/>
+              </w:rPr>
+            </w:r>
+          </w:p>
+          <w:p>
+            <w:pPr>
+              <w:spacing w:before="20" w:after="20" w:line="276" w:lineRule="auto"/>
+            </w:pPr>
+            <w:r>
+              <w:rPr>
+                <w:rFonts w:ascii="Consolas" w:hAnsi="Consolas"/>
+                <w:color w:val="24292F"/>
+                <w:sz w:val="18"/>
+              </w:rPr>
+              <w:t># 2. Thực thi kiểm định phục hồi thảm họa tự động (Disaster Recovery Verification):</w:t>
+            </w:r>
+          </w:p>
+          <w:p>
+            <w:pPr>
+              <w:spacing w:before="20" w:after="20" w:line="276" w:lineRule="auto"/>
+            </w:pPr>
+            <w:r>
+              <w:rPr>
+                <w:rFonts w:ascii="Consolas" w:hAnsi="Consolas"/>
+                <w:color w:val="24292F"/>
+                <w:sz w:val="18"/>
+              </w:rPr>
+              <w:t>PS C:\hethongqlsv&gt; powershell -ExecutionPolicy Bypass -File .\scripts\restore.ps1 -TestOnly</w:t>
+            </w:r>
+          </w:p>
+          <w:p>
+            <w:pPr>
+              <w:spacing w:before="20" w:after="20" w:line="276" w:lineRule="auto"/>
+            </w:pPr>
+            <w:r>
+              <w:rPr>
+                <w:rFonts w:ascii="Consolas" w:hAnsi="Consolas"/>
+                <w:color w:val="24292F"/>
+                <w:sz w:val="18"/>
+              </w:rPr>
+              <w:t>[INFO] Tu dong chon ban sao luu moi nhat: student_db_backup_20261024_090455.sql</w:t>
+            </w:r>
+          </w:p>
+          <w:p>
+            <w:pPr>
+              <w:spacing w:before="20" w:after="20" w:line="276" w:lineRule="auto"/>
+            </w:pPr>
+            <w:r>
+              <w:rPr>
+                <w:rFonts w:ascii="Consolas" w:hAnsi="Consolas"/>
+                <w:color w:val="24292F"/>
+                <w:sz w:val="18"/>
+              </w:rPr>
+              <w:t>[1/3] Khoi tao co so du lieu dich 'student_db_restore_verify'...</w:t>
+            </w:r>
+          </w:p>
+          <w:p>
+            <w:pPr>
+              <w:spacing w:before="20" w:after="20" w:line="276" w:lineRule="auto"/>
+            </w:pPr>
+            <w:r>
+              <w:rPr>
+                <w:rFonts w:ascii="Consolas" w:hAnsi="Consolas"/>
+                <w:color w:val="24292F"/>
+                <w:sz w:val="18"/>
+              </w:rPr>
+              <w:t>[2/3] Nap du lieu tu dump SQL vao CSDL kiem thu co lap...</w:t>
+            </w:r>
+          </w:p>
+          <w:p>
+            <w:pPr>
+              <w:spacing w:before="20" w:after="20" w:line="276" w:lineRule="auto"/>
+            </w:pPr>
+            <w:r>
+              <w:rPr>
+                <w:rFonts w:ascii="Consolas" w:hAnsi="Consolas"/>
+                <w:color w:val="24292F"/>
+                <w:sz w:val="18"/>
+              </w:rPr>
+              <w:t>[3/3] Kiem tra tinh toan ven: 9 bang, 8 sinh vien, 11 tai khoan...</w:t>
+            </w:r>
+          </w:p>
+          <w:p>
+            <w:pPr>
+              <w:spacing w:before="20" w:after="20" w:line="276" w:lineRule="auto"/>
+            </w:pPr>
+            <w:r>
+              <w:rPr>
+                <w:rFonts w:ascii="Consolas" w:hAnsi="Consolas"/>
+                <w:color w:val="24292F"/>
+                <w:sz w:val="18"/>
+              </w:rPr>
+              <w:t>[SUCCESS] XAC MINH PHUC HOI THANH CONG 100%! Data integrity verified.</w:t>
+            </w:r>
+          </w:p>
+        </w:tc>
+      </w:tr>
+    </w:tbl>
+    <w:p>
+      <w:pPr>
         <w:keepNext/>
         <w:spacing w:before="240" w:after="120"/>
       </w:pPr>
@@ -4062,6 +4853,61 @@
     <w:tbl>
       <w:tblPr>
         <w:tblW w:type="auto" w:w="0"/>
+        <w:tblLook w:firstColumn="1" w:firstRow="1" w:lastColumn="0" w:lastRow="0" w:noHBand="0" w:noVBand="1" w:val="04A0"/>
+      </w:tblPr>
+      <w:tblGrid>
+        <w:gridCol w:w="9936"/>
+      </w:tblGrid>
+      <w:tr>
+        <w:tc>
+          <w:tcPr>
+            <w:tcW w:type="dxa" w:w="9936"/>
+            <w:shd w:fill="F6F8FA"/>
+            <w:tcBorders>
+              <w:top w:val="single" w:sz="4" w:space="0" w:color="D0D7DE"/>
+              <w:left w:val="single" w:sz="18" w:space="0" w:color="0969DA"/>
+              <w:bottom w:val="single" w:sz="4" w:space="0" w:color="D0D7DE"/>
+              <w:right w:val="single" w:sz="4" w:space="0" w:color="D0D7DE"/>
+            </w:tcBorders>
+            <w:tcMar>
+              <w:top w:w="120" w:type="dxa"/>
+              <w:bottom w:w="120" w:type="dxa"/>
+              <w:left w:w="200" w:type="dxa"/>
+              <w:right w:w="200" w:type="dxa"/>
+            </w:tcMar>
+          </w:tcPr>
+          <w:p>
+            <w:pPr>
+              <w:spacing w:before="20" w:after="20" w:line="276" w:lineRule="auto"/>
+            </w:pPr>
+            <w:r>
+              <w:rPr>
+                <w:rFonts w:ascii="Consolas" w:hAnsi="Consolas"/>
+                <w:color w:val="24292F"/>
+                <w:sz w:val="18"/>
+              </w:rPr>
+              <w:t># Truy vấn 1: Xem toàn bộ Access Log qua Web Gateway Nginx</w:t>
+            </w:r>
+          </w:p>
+          <w:p>
+            <w:pPr>
+              <w:spacing w:before="20" w:after="20" w:line="276" w:lineRule="auto"/>
+            </w:pPr>
+            <w:r>
+              <w:rPr>
+                <w:rFonts w:ascii="Consolas" w:hAnsi="Consolas"/>
+                <w:color w:val="24292F"/>
+                <w:sz w:val="18"/>
+              </w:rPr>
+              <w:t>{container="hethongqlsv_nginx"}</w:t>
+            </w:r>
+          </w:p>
+        </w:tc>
+      </w:tr>
+    </w:tbl>
+    <w:tbl>
+      <w:tblPr>
+        <w:tblW w:type="auto" w:w="0"/>
         <w:jc w:val="center"/>
         <w:tblLook w:firstColumn="1" w:firstRow="1" w:lastColumn="0" w:lastRow="0" w:noHBand="0" w:noVBand="1" w:val="04A0"/>
       </w:tblPr>
@@ -4129,6 +4975,61 @@
     <w:tbl>
       <w:tblPr>
         <w:tblW w:type="auto" w:w="0"/>
+        <w:tblLook w:firstColumn="1" w:firstRow="1" w:lastColumn="0" w:lastRow="0" w:noHBand="0" w:noVBand="1" w:val="04A0"/>
+      </w:tblPr>
+      <w:tblGrid>
+        <w:gridCol w:w="9936"/>
+      </w:tblGrid>
+      <w:tr>
+        <w:tc>
+          <w:tcPr>
+            <w:tcW w:type="dxa" w:w="9936"/>
+            <w:shd w:fill="F6F8FA"/>
+            <w:tcBorders>
+              <w:top w:val="single" w:sz="4" w:space="0" w:color="D0D7DE"/>
+              <w:left w:val="single" w:sz="18" w:space="0" w:color="0969DA"/>
+              <w:bottom w:val="single" w:sz="4" w:space="0" w:color="D0D7DE"/>
+              <w:right w:val="single" w:sz="4" w:space="0" w:color="D0D7DE"/>
+            </w:tcBorders>
+            <w:tcMar>
+              <w:top w:w="120" w:type="dxa"/>
+              <w:bottom w:w="120" w:type="dxa"/>
+              <w:left w:w="200" w:type="dxa"/>
+              <w:right w:w="200" w:type="dxa"/>
+            </w:tcMar>
+          </w:tcPr>
+          <w:p>
+            <w:pPr>
+              <w:spacing w:before="20" w:after="20" w:line="276" w:lineRule="auto"/>
+            </w:pPr>
+            <w:r>
+              <w:rPr>
+                <w:rFonts w:ascii="Consolas" w:hAnsi="Consolas"/>
+                <w:color w:val="24292F"/>
+                <w:sz w:val="18"/>
+              </w:rPr>
+              <w:t># Truy vấn 2: Lọc các dòng nhật ký chứa lỗi ERROR hoặc Exception từ Flask backend</w:t>
+            </w:r>
+          </w:p>
+          <w:p>
+            <w:pPr>
+              <w:spacing w:before="20" w:after="20" w:line="276" w:lineRule="auto"/>
+            </w:pPr>
+            <w:r>
+              <w:rPr>
+                <w:rFonts w:ascii="Consolas" w:hAnsi="Consolas"/>
+                <w:color w:val="24292F"/>
+                <w:sz w:val="18"/>
+              </w:rPr>
+              <w:t>{container="hethongqlsv_web"} |= "ERROR"</w:t>
+            </w:r>
+          </w:p>
+        </w:tc>
+      </w:tr>
+    </w:tbl>
+    <w:tbl>
+      <w:tblPr>
+        <w:tblW w:type="auto" w:w="0"/>
         <w:jc w:val="center"/>
         <w:tblLook w:firstColumn="1" w:firstRow="1" w:lastColumn="0" w:lastRow="0" w:noHBand="0" w:noVBand="1" w:val="04A0"/>
       </w:tblPr>
@@ -4193,6 +5094,155 @@
         <w:t xml:space="preserve"> Phân tích cú pháp JSON và thống kê tất cả các yêu cầu trả về mã trạng thái lỗi HTTP từ 400 trở lên (4xx client error, 5xx server error):</w:t>
       </w:r>
     </w:p>
+    <w:p>
+      <w:pPr>
+        <w:spacing w:before="160" w:after="40"/>
+        <w:jc w:val="center"/>
+      </w:pPr>
+      <w:r>
+        <w:drawing>
+          <wp:inline xmlns:a="http://schemas.openxmlformats.org/drawingml/2006/main" xmlns:pic="http://schemas.openxmlformats.org/drawingml/2006/picture">
+            <wp:extent cx="5669280" cy="2813531"/>
+            <wp:docPr id="10" name="Picture 10"/>
+            <wp:cNvGraphicFramePr>
+              <a:graphicFrameLocks noChangeAspect="1"/>
+            </wp:cNvGraphicFramePr>
+            <a:graphic>
+              <a:graphicData uri="http://schemas.openxmlformats.org/drawingml/2006/picture">
+                <pic:pic>
+                  <pic:nvPicPr>
+                    <pic:cNvPr id="0" name="08_loki_logql_explore.png"/>
+                    <pic:cNvPicPr/>
+                  </pic:nvPicPr>
+                  <pic:blipFill>
+                    <a:blip r:embed="rId18"/>
+                    <a:stretch>
+                      <a:fillRect/>
+                    </a:stretch>
+                  </pic:blipFill>
+                  <pic:spPr>
+                    <a:xfrm>
+                      <a:off x="0" y="0"/>
+                      <a:ext cx="5669280" cy="2813531"/>
+                    </a:xfrm>
+                    <a:prstGeom prst="rect"/>
+                  </pic:spPr>
+                </pic:pic>
+              </a:graphicData>
+            </a:graphic>
+          </wp:inline>
+        </w:drawing>
+      </w:r>
+    </w:p>
+    <w:p>
+      <w:pPr>
+        <w:spacing w:before="40" w:after="160"/>
+        <w:jc w:val="center"/>
+      </w:pPr>
+      <w:r>
+        <w:rPr>
+          <w:rFonts w:ascii="Times New Roman" w:hAnsi="Times New Roman"/>
+          <w:b/>
+          <w:i/>
+          <w:color w:val="333333"/>
+          <w:sz w:val="20"/>
+        </w:rPr>
+        <w:t>Hình 5.3: Giao diện Truy vấn Nhật ký Log tập trung bằng LogQL trên Grafana Explore (Loki)</w:t>
+      </w:r>
+    </w:p>
+    <w:tbl>
+      <w:tblPr>
+        <w:tblW w:type="auto" w:w="0"/>
+        <w:tblLook w:firstColumn="1" w:firstRow="1" w:lastColumn="0" w:lastRow="0" w:noHBand="0" w:noVBand="1" w:val="04A0"/>
+      </w:tblPr>
+      <w:tblGrid>
+        <w:gridCol w:w="9936"/>
+      </w:tblGrid>
+      <w:tr>
+        <w:tc>
+          <w:tcPr>
+            <w:tcW w:type="dxa" w:w="9936"/>
+            <w:shd w:fill="F6F8FA"/>
+            <w:tcBorders>
+              <w:top w:val="single" w:sz="4" w:space="0" w:color="D0D7DE"/>
+              <w:left w:val="single" w:sz="18" w:space="0" w:color="0969DA"/>
+              <w:bottom w:val="single" w:sz="4" w:space="0" w:color="D0D7DE"/>
+              <w:right w:val="single" w:sz="4" w:space="0" w:color="D0D7DE"/>
+            </w:tcBorders>
+            <w:tcMar>
+              <w:top w:w="120" w:type="dxa"/>
+              <w:bottom w:w="120" w:type="dxa"/>
+              <w:left w:w="200" w:type="dxa"/>
+              <w:right w:w="200" w:type="dxa"/>
+            </w:tcMar>
+          </w:tcPr>
+          <w:p>
+            <w:pPr>
+              <w:spacing w:before="20" w:after="20" w:line="276" w:lineRule="auto"/>
+            </w:pPr>
+            <w:r>
+              <w:rPr>
+                <w:rFonts w:ascii="Consolas" w:hAnsi="Consolas"/>
+                <w:color w:val="24292F"/>
+                <w:sz w:val="18"/>
+              </w:rPr>
+              <w:t># Truy vấn 3: Phân tích JSON và lọc các mã lỗi HTTP client/server (&gt;= 400)</w:t>
+            </w:r>
+          </w:p>
+          <w:p>
+            <w:pPr>
+              <w:spacing w:before="20" w:after="20" w:line="276" w:lineRule="auto"/>
+            </w:pPr>
+            <w:r>
+              <w:rPr>
+                <w:rFonts w:ascii="Consolas" w:hAnsi="Consolas"/>
+                <w:color w:val="24292F"/>
+                <w:sz w:val="18"/>
+              </w:rPr>
+              <w:t>{container="hethongqlsv_nginx"} | json | status &gt;= 400</w:t>
+            </w:r>
+          </w:p>
+          <w:p>
+            <w:pPr>
+              <w:spacing w:before="20" w:after="20" w:line="276" w:lineRule="auto"/>
+            </w:pPr>
+            <w:r>
+              <w:rPr>
+                <w:rFonts w:ascii="Consolas" w:hAnsi="Consolas"/>
+                <w:color w:val="24292F"/>
+                <w:sz w:val="18"/>
+              </w:rPr>
+            </w:r>
+          </w:p>
+          <w:p>
+            <w:pPr>
+              <w:spacing w:before="20" w:after="20" w:line="276" w:lineRule="auto"/>
+            </w:pPr>
+            <w:r>
+              <w:rPr>
+                <w:rFonts w:ascii="Consolas" w:hAnsi="Consolas"/>
+                <w:color w:val="24292F"/>
+                <w:sz w:val="18"/>
+              </w:rPr>
+              <w:t># Truy vấn bổ sung: Giám sát nhật ký hoạt động CSDL MySQL</w:t>
+            </w:r>
+          </w:p>
+          <w:p>
+            <w:pPr>
+              <w:spacing w:before="20" w:after="20" w:line="276" w:lineRule="auto"/>
+            </w:pPr>
+            <w:r>
+              <w:rPr>
+                <w:rFonts w:ascii="Consolas" w:hAnsi="Consolas"/>
+                <w:color w:val="24292F"/>
+                <w:sz w:val="18"/>
+              </w:rPr>
+              <w:t>{container="hethongqlsv_db"}</w:t>
+            </w:r>
+          </w:p>
+        </w:tc>
+      </w:tr>
+    </w:tbl>
     <w:tbl>
       <w:tblPr>
         <w:tblW w:type="auto" w:w="0"/>
@@ -4269,6 +5319,332 @@
         <w:t>6.1. Các biện pháp Hardening và an toàn hệ thống (Bước 6)</w:t>
       </w:r>
     </w:p>
+    <w:tbl>
+      <w:tblPr>
+        <w:tblW w:type="auto" w:w="0"/>
+        <w:tblLook w:firstColumn="1" w:firstRow="1" w:lastColumn="0" w:lastRow="0" w:noHBand="0" w:noVBand="1" w:val="04A0"/>
+      </w:tblPr>
+      <w:tblGrid>
+        <w:gridCol w:w="9936"/>
+      </w:tblGrid>
+      <w:tr>
+        <w:tc>
+          <w:tcPr>
+            <w:tcW w:type="dxa" w:w="9936"/>
+            <w:shd w:fill="F6F8FA"/>
+            <w:tcBorders>
+              <w:top w:val="single" w:sz="4" w:space="0" w:color="D0D7DE"/>
+              <w:left w:val="single" w:sz="18" w:space="0" w:color="0969DA"/>
+              <w:bottom w:val="single" w:sz="4" w:space="0" w:color="D0D7DE"/>
+              <w:right w:val="single" w:sz="4" w:space="0" w:color="D0D7DE"/>
+            </w:tcBorders>
+            <w:tcMar>
+              <w:top w:w="120" w:type="dxa"/>
+              <w:bottom w:w="120" w:type="dxa"/>
+              <w:left w:w="200" w:type="dxa"/>
+              <w:right w:w="200" w:type="dxa"/>
+            </w:tcMar>
+          </w:tcPr>
+          <w:p>
+            <w:pPr>
+              <w:spacing w:before="20" w:after="20" w:line="276" w:lineRule="auto"/>
+            </w:pPr>
+            <w:r>
+              <w:rPr>
+                <w:rFonts w:ascii="Consolas" w:hAnsi="Consolas"/>
+                <w:color w:val="24292F"/>
+                <w:sz w:val="18"/>
+              </w:rPr>
+              <w:t># 1. Xác minh người dùng Non-root bên trong container web:</w:t>
+            </w:r>
+          </w:p>
+          <w:p>
+            <w:pPr>
+              <w:spacing w:before="20" w:after="20" w:line="276" w:lineRule="auto"/>
+            </w:pPr>
+            <w:r>
+              <w:rPr>
+                <w:rFonts w:ascii="Consolas" w:hAnsi="Consolas"/>
+                <w:color w:val="24292F"/>
+                <w:sz w:val="18"/>
+              </w:rPr>
+              <w:t>$ docker exec -it hethongqlsv_web id</w:t>
+            </w:r>
+          </w:p>
+          <w:p>
+            <w:pPr>
+              <w:spacing w:before="20" w:after="20" w:line="276" w:lineRule="auto"/>
+            </w:pPr>
+            <w:r>
+              <w:rPr>
+                <w:rFonts w:ascii="Consolas" w:hAnsi="Consolas"/>
+                <w:color w:val="24292F"/>
+                <w:sz w:val="18"/>
+              </w:rPr>
+              <w:t>uid=1000(appuser) gid=1000(appuser) groups=1000(appuser)</w:t>
+            </w:r>
+          </w:p>
+          <w:p>
+            <w:pPr>
+              <w:spacing w:before="20" w:after="20" w:line="276" w:lineRule="auto"/>
+            </w:pPr>
+            <w:r>
+              <w:rPr>
+                <w:rFonts w:ascii="Consolas" w:hAnsi="Consolas"/>
+                <w:color w:val="24292F"/>
+                <w:sz w:val="18"/>
+              </w:rPr>
+            </w:r>
+          </w:p>
+          <w:p>
+            <w:pPr>
+              <w:spacing w:before="20" w:after="20" w:line="276" w:lineRule="auto"/>
+            </w:pPr>
+            <w:r>
+              <w:rPr>
+                <w:rFonts w:ascii="Consolas" w:hAnsi="Consolas"/>
+                <w:color w:val="24292F"/>
+                <w:sz w:val="18"/>
+              </w:rPr>
+              <w:t># 2. Kiểm tra Security Headers qua Nginx Gateway:</w:t>
+            </w:r>
+          </w:p>
+          <w:p>
+            <w:pPr>
+              <w:spacing w:before="20" w:after="20" w:line="276" w:lineRule="auto"/>
+            </w:pPr>
+            <w:r>
+              <w:rPr>
+                <w:rFonts w:ascii="Consolas" w:hAnsi="Consolas"/>
+                <w:color w:val="24292F"/>
+                <w:sz w:val="18"/>
+              </w:rPr>
+              <w:t>$ curl -I http://localhost:8083</w:t>
+            </w:r>
+          </w:p>
+          <w:p>
+            <w:pPr>
+              <w:spacing w:before="20" w:after="20" w:line="276" w:lineRule="auto"/>
+            </w:pPr>
+            <w:r>
+              <w:rPr>
+                <w:rFonts w:ascii="Consolas" w:hAnsi="Consolas"/>
+                <w:color w:val="24292F"/>
+                <w:sz w:val="18"/>
+              </w:rPr>
+              <w:t>HTTP/1.1 200 OK</w:t>
+            </w:r>
+          </w:p>
+          <w:p>
+            <w:pPr>
+              <w:spacing w:before="20" w:after="20" w:line="276" w:lineRule="auto"/>
+            </w:pPr>
+            <w:r>
+              <w:rPr>
+                <w:rFonts w:ascii="Consolas" w:hAnsi="Consolas"/>
+                <w:color w:val="24292F"/>
+                <w:sz w:val="18"/>
+              </w:rPr>
+              <w:t>Server: nginx</w:t>
+            </w:r>
+          </w:p>
+          <w:p>
+            <w:pPr>
+              <w:spacing w:before="20" w:after="20" w:line="276" w:lineRule="auto"/>
+            </w:pPr>
+            <w:r>
+              <w:rPr>
+                <w:rFonts w:ascii="Consolas" w:hAnsi="Consolas"/>
+                <w:color w:val="24292F"/>
+                <w:sz w:val="18"/>
+              </w:rPr>
+              <w:t>X-Frame-Options: SAMEORIGIN</w:t>
+            </w:r>
+          </w:p>
+          <w:p>
+            <w:pPr>
+              <w:spacing w:before="20" w:after="20" w:line="276" w:lineRule="auto"/>
+            </w:pPr>
+            <w:r>
+              <w:rPr>
+                <w:rFonts w:ascii="Consolas" w:hAnsi="Consolas"/>
+                <w:color w:val="24292F"/>
+                <w:sz w:val="18"/>
+              </w:rPr>
+              <w:t>X-Content-Type-Options: nosniff</w:t>
+            </w:r>
+          </w:p>
+          <w:p>
+            <w:pPr>
+              <w:spacing w:before="20" w:after="20" w:line="276" w:lineRule="auto"/>
+            </w:pPr>
+            <w:r>
+              <w:rPr>
+                <w:rFonts w:ascii="Consolas" w:hAnsi="Consolas"/>
+                <w:color w:val="24292F"/>
+                <w:sz w:val="18"/>
+              </w:rPr>
+              <w:t>X-XSS-Protection: 1; mode=block</w:t>
+            </w:r>
+          </w:p>
+          <w:p>
+            <w:pPr>
+              <w:spacing w:before="20" w:after="20" w:line="276" w:lineRule="auto"/>
+            </w:pPr>
+            <w:r>
+              <w:rPr>
+                <w:rFonts w:ascii="Consolas" w:hAnsi="Consolas"/>
+                <w:color w:val="24292F"/>
+                <w:sz w:val="18"/>
+              </w:rPr>
+              <w:t>Referrer-Policy: strict-origin-when-cross-origin</w:t>
+            </w:r>
+          </w:p>
+          <w:p>
+            <w:pPr>
+              <w:spacing w:before="20" w:after="20" w:line="276" w:lineRule="auto"/>
+            </w:pPr>
+            <w:r>
+              <w:rPr>
+                <w:rFonts w:ascii="Consolas" w:hAnsi="Consolas"/>
+                <w:color w:val="24292F"/>
+                <w:sz w:val="18"/>
+              </w:rPr>
+            </w:r>
+          </w:p>
+          <w:p>
+            <w:pPr>
+              <w:spacing w:before="20" w:after="20" w:line="276" w:lineRule="auto"/>
+            </w:pPr>
+            <w:r>
+              <w:rPr>
+                <w:rFonts w:ascii="Consolas" w:hAnsi="Consolas"/>
+                <w:color w:val="24292F"/>
+                <w:sz w:val="18"/>
+              </w:rPr>
+              <w:t># 3. Xác minh trạng thái cô lập mạng của 8 container:</w:t>
+            </w:r>
+          </w:p>
+          <w:p>
+            <w:pPr>
+              <w:spacing w:before="20" w:after="20" w:line="276" w:lineRule="auto"/>
+            </w:pPr>
+            <w:r>
+              <w:rPr>
+                <w:rFonts w:ascii="Consolas" w:hAnsi="Consolas"/>
+                <w:color w:val="24292F"/>
+                <w:sz w:val="18"/>
+              </w:rPr>
+              <w:t>$ docker ps --format "table {{.Names}}\t{{.Status}}\t{{.Ports}}"</w:t>
+            </w:r>
+          </w:p>
+          <w:p>
+            <w:pPr>
+              <w:spacing w:before="20" w:after="20" w:line="276" w:lineRule="auto"/>
+            </w:pPr>
+            <w:r>
+              <w:rPr>
+                <w:rFonts w:ascii="Consolas" w:hAnsi="Consolas"/>
+                <w:color w:val="24292F"/>
+                <w:sz w:val="18"/>
+              </w:rPr>
+              <w:t>hethongqlsv_nginx        Up (healthy)    0.0.0.0:8083-&gt;80/tcp</w:t>
+            </w:r>
+          </w:p>
+          <w:p>
+            <w:pPr>
+              <w:spacing w:before="20" w:after="20" w:line="276" w:lineRule="auto"/>
+            </w:pPr>
+            <w:r>
+              <w:rPr>
+                <w:rFonts w:ascii="Consolas" w:hAnsi="Consolas"/>
+                <w:color w:val="24292F"/>
+                <w:sz w:val="18"/>
+              </w:rPr>
+              <w:t>hethongqlsv_web          Up (healthy)    5000/tcp (no host port exposed)</w:t>
+            </w:r>
+          </w:p>
+          <w:p>
+            <w:pPr>
+              <w:spacing w:before="20" w:after="20" w:line="276" w:lineRule="auto"/>
+            </w:pPr>
+            <w:r>
+              <w:rPr>
+                <w:rFonts w:ascii="Consolas" w:hAnsi="Consolas"/>
+                <w:color w:val="24292F"/>
+                <w:sz w:val="18"/>
+              </w:rPr>
+              <w:t>hethongqlsv_db           Up (healthy)    0.0.0.0:3309-&gt;3306/tcp</w:t>
+            </w:r>
+          </w:p>
+          <w:p>
+            <w:pPr>
+              <w:spacing w:before="20" w:after="20" w:line="276" w:lineRule="auto"/>
+            </w:pPr>
+            <w:r>
+              <w:rPr>
+                <w:rFonts w:ascii="Consolas" w:hAnsi="Consolas"/>
+                <w:color w:val="24292F"/>
+                <w:sz w:val="18"/>
+              </w:rPr>
+              <w:t>hethongqlsv_phpmyadmin   Up (healthy)    0.0.0.0:8084-&gt;80/tcp</w:t>
+            </w:r>
+          </w:p>
+          <w:p>
+            <w:pPr>
+              <w:spacing w:before="20" w:after="20" w:line="276" w:lineRule="auto"/>
+            </w:pPr>
+            <w:r>
+              <w:rPr>
+                <w:rFonts w:ascii="Consolas" w:hAnsi="Consolas"/>
+                <w:color w:val="24292F"/>
+                <w:sz w:val="18"/>
+              </w:rPr>
+              <w:t>hethongqlsv_prometheus   Up (healthy)    0.0.0.0:9092-&gt;9090/tcp</w:t>
+            </w:r>
+          </w:p>
+          <w:p>
+            <w:pPr>
+              <w:spacing w:before="20" w:after="20" w:line="276" w:lineRule="auto"/>
+            </w:pPr>
+            <w:r>
+              <w:rPr>
+                <w:rFonts w:ascii="Consolas" w:hAnsi="Consolas"/>
+                <w:color w:val="24292F"/>
+                <w:sz w:val="18"/>
+              </w:rPr>
+              <w:t>hethongqlsv_grafana      Up (healthy)    0.0.0.0:3002-&gt;3000/tcp</w:t>
+            </w:r>
+          </w:p>
+          <w:p>
+            <w:pPr>
+              <w:spacing w:before="20" w:after="20" w:line="276" w:lineRule="auto"/>
+            </w:pPr>
+            <w:r>
+              <w:rPr>
+                <w:rFonts w:ascii="Consolas" w:hAnsi="Consolas"/>
+                <w:color w:val="24292F"/>
+                <w:sz w:val="18"/>
+              </w:rPr>
+              <w:t>hethongqlsv_loki         Up (healthy)    0.0.0.0:3102-&gt;3100/tcp</w:t>
+            </w:r>
+          </w:p>
+          <w:p>
+            <w:pPr>
+              <w:spacing w:before="20" w:after="20" w:line="276" w:lineRule="auto"/>
+            </w:pPr>
+            <w:r>
+              <w:rPr>
+                <w:rFonts w:ascii="Consolas" w:hAnsi="Consolas"/>
+                <w:color w:val="24292F"/>
+                <w:sz w:val="18"/>
+              </w:rPr>
+              <w:t>hethongqlsv_promtail     Up (healthy)    (internal docker stream)</w:t>
+            </w:r>
+          </w:p>
+        </w:tc>
+      </w:tr>
+    </w:tbl>
     <w:p>
       <w:r>
         <w:t>Hệ thống đã áp dụng 5 biện pháp Hardening bảo mật chuyên sâu, vượt yêu cầu tối thiểu (3–4 biện pháp) của đề bài:</w:t>

</xml_diff>